<commit_message>
docs: Token-Definitionen aus Konzept entfernen, auf Brand Identity verweisen
§9 Farbwelt-Tabelle und §13 Design Tokens (Farben, Typografie, Abstände,
Layout) durch Verweise auf die autoritativen Quellen ersetzt:
- brand-identity-mavka.html (Farbpalette, Typografie, Logo-System)
- design-system.html (CSS Custom Properties, Spacing, Grid)

Vermeidet Widersprüche durch dreifache Token-Definition
(Konzept vs. Brand Identity vs. Codebase).

Co-Authored-By: Claude Opus 4.6 (1M context) <noreply@anthropic.com>
</commit_message>
<xml_diff>
--- a/docs/Stategisches Website Konzept-Gemeinsam-Kochen-Aktualisiert.docx
+++ b/docs/Stategisches Website Konzept-Gemeinsam-Kochen-Aktualisiert.docx
@@ -855,13 +855,7 @@
         <w:rPr>
           <w:color w:val="222222"/>
         </w:rPr>
-        <w:t>Bedürfnisse: Workshop-Infos, Bilder &amp; Eindrücke, Möglichkeit zur Anmeldung/Newsletter.</w:t>
-      </w:r>
-      <w:r>
-        <w:rPr>
-          <w:color w:val="222222"/>
-        </w:rPr>
-        <w:t xml:space="preserve"> Kinder sind willkommen – eine begleitende Kinderbetreuung ist vorhanden (Aufsichtspflicht bleibt bei den Eltern).</w:t>
+        <w:t>Bedürfnisse: Workshop-Infos, Bilder &amp; Eindrücke, Möglichkeit zur Anmeldung/Newsletter. Kinder sind willkommen – eine begleitende Kinderbetreuung ist vorhanden (Aufsichtspflicht bleibt bei den Eltern).</w:t>
       </w:r>
     </w:p>
     <w:p>
@@ -3296,607 +3290,57 @@
         <w:pStyle w:val="berschrift3"/>
       </w:pPr>
       <w:r>
-        <w:t>Farbwelt (abgeleitet aus Logo)</w:t>
-      </w:r>
-    </w:p>
-    <w:tbl>
-      <w:tblPr>
-        <w:tblW w:w="9026" w:type="dxa"/>
-        <w:tblBorders>
-          <w:top w:val="single" w:sz="4" w:space="0" w:color="auto"/>
-          <w:left w:val="single" w:sz="4" w:space="0" w:color="auto"/>
-          <w:bottom w:val="single" w:sz="4" w:space="0" w:color="auto"/>
-          <w:right w:val="single" w:sz="4" w:space="0" w:color="auto"/>
-          <w:insideH w:val="single" w:sz="4" w:space="0" w:color="auto"/>
-          <w:insideV w:val="single" w:sz="4" w:space="0" w:color="auto"/>
-        </w:tblBorders>
-        <w:tblCellMar>
-          <w:left w:w="10" w:type="dxa"/>
-          <w:right w:w="10" w:type="dxa"/>
-        </w:tblCellMar>
-        <w:tblLook w:val="04A0" w:firstRow="1" w:lastRow="0" w:firstColumn="1" w:lastColumn="0" w:noHBand="0" w:noVBand="1"/>
-      </w:tblPr>
-      <w:tblGrid>
-        <w:gridCol w:w="2800"/>
-        <w:gridCol w:w="2200"/>
-        <w:gridCol w:w="4026"/>
-      </w:tblGrid>
-      <w:tr>
-        <w:tc>
-          <w:tcPr>
-            <w:tcW w:w="2800" w:type="dxa"/>
-            <w:tcBorders>
-              <w:top w:val="single" w:sz="1" w:space="0" w:color="D9D9D9"/>
-              <w:left w:val="single" w:sz="1" w:space="0" w:color="D9D9D9"/>
-              <w:bottom w:val="single" w:sz="1" w:space="0" w:color="D9D9D9"/>
-              <w:right w:val="single" w:sz="1" w:space="0" w:color="D9D9D9"/>
-            </w:tcBorders>
-            <w:shd w:val="clear" w:color="auto" w:fill="1F4D3A"/>
-            <w:tcMar>
-              <w:top w:w="60" w:type="dxa"/>
-              <w:left w:w="100" w:type="dxa"/>
-              <w:bottom w:w="60" w:type="dxa"/>
-              <w:right w:w="100" w:type="dxa"/>
-            </w:tcMar>
-            <w:vAlign w:val="center"/>
-          </w:tcPr>
-          <w:p>
-            <w:r>
-              <w:rPr>
-                <w:b/>
-                <w:bCs/>
-                <w:color w:val="FFFFFF"/>
-                <w:sz w:val="20"/>
-                <w:szCs w:val="20"/>
-              </w:rPr>
-              <w:t>Rolle</w:t>
-            </w:r>
-          </w:p>
-        </w:tc>
-        <w:tc>
-          <w:tcPr>
-            <w:tcW w:w="2200" w:type="dxa"/>
-            <w:tcBorders>
-              <w:top w:val="single" w:sz="1" w:space="0" w:color="D9D9D9"/>
-              <w:left w:val="single" w:sz="1" w:space="0" w:color="D9D9D9"/>
-              <w:bottom w:val="single" w:sz="1" w:space="0" w:color="D9D9D9"/>
-              <w:right w:val="single" w:sz="1" w:space="0" w:color="D9D9D9"/>
-            </w:tcBorders>
-            <w:shd w:val="clear" w:color="auto" w:fill="1F4D3A"/>
-            <w:tcMar>
-              <w:top w:w="60" w:type="dxa"/>
-              <w:left w:w="100" w:type="dxa"/>
-              <w:bottom w:w="60" w:type="dxa"/>
-              <w:right w:w="100" w:type="dxa"/>
-            </w:tcMar>
-            <w:vAlign w:val="center"/>
-          </w:tcPr>
-          <w:p>
-            <w:r>
-              <w:rPr>
-                <w:b/>
-                <w:bCs/>
-                <w:color w:val="FFFFFF"/>
-                <w:sz w:val="20"/>
-                <w:szCs w:val="20"/>
-              </w:rPr>
-              <w:t>Farbwert</w:t>
-            </w:r>
-          </w:p>
-        </w:tc>
-        <w:tc>
-          <w:tcPr>
-            <w:tcW w:w="4026" w:type="dxa"/>
-            <w:tcBorders>
-              <w:top w:val="single" w:sz="1" w:space="0" w:color="D9D9D9"/>
-              <w:left w:val="single" w:sz="1" w:space="0" w:color="D9D9D9"/>
-              <w:bottom w:val="single" w:sz="1" w:space="0" w:color="D9D9D9"/>
-              <w:right w:val="single" w:sz="1" w:space="0" w:color="D9D9D9"/>
-            </w:tcBorders>
-            <w:shd w:val="clear" w:color="auto" w:fill="1F4D3A"/>
-            <w:tcMar>
-              <w:top w:w="60" w:type="dxa"/>
-              <w:left w:w="100" w:type="dxa"/>
-              <w:bottom w:w="60" w:type="dxa"/>
-              <w:right w:w="100" w:type="dxa"/>
-            </w:tcMar>
-            <w:vAlign w:val="center"/>
-          </w:tcPr>
-          <w:p>
-            <w:r>
-              <w:rPr>
-                <w:b/>
-                <w:bCs/>
-                <w:color w:val="FFFFFF"/>
-                <w:sz w:val="20"/>
-                <w:szCs w:val="20"/>
-              </w:rPr>
-              <w:t>Einsatz</w:t>
-            </w:r>
-          </w:p>
-        </w:tc>
-      </w:tr>
-      <w:tr>
-        <w:tc>
-          <w:tcPr>
-            <w:tcW w:w="2800" w:type="dxa"/>
-            <w:tcBorders>
-              <w:top w:val="single" w:sz="1" w:space="0" w:color="D9D9D9"/>
-              <w:left w:val="single" w:sz="1" w:space="0" w:color="D9D9D9"/>
-              <w:bottom w:val="single" w:sz="1" w:space="0" w:color="D9D9D9"/>
-              <w:right w:val="single" w:sz="1" w:space="0" w:color="D9D9D9"/>
-            </w:tcBorders>
-            <w:tcMar>
-              <w:top w:w="60" w:type="dxa"/>
-              <w:left w:w="100" w:type="dxa"/>
-              <w:bottom w:w="60" w:type="dxa"/>
-              <w:right w:w="100" w:type="dxa"/>
-            </w:tcMar>
-          </w:tcPr>
-          <w:p>
-            <w:r>
-              <w:rPr>
-                <w:b/>
-                <w:bCs/>
-                <w:color w:val="222222"/>
-                <w:sz w:val="20"/>
-                <w:szCs w:val="20"/>
-              </w:rPr>
-              <w:t>Primär</w:t>
-            </w:r>
-          </w:p>
-        </w:tc>
-        <w:tc>
-          <w:tcPr>
-            <w:tcW w:w="2200" w:type="dxa"/>
-            <w:tcBorders>
-              <w:top w:val="single" w:sz="1" w:space="0" w:color="D9D9D9"/>
-              <w:left w:val="single" w:sz="1" w:space="0" w:color="D9D9D9"/>
-              <w:bottom w:val="single" w:sz="1" w:space="0" w:color="D9D9D9"/>
-              <w:right w:val="single" w:sz="1" w:space="0" w:color="D9D9D9"/>
-            </w:tcBorders>
-            <w:tcMar>
-              <w:top w:w="60" w:type="dxa"/>
-              <w:left w:w="100" w:type="dxa"/>
-              <w:bottom w:w="60" w:type="dxa"/>
-              <w:right w:w="100" w:type="dxa"/>
-            </w:tcMar>
-          </w:tcPr>
-          <w:p>
-            <w:r>
-              <w:rPr>
-                <w:color w:val="222222"/>
-                <w:sz w:val="20"/>
-                <w:szCs w:val="20"/>
-              </w:rPr>
-              <w:t>Dunkelgrün #1F4D3A</w:t>
-            </w:r>
-          </w:p>
-        </w:tc>
-        <w:tc>
-          <w:tcPr>
-            <w:tcW w:w="4026" w:type="dxa"/>
-            <w:tcBorders>
-              <w:top w:val="single" w:sz="1" w:space="0" w:color="D9D9D9"/>
-              <w:left w:val="single" w:sz="1" w:space="0" w:color="D9D9D9"/>
-              <w:bottom w:val="single" w:sz="1" w:space="0" w:color="D9D9D9"/>
-              <w:right w:val="single" w:sz="1" w:space="0" w:color="D9D9D9"/>
-            </w:tcBorders>
-            <w:tcMar>
-              <w:top w:w="60" w:type="dxa"/>
-              <w:left w:w="100" w:type="dxa"/>
-              <w:bottom w:w="60" w:type="dxa"/>
-              <w:right w:w="100" w:type="dxa"/>
-            </w:tcMar>
-          </w:tcPr>
-          <w:p>
-            <w:r>
-              <w:rPr>
-                <w:color w:val="222222"/>
-                <w:sz w:val="20"/>
-                <w:szCs w:val="20"/>
-              </w:rPr>
-              <w:t>Hauptfarbe, Buttons, Überschriften</w:t>
-            </w:r>
-          </w:p>
-        </w:tc>
-      </w:tr>
-      <w:tr>
-        <w:tc>
-          <w:tcPr>
-            <w:tcW w:w="2800" w:type="dxa"/>
-            <w:tcBorders>
-              <w:top w:val="single" w:sz="1" w:space="0" w:color="D9D9D9"/>
-              <w:left w:val="single" w:sz="1" w:space="0" w:color="D9D9D9"/>
-              <w:bottom w:val="single" w:sz="1" w:space="0" w:color="D9D9D9"/>
-              <w:right w:val="single" w:sz="1" w:space="0" w:color="D9D9D9"/>
-            </w:tcBorders>
-            <w:shd w:val="clear" w:color="auto" w:fill="F7F5EF"/>
-            <w:tcMar>
-              <w:top w:w="60" w:type="dxa"/>
-              <w:left w:w="100" w:type="dxa"/>
-              <w:bottom w:w="60" w:type="dxa"/>
-              <w:right w:w="100" w:type="dxa"/>
-            </w:tcMar>
-          </w:tcPr>
-          <w:p>
-            <w:r>
-              <w:rPr>
-                <w:b/>
-                <w:bCs/>
-                <w:color w:val="222222"/>
-                <w:sz w:val="20"/>
-                <w:szCs w:val="20"/>
-              </w:rPr>
-              <w:t>Sekundär</w:t>
-            </w:r>
-          </w:p>
-        </w:tc>
-        <w:tc>
-          <w:tcPr>
-            <w:tcW w:w="2200" w:type="dxa"/>
-            <w:tcBorders>
-              <w:top w:val="single" w:sz="1" w:space="0" w:color="D9D9D9"/>
-              <w:left w:val="single" w:sz="1" w:space="0" w:color="D9D9D9"/>
-              <w:bottom w:val="single" w:sz="1" w:space="0" w:color="D9D9D9"/>
-              <w:right w:val="single" w:sz="1" w:space="0" w:color="D9D9D9"/>
-            </w:tcBorders>
-            <w:shd w:val="clear" w:color="auto" w:fill="F7F5EF"/>
-            <w:tcMar>
-              <w:top w:w="60" w:type="dxa"/>
-              <w:left w:w="100" w:type="dxa"/>
-              <w:bottom w:w="60" w:type="dxa"/>
-              <w:right w:w="100" w:type="dxa"/>
-            </w:tcMar>
-          </w:tcPr>
-          <w:p>
-            <w:r>
-              <w:rPr>
-                <w:color w:val="222222"/>
-                <w:sz w:val="20"/>
-                <w:szCs w:val="20"/>
-              </w:rPr>
-              <w:t>Blattgrün #2F6B52</w:t>
-            </w:r>
-          </w:p>
-        </w:tc>
-        <w:tc>
-          <w:tcPr>
-            <w:tcW w:w="4026" w:type="dxa"/>
-            <w:tcBorders>
-              <w:top w:val="single" w:sz="1" w:space="0" w:color="D9D9D9"/>
-              <w:left w:val="single" w:sz="1" w:space="0" w:color="D9D9D9"/>
-              <w:bottom w:val="single" w:sz="1" w:space="0" w:color="D9D9D9"/>
-              <w:right w:val="single" w:sz="1" w:space="0" w:color="D9D9D9"/>
-            </w:tcBorders>
-            <w:shd w:val="clear" w:color="auto" w:fill="F7F5EF"/>
-            <w:tcMar>
-              <w:top w:w="60" w:type="dxa"/>
-              <w:left w:w="100" w:type="dxa"/>
-              <w:bottom w:w="60" w:type="dxa"/>
-              <w:right w:w="100" w:type="dxa"/>
-            </w:tcMar>
-          </w:tcPr>
-          <w:p>
-            <w:r>
-              <w:rPr>
-                <w:color w:val="222222"/>
-                <w:sz w:val="20"/>
-                <w:szCs w:val="20"/>
-              </w:rPr>
-              <w:t>Hover-Zustände, Akzente</w:t>
-            </w:r>
-          </w:p>
-        </w:tc>
-      </w:tr>
-      <w:tr>
-        <w:tc>
-          <w:tcPr>
-            <w:tcW w:w="2800" w:type="dxa"/>
-            <w:tcBorders>
-              <w:top w:val="single" w:sz="1" w:space="0" w:color="D9D9D9"/>
-              <w:left w:val="single" w:sz="1" w:space="0" w:color="D9D9D9"/>
-              <w:bottom w:val="single" w:sz="1" w:space="0" w:color="D9D9D9"/>
-              <w:right w:val="single" w:sz="1" w:space="0" w:color="D9D9D9"/>
-            </w:tcBorders>
-            <w:tcMar>
-              <w:top w:w="60" w:type="dxa"/>
-              <w:left w:w="100" w:type="dxa"/>
-              <w:bottom w:w="60" w:type="dxa"/>
-              <w:right w:w="100" w:type="dxa"/>
-            </w:tcMar>
-          </w:tcPr>
-          <w:p>
-            <w:r>
-              <w:rPr>
-                <w:b/>
-                <w:bCs/>
-                <w:color w:val="222222"/>
-                <w:sz w:val="20"/>
-                <w:szCs w:val="20"/>
-              </w:rPr>
-              <w:lastRenderedPageBreak/>
-              <w:t>Hintergrund</w:t>
-            </w:r>
-          </w:p>
-        </w:tc>
-        <w:tc>
-          <w:tcPr>
-            <w:tcW w:w="2200" w:type="dxa"/>
-            <w:tcBorders>
-              <w:top w:val="single" w:sz="1" w:space="0" w:color="D9D9D9"/>
-              <w:left w:val="single" w:sz="1" w:space="0" w:color="D9D9D9"/>
-              <w:bottom w:val="single" w:sz="1" w:space="0" w:color="D9D9D9"/>
-              <w:right w:val="single" w:sz="1" w:space="0" w:color="D9D9D9"/>
-            </w:tcBorders>
-            <w:tcMar>
-              <w:top w:w="60" w:type="dxa"/>
-              <w:left w:w="100" w:type="dxa"/>
-              <w:bottom w:w="60" w:type="dxa"/>
-              <w:right w:w="100" w:type="dxa"/>
-            </w:tcMar>
-          </w:tcPr>
-          <w:p>
-            <w:r>
-              <w:rPr>
-                <w:color w:val="222222"/>
-                <w:sz w:val="20"/>
-                <w:szCs w:val="20"/>
-              </w:rPr>
-              <w:t>Warmes Creme #F5F2EA</w:t>
-            </w:r>
-          </w:p>
-        </w:tc>
-        <w:tc>
-          <w:tcPr>
-            <w:tcW w:w="4026" w:type="dxa"/>
-            <w:tcBorders>
-              <w:top w:val="single" w:sz="1" w:space="0" w:color="D9D9D9"/>
-              <w:left w:val="single" w:sz="1" w:space="0" w:color="D9D9D9"/>
-              <w:bottom w:val="single" w:sz="1" w:space="0" w:color="D9D9D9"/>
-              <w:right w:val="single" w:sz="1" w:space="0" w:color="D9D9D9"/>
-            </w:tcBorders>
-            <w:tcMar>
-              <w:top w:w="60" w:type="dxa"/>
-              <w:left w:w="100" w:type="dxa"/>
-              <w:bottom w:w="60" w:type="dxa"/>
-              <w:right w:w="100" w:type="dxa"/>
-            </w:tcMar>
-          </w:tcPr>
-          <w:p>
-            <w:r>
-              <w:rPr>
-                <w:color w:val="222222"/>
-                <w:sz w:val="20"/>
-                <w:szCs w:val="20"/>
-              </w:rPr>
-              <w:t>Seitenhintergrund</w:t>
-            </w:r>
-          </w:p>
-        </w:tc>
-      </w:tr>
-      <w:tr>
-        <w:tc>
-          <w:tcPr>
-            <w:tcW w:w="2800" w:type="dxa"/>
-            <w:tcBorders>
-              <w:top w:val="single" w:sz="1" w:space="0" w:color="D9D9D9"/>
-              <w:left w:val="single" w:sz="1" w:space="0" w:color="D9D9D9"/>
-              <w:bottom w:val="single" w:sz="1" w:space="0" w:color="D9D9D9"/>
-              <w:right w:val="single" w:sz="1" w:space="0" w:color="D9D9D9"/>
-            </w:tcBorders>
-            <w:shd w:val="clear" w:color="auto" w:fill="F7F5EF"/>
-            <w:tcMar>
-              <w:top w:w="60" w:type="dxa"/>
-              <w:left w:w="100" w:type="dxa"/>
-              <w:bottom w:w="60" w:type="dxa"/>
-              <w:right w:w="100" w:type="dxa"/>
-            </w:tcMar>
-          </w:tcPr>
-          <w:p>
-            <w:r>
-              <w:rPr>
-                <w:b/>
-                <w:bCs/>
-                <w:color w:val="222222"/>
-                <w:sz w:val="20"/>
-                <w:szCs w:val="20"/>
-              </w:rPr>
-              <w:t>Akzent</w:t>
-            </w:r>
-          </w:p>
-        </w:tc>
-        <w:tc>
-          <w:tcPr>
-            <w:tcW w:w="2200" w:type="dxa"/>
-            <w:tcBorders>
-              <w:top w:val="single" w:sz="1" w:space="0" w:color="D9D9D9"/>
-              <w:left w:val="single" w:sz="1" w:space="0" w:color="D9D9D9"/>
-              <w:bottom w:val="single" w:sz="1" w:space="0" w:color="D9D9D9"/>
-              <w:right w:val="single" w:sz="1" w:space="0" w:color="D9D9D9"/>
-            </w:tcBorders>
-            <w:shd w:val="clear" w:color="auto" w:fill="F7F5EF"/>
-            <w:tcMar>
-              <w:top w:w="60" w:type="dxa"/>
-              <w:left w:w="100" w:type="dxa"/>
-              <w:bottom w:w="60" w:type="dxa"/>
-              <w:right w:w="100" w:type="dxa"/>
-            </w:tcMar>
-          </w:tcPr>
-          <w:p>
-            <w:del w:id="3" w:author="Claude" w:date="2026-03-04T00:00:00Z">
-              <w:r>
-                <w:rPr>
-                  <w:color w:val="222222"/>
-                  <w:sz w:val="20"/>
-                  <w:szCs w:val="20"/>
-                </w:rPr>
-                <w:delText>Amber #FFBF00</w:delText>
-              </w:r>
-            </w:del>
-            <w:r>
-              <w:rPr>
-                <w:color w:val="222222"/>
-                <w:sz w:val="20"/>
-                <w:szCs w:val="20"/>
-              </w:rPr>
-              <w:t>Dunkelgold #8B6500</w:t>
-            </w:r>
-          </w:p>
-        </w:tc>
-        <w:tc>
-          <w:tcPr>
-            <w:tcW w:w="4026" w:type="dxa"/>
-            <w:tcBorders>
-              <w:top w:val="single" w:sz="1" w:space="0" w:color="D9D9D9"/>
-              <w:left w:val="single" w:sz="1" w:space="0" w:color="D9D9D9"/>
-              <w:bottom w:val="single" w:sz="1" w:space="0" w:color="D9D9D9"/>
-              <w:right w:val="single" w:sz="1" w:space="0" w:color="D9D9D9"/>
-            </w:tcBorders>
-            <w:shd w:val="clear" w:color="auto" w:fill="F7F5EF"/>
-            <w:tcMar>
-              <w:top w:w="60" w:type="dxa"/>
-              <w:left w:w="100" w:type="dxa"/>
-              <w:bottom w:w="60" w:type="dxa"/>
-              <w:right w:w="100" w:type="dxa"/>
-            </w:tcMar>
-          </w:tcPr>
-          <w:p>
-            <w:del w:id="4" w:author="Claude" w:date="2026-03-04T00:00:00Z">
-              <w:r>
-                <w:rPr>
-                  <w:color w:val="222222"/>
-                  <w:sz w:val="20"/>
-                  <w:szCs w:val="20"/>
-                </w:rPr>
-                <w:delText>Call-to-Actions, Highlights</w:delText>
-              </w:r>
-            </w:del>
-            <w:r>
-              <w:rPr>
-                <w:color w:val="222222"/>
-                <w:sz w:val="20"/>
-                <w:szCs w:val="20"/>
-              </w:rPr>
-              <w:t>Call-to-Actions, Highlights – WCAG-AA-konform auf Creme (#F5F2EA) für normalen und großen Text.</w:t>
-            </w:r>
-          </w:p>
-        </w:tc>
-      </w:tr>
-      <w:tr>
-        <w:tc>
-          <w:tcPr>
-            <w:tcW w:w="2800" w:type="dxa"/>
-            <w:tcBorders>
-              <w:top w:val="single" w:sz="1" w:space="0" w:color="D9D9D9"/>
-              <w:left w:val="single" w:sz="1" w:space="0" w:color="D9D9D9"/>
-              <w:bottom w:val="single" w:sz="1" w:space="0" w:color="D9D9D9"/>
-              <w:right w:val="single" w:sz="1" w:space="0" w:color="D9D9D9"/>
-            </w:tcBorders>
-            <w:tcMar>
-              <w:top w:w="60" w:type="dxa"/>
-              <w:left w:w="100" w:type="dxa"/>
-              <w:bottom w:w="60" w:type="dxa"/>
-              <w:right w:w="100" w:type="dxa"/>
-            </w:tcMar>
-          </w:tcPr>
-          <w:p>
-            <w:r>
-              <w:rPr>
-                <w:b/>
-                <w:bCs/>
-                <w:color w:val="222222"/>
-                <w:sz w:val="20"/>
-                <w:szCs w:val="20"/>
-              </w:rPr>
-              <w:t>Text</w:t>
-            </w:r>
-          </w:p>
-        </w:tc>
-        <w:tc>
-          <w:tcPr>
-            <w:tcW w:w="2200" w:type="dxa"/>
-            <w:tcBorders>
-              <w:top w:val="single" w:sz="1" w:space="0" w:color="D9D9D9"/>
-              <w:left w:val="single" w:sz="1" w:space="0" w:color="D9D9D9"/>
-              <w:bottom w:val="single" w:sz="1" w:space="0" w:color="D9D9D9"/>
-              <w:right w:val="single" w:sz="1" w:space="0" w:color="D9D9D9"/>
-            </w:tcBorders>
-            <w:tcMar>
-              <w:top w:w="60" w:type="dxa"/>
-              <w:left w:w="100" w:type="dxa"/>
-              <w:bottom w:w="60" w:type="dxa"/>
-              <w:right w:w="100" w:type="dxa"/>
-            </w:tcMar>
-          </w:tcPr>
-          <w:p>
-            <w:r>
-              <w:rPr>
-                <w:color w:val="222222"/>
-                <w:sz w:val="20"/>
-                <w:szCs w:val="20"/>
-              </w:rPr>
-              <w:t>Dunkelgrau #222222</w:t>
-            </w:r>
-          </w:p>
-        </w:tc>
-        <w:tc>
-          <w:tcPr>
-            <w:tcW w:w="4026" w:type="dxa"/>
-            <w:tcBorders>
-              <w:top w:val="single" w:sz="1" w:space="0" w:color="D9D9D9"/>
-              <w:left w:val="single" w:sz="1" w:space="0" w:color="D9D9D9"/>
-              <w:bottom w:val="single" w:sz="1" w:space="0" w:color="D9D9D9"/>
-              <w:right w:val="single" w:sz="1" w:space="0" w:color="D9D9D9"/>
-            </w:tcBorders>
-            <w:tcMar>
-              <w:top w:w="60" w:type="dxa"/>
-              <w:left w:w="100" w:type="dxa"/>
-              <w:bottom w:w="60" w:type="dxa"/>
-              <w:right w:w="100" w:type="dxa"/>
-            </w:tcMar>
-          </w:tcPr>
-          <w:p>
-            <w:r>
-              <w:rPr>
-                <w:color w:val="222222"/>
-                <w:sz w:val="20"/>
-                <w:szCs w:val="20"/>
-              </w:rPr>
-              <w:t>Fließtext</w:t>
-            </w:r>
-          </w:p>
-        </w:tc>
-      </w:tr>
-    </w:tbl>
-    <w:p>
-      <w:pPr>
-        <w:spacing w:after="120"/>
-      </w:pPr>
+        <w:t>Farbwelt</w:t>
+      </w:r>
     </w:p>
     <w:p>
       <w:pPr>
         <w:spacing w:after="160"/>
       </w:pPr>
-      <w:r>
-        <w:rPr>
-          <w:color w:val="222222"/>
-        </w:rPr>
-        <w:t>Wirkung: Ruhig, vertrauensvoll, erdend, senior*innenfreundlich, gemeinwohlorientiert und nicht kommerziell.</w:t>
-      </w:r>
+      <w:del w:id="200" w:author="Claude" w:date="2026-04-01T00:00:00Z">
+        <w:r>
+          <w:rPr>
+            <w:color w:val="222222"/>
+          </w:rPr>
+          <w:delText>Farbtabelle, Typografie und Design Tokens waren hier definiert.</w:delText>
+        </w:r>
+      </w:del>
+      <w:ins w:id="201" w:author="Claude" w:date="2026-04-01T00:00:00Z">
+        <w:r>
+          <w:rPr>
+            <w:color w:val="222222"/>
+          </w:rPr>
+          <w:t>Farben, Typografie und alle konkreten Farbwerte: siehe brand-identity-mavka.html (autoritativ) und design-system.html. Das Konzept definiert keine eigenen Token-Werte, um Doppelpflege und Widersprüche zu vermeiden.</w:t>
+        </w:r>
+      </w:ins>
     </w:p>
     <w:p>
       <w:pPr>
         <w:spacing w:after="160"/>
       </w:pPr>
-      <w:r>
-        <w:rPr>
-          <w:b/>
-          <w:bCs/>
-          <w:color w:val="222222"/>
-        </w:rPr>
-        <w:t>WICHTIG: Darauf achten, dass keine Monotonie in der Farbwelt aufkommt.</w:t>
-      </w:r>
+      <w:ins w:id="202" w:author="Claude" w:date="2026-04-01T00:00:00Z">
+        <w:r>
+          <w:rPr>
+            <w:color w:val="222222"/>
+          </w:rPr>
+          <w:t>Wirkung: Ruhig, vertrauensvoll, erdend, senior*innenfreundlich, gemeinwohlorientiert und nicht kommerziell.</w:t>
+        </w:r>
+      </w:ins>
+    </w:p>
+    <w:p>
+      <w:pPr>
+        <w:spacing w:after="160"/>
+      </w:pPr>
+      <w:ins w:id="203" w:author="Claude" w:date="2026-04-01T00:00:00Z">
+        <w:r>
+          <w:rPr>
+            <w:b/>
+            <w:bCs/>
+            <w:color w:val="222222"/>
+          </w:rPr>
+          <w:t>WICHTIG: Darauf achten, dass keine Monotonie in der Farbwelt aufkommt.</w:t>
+        </w:r>
+      </w:ins>
     </w:p>
     <w:p>
       <w:r>
@@ -4380,45 +3824,23 @@
         <w:pStyle w:val="berschrift3"/>
       </w:pPr>
       <w:r>
-        <w:t xml:space="preserve">Vorhandene Inhalte &amp; </w:t>
-      </w:r>
-      <w:proofErr w:type="spellStart"/>
-      <w:r>
-        <w:t>Social</w:t>
-      </w:r>
-      <w:proofErr w:type="spellEnd"/>
-      <w:r>
-        <w:t xml:space="preserve"> Media</w:t>
-      </w:r>
-    </w:p>
-    <w:p>
-      <w:pPr>
-        <w:pStyle w:val="Listenabsatz"/>
-        <w:numPr>
-          <w:ilvl w:val="0"/>
-          <w:numId w:val="3"/>
-        </w:numPr>
-        <w:spacing w:after="80"/>
-      </w:pPr>
-      <w:r>
-        <w:rPr>
-          <w:color w:val="222222"/>
-        </w:rPr>
-        <w:t xml:space="preserve">Instagram: </w:t>
-      </w:r>
-      <w:proofErr w:type="gramStart"/>
-      <w:r>
-        <w:rPr>
-          <w:color w:val="222222"/>
-        </w:rPr>
-        <w:t>mavka.berlin</w:t>
-      </w:r>
-      <w:proofErr w:type="gramEnd"/>
-      <w:r>
-        <w:rPr>
-          <w:color w:val="222222"/>
-        </w:rPr>
-        <w:t>.volunteers</w:t>
+        <w:t>Vorhandene Inhalte &amp; Social Media</w:t>
+      </w:r>
+    </w:p>
+    <w:p>
+      <w:pPr>
+        <w:pStyle w:val="Listenabsatz"/>
+        <w:numPr>
+          <w:ilvl w:val="0"/>
+          <w:numId w:val="3"/>
+        </w:numPr>
+        <w:spacing w:after="80"/>
+      </w:pPr>
+      <w:r>
+        <w:rPr>
+          <w:color w:val="222222"/>
+        </w:rPr>
+        <w:t>Instagram: mavka.berlin.volunteers</w:t>
       </w:r>
     </w:p>
     <w:p>
@@ -5760,1609 +5182,87 @@
     </w:p>
     <w:p>
       <w:pPr>
-        <w:pStyle w:val="berschrift3"/>
-      </w:pPr>
-      <w:r>
-        <w:t>Farben</w:t>
-      </w:r>
-    </w:p>
-    <w:tbl>
-      <w:tblPr>
-        <w:tblW w:w="9026" w:type="dxa"/>
-        <w:tblBorders>
-          <w:top w:val="single" w:sz="4" w:space="0" w:color="auto"/>
-          <w:left w:val="single" w:sz="4" w:space="0" w:color="auto"/>
-          <w:bottom w:val="single" w:sz="4" w:space="0" w:color="auto"/>
-          <w:right w:val="single" w:sz="4" w:space="0" w:color="auto"/>
-          <w:insideH w:val="single" w:sz="4" w:space="0" w:color="auto"/>
-          <w:insideV w:val="single" w:sz="4" w:space="0" w:color="auto"/>
-        </w:tblBorders>
-        <w:tblCellMar>
-          <w:left w:w="10" w:type="dxa"/>
-          <w:right w:w="10" w:type="dxa"/>
-        </w:tblCellMar>
-        <w:tblLook w:val="04A0" w:firstRow="1" w:lastRow="0" w:firstColumn="1" w:lastColumn="0" w:noHBand="0" w:noVBand="1"/>
-      </w:tblPr>
-      <w:tblGrid>
-        <w:gridCol w:w="4000"/>
-        <w:gridCol w:w="5026"/>
-      </w:tblGrid>
-      <w:tr>
-        <w:tc>
-          <w:tcPr>
-            <w:tcW w:w="4000" w:type="dxa"/>
-            <w:tcBorders>
-              <w:top w:val="single" w:sz="1" w:space="0" w:color="D9D9D9"/>
-              <w:left w:val="single" w:sz="1" w:space="0" w:color="D9D9D9"/>
-              <w:bottom w:val="single" w:sz="1" w:space="0" w:color="D9D9D9"/>
-              <w:right w:val="single" w:sz="1" w:space="0" w:color="D9D9D9"/>
-            </w:tcBorders>
-            <w:shd w:val="clear" w:color="auto" w:fill="1F4D3A"/>
-            <w:tcMar>
-              <w:top w:w="60" w:type="dxa"/>
-              <w:left w:w="100" w:type="dxa"/>
-              <w:bottom w:w="60" w:type="dxa"/>
-              <w:right w:w="100" w:type="dxa"/>
-            </w:tcMar>
-            <w:vAlign w:val="center"/>
-          </w:tcPr>
-          <w:p>
-            <w:r>
-              <w:rPr>
-                <w:b/>
-                <w:bCs/>
-                <w:color w:val="FFFFFF"/>
-                <w:sz w:val="20"/>
-                <w:szCs w:val="20"/>
-              </w:rPr>
-              <w:t>Token</w:t>
-            </w:r>
-          </w:p>
-        </w:tc>
-        <w:tc>
-          <w:tcPr>
-            <w:tcW w:w="5026" w:type="dxa"/>
-            <w:tcBorders>
-              <w:top w:val="single" w:sz="1" w:space="0" w:color="D9D9D9"/>
-              <w:left w:val="single" w:sz="1" w:space="0" w:color="D9D9D9"/>
-              <w:bottom w:val="single" w:sz="1" w:space="0" w:color="D9D9D9"/>
-              <w:right w:val="single" w:sz="1" w:space="0" w:color="D9D9D9"/>
-            </w:tcBorders>
-            <w:shd w:val="clear" w:color="auto" w:fill="1F4D3A"/>
-            <w:tcMar>
-              <w:top w:w="60" w:type="dxa"/>
-              <w:left w:w="100" w:type="dxa"/>
-              <w:bottom w:w="60" w:type="dxa"/>
-              <w:right w:w="100" w:type="dxa"/>
-            </w:tcMar>
-            <w:vAlign w:val="center"/>
-          </w:tcPr>
-          <w:p>
-            <w:r>
-              <w:rPr>
-                <w:b/>
-                <w:bCs/>
-                <w:color w:val="FFFFFF"/>
-                <w:sz w:val="20"/>
-                <w:szCs w:val="20"/>
-              </w:rPr>
-              <w:t>Wert</w:t>
-            </w:r>
-          </w:p>
-        </w:tc>
-      </w:tr>
-      <w:tr>
-        <w:tc>
-          <w:tcPr>
-            <w:tcW w:w="4000" w:type="dxa"/>
-            <w:tcBorders>
-              <w:top w:val="single" w:sz="1" w:space="0" w:color="D9D9D9"/>
-              <w:left w:val="single" w:sz="1" w:space="0" w:color="D9D9D9"/>
-              <w:bottom w:val="single" w:sz="1" w:space="0" w:color="D9D9D9"/>
-              <w:right w:val="single" w:sz="1" w:space="0" w:color="D9D9D9"/>
-            </w:tcBorders>
-            <w:tcMar>
-              <w:top w:w="60" w:type="dxa"/>
-              <w:left w:w="100" w:type="dxa"/>
-              <w:bottom w:w="60" w:type="dxa"/>
-              <w:right w:w="100" w:type="dxa"/>
-            </w:tcMar>
-          </w:tcPr>
-          <w:p>
-            <w:r>
-              <w:rPr>
-                <w:color w:val="222222"/>
-                <w:sz w:val="20"/>
-                <w:szCs w:val="20"/>
-              </w:rPr>
-              <w:t>--color-primary-700</w:t>
-            </w:r>
-          </w:p>
-        </w:tc>
-        <w:tc>
-          <w:tcPr>
-            <w:tcW w:w="5026" w:type="dxa"/>
-            <w:tcBorders>
-              <w:top w:val="single" w:sz="1" w:space="0" w:color="D9D9D9"/>
-              <w:left w:val="single" w:sz="1" w:space="0" w:color="D9D9D9"/>
-              <w:bottom w:val="single" w:sz="1" w:space="0" w:color="D9D9D9"/>
-              <w:right w:val="single" w:sz="1" w:space="0" w:color="D9D9D9"/>
-            </w:tcBorders>
-            <w:tcMar>
-              <w:top w:w="60" w:type="dxa"/>
-              <w:left w:w="100" w:type="dxa"/>
-              <w:bottom w:w="60" w:type="dxa"/>
-              <w:right w:w="100" w:type="dxa"/>
-            </w:tcMar>
-          </w:tcPr>
-          <w:p>
-            <w:r>
-              <w:rPr>
-                <w:color w:val="222222"/>
-                <w:sz w:val="20"/>
-                <w:szCs w:val="20"/>
-              </w:rPr>
-              <w:t>#1F4D3A (Dunkelgrün)</w:t>
-            </w:r>
-          </w:p>
-        </w:tc>
-      </w:tr>
-      <w:tr>
-        <w:tc>
-          <w:tcPr>
-            <w:tcW w:w="4000" w:type="dxa"/>
-            <w:tcBorders>
-              <w:top w:val="single" w:sz="1" w:space="0" w:color="D9D9D9"/>
-              <w:left w:val="single" w:sz="1" w:space="0" w:color="D9D9D9"/>
-              <w:bottom w:val="single" w:sz="1" w:space="0" w:color="D9D9D9"/>
-              <w:right w:val="single" w:sz="1" w:space="0" w:color="D9D9D9"/>
-            </w:tcBorders>
-            <w:shd w:val="clear" w:color="auto" w:fill="F7F5EF"/>
-            <w:tcMar>
-              <w:top w:w="60" w:type="dxa"/>
-              <w:left w:w="100" w:type="dxa"/>
-              <w:bottom w:w="60" w:type="dxa"/>
-              <w:right w:w="100" w:type="dxa"/>
-            </w:tcMar>
-          </w:tcPr>
-          <w:p>
-            <w:r>
-              <w:rPr>
-                <w:color w:val="222222"/>
-                <w:sz w:val="20"/>
-                <w:szCs w:val="20"/>
-              </w:rPr>
-              <w:t>--color-primary-500</w:t>
-            </w:r>
-          </w:p>
-        </w:tc>
-        <w:tc>
-          <w:tcPr>
-            <w:tcW w:w="5026" w:type="dxa"/>
-            <w:tcBorders>
-              <w:top w:val="single" w:sz="1" w:space="0" w:color="D9D9D9"/>
-              <w:left w:val="single" w:sz="1" w:space="0" w:color="D9D9D9"/>
-              <w:bottom w:val="single" w:sz="1" w:space="0" w:color="D9D9D9"/>
-              <w:right w:val="single" w:sz="1" w:space="0" w:color="D9D9D9"/>
-            </w:tcBorders>
-            <w:shd w:val="clear" w:color="auto" w:fill="F7F5EF"/>
-            <w:tcMar>
-              <w:top w:w="60" w:type="dxa"/>
-              <w:left w:w="100" w:type="dxa"/>
-              <w:bottom w:w="60" w:type="dxa"/>
-              <w:right w:w="100" w:type="dxa"/>
-            </w:tcMar>
-          </w:tcPr>
-          <w:p>
-            <w:r>
-              <w:rPr>
-                <w:color w:val="222222"/>
-                <w:sz w:val="20"/>
-                <w:szCs w:val="20"/>
-              </w:rPr>
-              <w:t>#2F6B52</w:t>
-            </w:r>
-          </w:p>
-        </w:tc>
-      </w:tr>
-      <w:tr>
-        <w:tc>
-          <w:tcPr>
-            <w:tcW w:w="4000" w:type="dxa"/>
-            <w:tcBorders>
-              <w:top w:val="single" w:sz="1" w:space="0" w:color="D9D9D9"/>
-              <w:left w:val="single" w:sz="1" w:space="0" w:color="D9D9D9"/>
-              <w:bottom w:val="single" w:sz="1" w:space="0" w:color="D9D9D9"/>
-              <w:right w:val="single" w:sz="1" w:space="0" w:color="D9D9D9"/>
-            </w:tcBorders>
-            <w:tcMar>
-              <w:top w:w="60" w:type="dxa"/>
-              <w:left w:w="100" w:type="dxa"/>
-              <w:bottom w:w="60" w:type="dxa"/>
-              <w:right w:w="100" w:type="dxa"/>
-            </w:tcMar>
-          </w:tcPr>
-          <w:p>
-            <w:r>
-              <w:rPr>
-                <w:color w:val="222222"/>
-                <w:sz w:val="20"/>
-                <w:szCs w:val="20"/>
-              </w:rPr>
-              <w:t>--color-primary-300</w:t>
-            </w:r>
-          </w:p>
-        </w:tc>
-        <w:tc>
-          <w:tcPr>
-            <w:tcW w:w="5026" w:type="dxa"/>
-            <w:tcBorders>
-              <w:top w:val="single" w:sz="1" w:space="0" w:color="D9D9D9"/>
-              <w:left w:val="single" w:sz="1" w:space="0" w:color="D9D9D9"/>
-              <w:bottom w:val="single" w:sz="1" w:space="0" w:color="D9D9D9"/>
-              <w:right w:val="single" w:sz="1" w:space="0" w:color="D9D9D9"/>
-            </w:tcBorders>
-            <w:tcMar>
-              <w:top w:w="60" w:type="dxa"/>
-              <w:left w:w="100" w:type="dxa"/>
-              <w:bottom w:w="60" w:type="dxa"/>
-              <w:right w:w="100" w:type="dxa"/>
-            </w:tcMar>
-          </w:tcPr>
-          <w:p>
-            <w:del w:id="5" w:author="Claude" w:date="2026-03-04T00:00:00Z">
-              <w:r>
-                <w:rPr>
-                  <w:color w:val="222222"/>
-                  <w:sz w:val="20"/>
-                  <w:szCs w:val="20"/>
-                </w:rPr>
-                <w:delText>#2F6B52 (Blattgrün)</w:delText>
-              </w:r>
-            </w:del>
-            <w:r>
-              <w:rPr>
-                <w:color w:val="222222"/>
-                <w:sz w:val="20"/>
-                <w:szCs w:val="20"/>
-              </w:rPr>
-              <w:t>#6BA38E (Helles Grün – für Hover-Hintergründe, Disabled-States)</w:t>
-            </w:r>
-          </w:p>
-        </w:tc>
-      </w:tr>
-      <w:tr>
-        <w:tc>
-          <w:tcPr>
-            <w:tcW w:w="4000" w:type="dxa"/>
-            <w:tcBorders>
-              <w:top w:val="single" w:sz="1" w:space="0" w:color="D9D9D9"/>
-              <w:left w:val="single" w:sz="1" w:space="0" w:color="D9D9D9"/>
-              <w:bottom w:val="single" w:sz="1" w:space="0" w:color="D9D9D9"/>
-              <w:right w:val="single" w:sz="1" w:space="0" w:color="D9D9D9"/>
-            </w:tcBorders>
-            <w:shd w:val="clear" w:color="auto" w:fill="F7F5EF"/>
-            <w:tcMar>
-              <w:top w:w="60" w:type="dxa"/>
-              <w:left w:w="100" w:type="dxa"/>
-              <w:bottom w:w="60" w:type="dxa"/>
-              <w:right w:w="100" w:type="dxa"/>
-            </w:tcMar>
-          </w:tcPr>
-          <w:p>
-            <w:r>
-              <w:rPr>
-                <w:color w:val="222222"/>
-                <w:sz w:val="20"/>
-                <w:szCs w:val="20"/>
-              </w:rPr>
-              <w:t>--color-accent-500</w:t>
-            </w:r>
-          </w:p>
-        </w:tc>
-        <w:tc>
-          <w:tcPr>
-            <w:tcW w:w="5026" w:type="dxa"/>
-            <w:tcBorders>
-              <w:top w:val="single" w:sz="1" w:space="0" w:color="D9D9D9"/>
-              <w:left w:val="single" w:sz="1" w:space="0" w:color="D9D9D9"/>
-              <w:bottom w:val="single" w:sz="1" w:space="0" w:color="D9D9D9"/>
-              <w:right w:val="single" w:sz="1" w:space="0" w:color="D9D9D9"/>
-            </w:tcBorders>
-            <w:shd w:val="clear" w:color="auto" w:fill="F7F5EF"/>
-            <w:tcMar>
-              <w:top w:w="60" w:type="dxa"/>
-              <w:left w:w="100" w:type="dxa"/>
-              <w:bottom w:w="60" w:type="dxa"/>
-              <w:right w:w="100" w:type="dxa"/>
-            </w:tcMar>
-          </w:tcPr>
-          <w:p>
-            <w:del w:id="6" w:author="Claude" w:date="2026-03-04T00:00:00Z">
-              <w:r>
-                <w:rPr>
-                  <w:color w:val="222222"/>
-                  <w:sz w:val="20"/>
-                  <w:szCs w:val="20"/>
-                </w:rPr>
-                <w:delText>#FFBF00 (Amber)</w:delText>
-              </w:r>
-            </w:del>
-            <w:r>
-              <w:rPr>
-                <w:color w:val="222222"/>
-                <w:sz w:val="20"/>
-                <w:szCs w:val="20"/>
-              </w:rPr>
-              <w:t>#8B6500 (Dunkelgold – WCAG-AA-konform auf Creme)</w:t>
-            </w:r>
-          </w:p>
-        </w:tc>
-      </w:tr>
-      <w:tr>
-        <w:tc>
-          <w:tcPr>
-            <w:tcW w:w="4000" w:type="dxa"/>
-            <w:tcBorders>
-              <w:top w:val="single" w:sz="1" w:space="0" w:color="D9D9D9"/>
-              <w:left w:val="single" w:sz="1" w:space="0" w:color="D9D9D9"/>
-              <w:bottom w:val="single" w:sz="1" w:space="0" w:color="D9D9D9"/>
-              <w:right w:val="single" w:sz="1" w:space="0" w:color="D9D9D9"/>
-            </w:tcBorders>
-            <w:tcMar>
-              <w:top w:w="60" w:type="dxa"/>
-              <w:left w:w="100" w:type="dxa"/>
-              <w:bottom w:w="60" w:type="dxa"/>
-              <w:right w:w="100" w:type="dxa"/>
-            </w:tcMar>
-          </w:tcPr>
-          <w:p>
-            <w:r>
-              <w:rPr>
-                <w:color w:val="222222"/>
-                <w:sz w:val="20"/>
-                <w:szCs w:val="20"/>
-              </w:rPr>
-              <w:t>--color-bg-default</w:t>
-            </w:r>
-          </w:p>
-        </w:tc>
-        <w:tc>
-          <w:tcPr>
-            <w:tcW w:w="5026" w:type="dxa"/>
-            <w:tcBorders>
-              <w:top w:val="single" w:sz="1" w:space="0" w:color="D9D9D9"/>
-              <w:left w:val="single" w:sz="1" w:space="0" w:color="D9D9D9"/>
-              <w:bottom w:val="single" w:sz="1" w:space="0" w:color="D9D9D9"/>
-              <w:right w:val="single" w:sz="1" w:space="0" w:color="D9D9D9"/>
-            </w:tcBorders>
-            <w:tcMar>
-              <w:top w:w="60" w:type="dxa"/>
-              <w:left w:w="100" w:type="dxa"/>
-              <w:bottom w:w="60" w:type="dxa"/>
-              <w:right w:w="100" w:type="dxa"/>
-            </w:tcMar>
-          </w:tcPr>
-          <w:p>
-            <w:r>
-              <w:rPr>
-                <w:color w:val="222222"/>
-                <w:sz w:val="20"/>
-                <w:szCs w:val="20"/>
-              </w:rPr>
-              <w:t>#F5F2EA (Creme)</w:t>
-            </w:r>
-          </w:p>
-        </w:tc>
-      </w:tr>
-      <w:tr>
-        <w:tc>
-          <w:tcPr>
-            <w:tcW w:w="4000" w:type="dxa"/>
-            <w:tcBorders>
-              <w:top w:val="single" w:sz="1" w:space="0" w:color="D9D9D9"/>
-              <w:left w:val="single" w:sz="1" w:space="0" w:color="D9D9D9"/>
-              <w:bottom w:val="single" w:sz="1" w:space="0" w:color="D9D9D9"/>
-              <w:right w:val="single" w:sz="1" w:space="0" w:color="D9D9D9"/>
-            </w:tcBorders>
-            <w:shd w:val="clear" w:color="auto" w:fill="F7F5EF"/>
-            <w:tcMar>
-              <w:top w:w="60" w:type="dxa"/>
-              <w:left w:w="100" w:type="dxa"/>
-              <w:bottom w:w="60" w:type="dxa"/>
-              <w:right w:w="100" w:type="dxa"/>
-            </w:tcMar>
-          </w:tcPr>
-          <w:p>
-            <w:r>
-              <w:rPr>
-                <w:color w:val="222222"/>
-                <w:sz w:val="20"/>
-                <w:szCs w:val="20"/>
-              </w:rPr>
-              <w:t>--color-text-primary</w:t>
-            </w:r>
-          </w:p>
-        </w:tc>
-        <w:tc>
-          <w:tcPr>
-            <w:tcW w:w="5026" w:type="dxa"/>
-            <w:tcBorders>
-              <w:top w:val="single" w:sz="1" w:space="0" w:color="D9D9D9"/>
-              <w:left w:val="single" w:sz="1" w:space="0" w:color="D9D9D9"/>
-              <w:bottom w:val="single" w:sz="1" w:space="0" w:color="D9D9D9"/>
-              <w:right w:val="single" w:sz="1" w:space="0" w:color="D9D9D9"/>
-            </w:tcBorders>
-            <w:shd w:val="clear" w:color="auto" w:fill="F7F5EF"/>
-            <w:tcMar>
-              <w:top w:w="60" w:type="dxa"/>
-              <w:left w:w="100" w:type="dxa"/>
-              <w:bottom w:w="60" w:type="dxa"/>
-              <w:right w:w="100" w:type="dxa"/>
-            </w:tcMar>
-          </w:tcPr>
-          <w:p>
-            <w:r>
-              <w:rPr>
-                <w:color w:val="222222"/>
-                <w:sz w:val="20"/>
-                <w:szCs w:val="20"/>
-              </w:rPr>
-              <w:t>#222222</w:t>
-            </w:r>
-          </w:p>
-        </w:tc>
-      </w:tr>
-      <w:tr>
-        <w:tc>
-          <w:tcPr>
-            <w:tcW w:w="4000" w:type="dxa"/>
-            <w:tcBorders>
-              <w:top w:val="single" w:sz="1" w:space="0" w:color="D9D9D9"/>
-              <w:left w:val="single" w:sz="1" w:space="0" w:color="D9D9D9"/>
-              <w:bottom w:val="single" w:sz="1" w:space="0" w:color="D9D9D9"/>
-              <w:right w:val="single" w:sz="1" w:space="0" w:color="D9D9D9"/>
-            </w:tcBorders>
-            <w:tcMar>
-              <w:top w:w="60" w:type="dxa"/>
-              <w:left w:w="100" w:type="dxa"/>
-              <w:bottom w:w="60" w:type="dxa"/>
-              <w:right w:w="100" w:type="dxa"/>
-            </w:tcMar>
-          </w:tcPr>
-          <w:p>
-            <w:r>
-              <w:rPr>
-                <w:color w:val="222222"/>
-                <w:sz w:val="20"/>
-                <w:szCs w:val="20"/>
-              </w:rPr>
-              <w:t>--color-text-secondary</w:t>
-            </w:r>
-          </w:p>
-        </w:tc>
-        <w:tc>
-          <w:tcPr>
-            <w:tcW w:w="5026" w:type="dxa"/>
-            <w:tcBorders>
-              <w:top w:val="single" w:sz="1" w:space="0" w:color="D9D9D9"/>
-              <w:left w:val="single" w:sz="1" w:space="0" w:color="D9D9D9"/>
-              <w:bottom w:val="single" w:sz="1" w:space="0" w:color="D9D9D9"/>
-              <w:right w:val="single" w:sz="1" w:space="0" w:color="D9D9D9"/>
-            </w:tcBorders>
-            <w:tcMar>
-              <w:top w:w="60" w:type="dxa"/>
-              <w:left w:w="100" w:type="dxa"/>
-              <w:bottom w:w="60" w:type="dxa"/>
-              <w:right w:w="100" w:type="dxa"/>
-            </w:tcMar>
-          </w:tcPr>
-          <w:p>
-            <w:r>
-              <w:rPr>
-                <w:color w:val="222222"/>
-                <w:sz w:val="20"/>
-                <w:szCs w:val="20"/>
-              </w:rPr>
-              <w:t>#555555</w:t>
-            </w:r>
-          </w:p>
-        </w:tc>
-      </w:tr>
-      <w:tr>
-        <w:tc>
-          <w:tcPr>
-            <w:tcW w:w="4000" w:type="dxa"/>
-            <w:tcBorders>
-              <w:top w:val="single" w:sz="1" w:space="0" w:color="D9D9D9"/>
-              <w:left w:val="single" w:sz="1" w:space="0" w:color="D9D9D9"/>
-              <w:bottom w:val="single" w:sz="1" w:space="0" w:color="D9D9D9"/>
-              <w:right w:val="single" w:sz="1" w:space="0" w:color="D9D9D9"/>
-            </w:tcBorders>
-            <w:shd w:val="clear" w:color="auto" w:fill="F7F5EF"/>
-            <w:tcMar>
-              <w:top w:w="60" w:type="dxa"/>
-              <w:left w:w="100" w:type="dxa"/>
-              <w:bottom w:w="60" w:type="dxa"/>
-              <w:right w:w="100" w:type="dxa"/>
-            </w:tcMar>
-          </w:tcPr>
-          <w:p>
-            <w:r>
-              <w:rPr>
-                <w:color w:val="222222"/>
-                <w:sz w:val="20"/>
-                <w:szCs w:val="20"/>
-              </w:rPr>
-              <w:t>--color-border-default</w:t>
-            </w:r>
-          </w:p>
-        </w:tc>
-        <w:tc>
-          <w:tcPr>
-            <w:tcW w:w="5026" w:type="dxa"/>
-            <w:tcBorders>
-              <w:top w:val="single" w:sz="1" w:space="0" w:color="D9D9D9"/>
-              <w:left w:val="single" w:sz="1" w:space="0" w:color="D9D9D9"/>
-              <w:bottom w:val="single" w:sz="1" w:space="0" w:color="D9D9D9"/>
-              <w:right w:val="single" w:sz="1" w:space="0" w:color="D9D9D9"/>
-            </w:tcBorders>
-            <w:shd w:val="clear" w:color="auto" w:fill="F7F5EF"/>
-            <w:tcMar>
-              <w:top w:w="60" w:type="dxa"/>
-              <w:left w:w="100" w:type="dxa"/>
-              <w:bottom w:w="60" w:type="dxa"/>
-              <w:right w:w="100" w:type="dxa"/>
-            </w:tcMar>
-          </w:tcPr>
-          <w:p>
-            <w:r>
-              <w:rPr>
-                <w:color w:val="222222"/>
-                <w:sz w:val="20"/>
-                <w:szCs w:val="20"/>
-              </w:rPr>
-              <w:t>#D9D9D9</w:t>
-            </w:r>
-          </w:p>
-        </w:tc>
-      </w:tr>
-    </w:tbl>
-    <w:p>
-      <w:pPr>
         <w:spacing w:after="160"/>
       </w:pPr>
-    </w:p>
-    <w:p>
-      <w:pPr>
-        <w:pStyle w:val="berschrift3"/>
-      </w:pPr>
-      <w:r>
-        <w:t>Typografie</w:t>
-      </w:r>
-    </w:p>
-    <w:tbl>
-      <w:tblPr>
-        <w:tblW w:w="9026" w:type="dxa"/>
-        <w:tblBorders>
-          <w:top w:val="single" w:sz="4" w:space="0" w:color="auto"/>
-          <w:left w:val="single" w:sz="4" w:space="0" w:color="auto"/>
-          <w:bottom w:val="single" w:sz="4" w:space="0" w:color="auto"/>
-          <w:right w:val="single" w:sz="4" w:space="0" w:color="auto"/>
-          <w:insideH w:val="single" w:sz="4" w:space="0" w:color="auto"/>
-          <w:insideV w:val="single" w:sz="4" w:space="0" w:color="auto"/>
-        </w:tblBorders>
-        <w:tblCellMar>
-          <w:left w:w="10" w:type="dxa"/>
-          <w:right w:w="10" w:type="dxa"/>
-        </w:tblCellMar>
-        <w:tblLook w:val="04A0" w:firstRow="1" w:lastRow="0" w:firstColumn="1" w:lastColumn="0" w:noHBand="0" w:noVBand="1"/>
-      </w:tblPr>
-      <w:tblGrid>
-        <w:gridCol w:w="4000"/>
-        <w:gridCol w:w="5026"/>
-      </w:tblGrid>
-      <w:tr>
-        <w:tc>
-          <w:tcPr>
-            <w:tcW w:w="4000" w:type="dxa"/>
-            <w:tcBorders>
-              <w:top w:val="single" w:sz="1" w:space="0" w:color="D9D9D9"/>
-              <w:left w:val="single" w:sz="1" w:space="0" w:color="D9D9D9"/>
-              <w:bottom w:val="single" w:sz="1" w:space="0" w:color="D9D9D9"/>
-              <w:right w:val="single" w:sz="1" w:space="0" w:color="D9D9D9"/>
-            </w:tcBorders>
-            <w:shd w:val="clear" w:color="auto" w:fill="1F4D3A"/>
-            <w:tcMar>
-              <w:top w:w="60" w:type="dxa"/>
-              <w:left w:w="100" w:type="dxa"/>
-              <w:bottom w:w="60" w:type="dxa"/>
-              <w:right w:w="100" w:type="dxa"/>
-            </w:tcMar>
-            <w:vAlign w:val="center"/>
-          </w:tcPr>
-          <w:p>
-            <w:r>
-              <w:rPr>
-                <w:b/>
-                <w:bCs/>
-                <w:color w:val="FFFFFF"/>
-                <w:sz w:val="20"/>
-                <w:szCs w:val="20"/>
-              </w:rPr>
-              <w:t>Token</w:t>
-            </w:r>
-          </w:p>
-        </w:tc>
-        <w:tc>
-          <w:tcPr>
-            <w:tcW w:w="5026" w:type="dxa"/>
-            <w:tcBorders>
-              <w:top w:val="single" w:sz="1" w:space="0" w:color="D9D9D9"/>
-              <w:left w:val="single" w:sz="1" w:space="0" w:color="D9D9D9"/>
-              <w:bottom w:val="single" w:sz="1" w:space="0" w:color="D9D9D9"/>
-              <w:right w:val="single" w:sz="1" w:space="0" w:color="D9D9D9"/>
-            </w:tcBorders>
-            <w:shd w:val="clear" w:color="auto" w:fill="1F4D3A"/>
-            <w:tcMar>
-              <w:top w:w="60" w:type="dxa"/>
-              <w:left w:w="100" w:type="dxa"/>
-              <w:bottom w:w="60" w:type="dxa"/>
-              <w:right w:w="100" w:type="dxa"/>
-            </w:tcMar>
-            <w:vAlign w:val="center"/>
-          </w:tcPr>
-          <w:p>
-            <w:r>
-              <w:rPr>
-                <w:b/>
-                <w:bCs/>
-                <w:color w:val="FFFFFF"/>
-                <w:sz w:val="20"/>
-                <w:szCs w:val="20"/>
-              </w:rPr>
-              <w:t>Wert</w:t>
-            </w:r>
-          </w:p>
-        </w:tc>
-      </w:tr>
-      <w:tr>
-        <w:tc>
-          <w:tcPr>
-            <w:tcW w:w="4000" w:type="dxa"/>
-            <w:tcBorders>
-              <w:top w:val="single" w:sz="1" w:space="0" w:color="D9D9D9"/>
-              <w:left w:val="single" w:sz="1" w:space="0" w:color="D9D9D9"/>
-              <w:bottom w:val="single" w:sz="1" w:space="0" w:color="D9D9D9"/>
-              <w:right w:val="single" w:sz="1" w:space="0" w:color="D9D9D9"/>
-            </w:tcBorders>
-            <w:tcMar>
-              <w:top w:w="60" w:type="dxa"/>
-              <w:left w:w="100" w:type="dxa"/>
-              <w:bottom w:w="60" w:type="dxa"/>
-              <w:right w:w="100" w:type="dxa"/>
-            </w:tcMar>
-          </w:tcPr>
-          <w:p>
-            <w:r>
-              <w:rPr>
-                <w:color w:val="222222"/>
-                <w:sz w:val="20"/>
-                <w:szCs w:val="20"/>
-              </w:rPr>
-              <w:t>--font-sans</w:t>
-            </w:r>
-          </w:p>
-        </w:tc>
-        <w:tc>
-          <w:tcPr>
-            <w:tcW w:w="5026" w:type="dxa"/>
-            <w:tcBorders>
-              <w:top w:val="single" w:sz="1" w:space="0" w:color="D9D9D9"/>
-              <w:left w:val="single" w:sz="1" w:space="0" w:color="D9D9D9"/>
-              <w:bottom w:val="single" w:sz="1" w:space="0" w:color="D9D9D9"/>
-              <w:right w:val="single" w:sz="1" w:space="0" w:color="D9D9D9"/>
-            </w:tcBorders>
-            <w:tcMar>
-              <w:top w:w="60" w:type="dxa"/>
-              <w:left w:w="100" w:type="dxa"/>
-              <w:bottom w:w="60" w:type="dxa"/>
-              <w:right w:w="100" w:type="dxa"/>
-            </w:tcMar>
-          </w:tcPr>
-          <w:p>
-            <w:r>
-              <w:rPr>
-                <w:color w:val="222222"/>
-                <w:sz w:val="20"/>
-                <w:szCs w:val="20"/>
-              </w:rPr>
-              <w:t>Source Sans 3, Inter, sans-serif – Einsatz: Fließtext, Navigation, Buttons, Formularfelder, Bildunterschriften, alle UI-Elemente</w:t>
-            </w:r>
-          </w:p>
-        </w:tc>
-      </w:tr>
-      <w:tr>
-        <w:tc>
-          <w:tcPr>
-            <w:tcW w:w="4000" w:type="dxa"/>
-            <w:tcBorders>
-              <w:top w:val="single" w:sz="1" w:space="0" w:color="D9D9D9"/>
-              <w:left w:val="single" w:sz="1" w:space="0" w:color="D9D9D9"/>
-              <w:bottom w:val="single" w:sz="1" w:space="0" w:color="D9D9D9"/>
-              <w:right w:val="single" w:sz="1" w:space="0" w:color="D9D9D9"/>
-            </w:tcBorders>
-            <w:shd w:val="clear" w:color="auto" w:fill="F7F5EF"/>
-            <w:tcMar>
-              <w:top w:w="60" w:type="dxa"/>
-              <w:left w:w="100" w:type="dxa"/>
-              <w:bottom w:w="60" w:type="dxa"/>
-              <w:right w:w="100" w:type="dxa"/>
-            </w:tcMar>
-          </w:tcPr>
-          <w:p>
-            <w:r>
-              <w:rPr>
-                <w:color w:val="222222"/>
-                <w:sz w:val="20"/>
-                <w:szCs w:val="20"/>
-              </w:rPr>
-              <w:t>--font-serif</w:t>
-            </w:r>
-          </w:p>
-        </w:tc>
-        <w:tc>
-          <w:tcPr>
-            <w:tcW w:w="5026" w:type="dxa"/>
-            <w:tcBorders>
-              <w:top w:val="single" w:sz="1" w:space="0" w:color="D9D9D9"/>
-              <w:left w:val="single" w:sz="1" w:space="0" w:color="D9D9D9"/>
-              <w:bottom w:val="single" w:sz="1" w:space="0" w:color="D9D9D9"/>
-              <w:right w:val="single" w:sz="1" w:space="0" w:color="D9D9D9"/>
-            </w:tcBorders>
-            <w:shd w:val="clear" w:color="auto" w:fill="F7F5EF"/>
-            <w:tcMar>
-              <w:top w:w="60" w:type="dxa"/>
-              <w:left w:w="100" w:type="dxa"/>
-              <w:bottom w:w="60" w:type="dxa"/>
-              <w:right w:w="100" w:type="dxa"/>
-            </w:tcMar>
-          </w:tcPr>
-          <w:p>
-            <w:r>
-              <w:rPr>
-                <w:color w:val="222222"/>
-                <w:sz w:val="20"/>
-                <w:szCs w:val="20"/>
-              </w:rPr>
-              <w:t>Source Serif 4, Georgia, serif – Einsatz: Nur Hero-Überschriften (H1) und Zitate/Leitgedanken. Nicht für H2, H3 oder Fließtext verwenden.</w:t>
-            </w:r>
-          </w:p>
-        </w:tc>
-      </w:tr>
-      <w:tr>
-        <w:tc>
-          <w:tcPr>
-            <w:tcW w:w="4000" w:type="dxa"/>
-            <w:tcBorders>
-              <w:top w:val="single" w:sz="1" w:space="0" w:color="D9D9D9"/>
-              <w:left w:val="single" w:sz="1" w:space="0" w:color="D9D9D9"/>
-              <w:bottom w:val="single" w:sz="1" w:space="0" w:color="D9D9D9"/>
-              <w:right w:val="single" w:sz="1" w:space="0" w:color="D9D9D9"/>
-            </w:tcBorders>
-            <w:tcMar>
-              <w:top w:w="60" w:type="dxa"/>
-              <w:left w:w="100" w:type="dxa"/>
-              <w:bottom w:w="60" w:type="dxa"/>
-              <w:right w:w="100" w:type="dxa"/>
-            </w:tcMar>
-          </w:tcPr>
-          <w:p>
-            <w:r>
-              <w:rPr>
-                <w:color w:val="222222"/>
-                <w:sz w:val="20"/>
-                <w:szCs w:val="20"/>
-              </w:rPr>
-              <w:t>--font-size-body</w:t>
-            </w:r>
-          </w:p>
-        </w:tc>
-        <w:tc>
-          <w:tcPr>
-            <w:tcW w:w="5026" w:type="dxa"/>
-            <w:tcBorders>
-              <w:top w:val="single" w:sz="1" w:space="0" w:color="D9D9D9"/>
-              <w:left w:val="single" w:sz="1" w:space="0" w:color="D9D9D9"/>
-              <w:bottom w:val="single" w:sz="1" w:space="0" w:color="D9D9D9"/>
-              <w:right w:val="single" w:sz="1" w:space="0" w:color="D9D9D9"/>
-            </w:tcBorders>
-            <w:tcMar>
-              <w:top w:w="60" w:type="dxa"/>
-              <w:left w:w="100" w:type="dxa"/>
-              <w:bottom w:w="60" w:type="dxa"/>
-              <w:right w:w="100" w:type="dxa"/>
-            </w:tcMar>
-          </w:tcPr>
-          <w:p>
-            <w:r>
-              <w:rPr>
-                <w:color w:val="222222"/>
-                <w:sz w:val="20"/>
-                <w:szCs w:val="20"/>
-              </w:rPr>
-              <w:t>18px</w:t>
-            </w:r>
-          </w:p>
-        </w:tc>
-      </w:tr>
-      <w:tr>
-        <w:tc>
-          <w:tcPr>
-            <w:tcW w:w="4000" w:type="dxa"/>
-            <w:tcBorders>
-              <w:top w:val="single" w:sz="1" w:space="0" w:color="D9D9D9"/>
-              <w:left w:val="single" w:sz="1" w:space="0" w:color="D9D9D9"/>
-              <w:bottom w:val="single" w:sz="1" w:space="0" w:color="D9D9D9"/>
-              <w:right w:val="single" w:sz="1" w:space="0" w:color="D9D9D9"/>
-            </w:tcBorders>
-            <w:shd w:val="clear" w:color="auto" w:fill="F7F5EF"/>
-            <w:tcMar>
-              <w:top w:w="60" w:type="dxa"/>
-              <w:left w:w="100" w:type="dxa"/>
-              <w:bottom w:w="60" w:type="dxa"/>
-              <w:right w:w="100" w:type="dxa"/>
-            </w:tcMar>
-          </w:tcPr>
-          <w:p>
-            <w:r>
-              <w:rPr>
-                <w:color w:val="222222"/>
-                <w:sz w:val="20"/>
-                <w:szCs w:val="20"/>
-              </w:rPr>
-              <w:t>--font-size-h1</w:t>
-            </w:r>
-          </w:p>
-        </w:tc>
-        <w:tc>
-          <w:tcPr>
-            <w:tcW w:w="5026" w:type="dxa"/>
-            <w:tcBorders>
-              <w:top w:val="single" w:sz="1" w:space="0" w:color="D9D9D9"/>
-              <w:left w:val="single" w:sz="1" w:space="0" w:color="D9D9D9"/>
-              <w:bottom w:val="single" w:sz="1" w:space="0" w:color="D9D9D9"/>
-              <w:right w:val="single" w:sz="1" w:space="0" w:color="D9D9D9"/>
-            </w:tcBorders>
-            <w:shd w:val="clear" w:color="auto" w:fill="F7F5EF"/>
-            <w:tcMar>
-              <w:top w:w="60" w:type="dxa"/>
-              <w:left w:w="100" w:type="dxa"/>
-              <w:bottom w:w="60" w:type="dxa"/>
-              <w:right w:w="100" w:type="dxa"/>
-            </w:tcMar>
-          </w:tcPr>
-          <w:p>
-            <w:r>
-              <w:rPr>
-                <w:color w:val="222222"/>
-                <w:sz w:val="20"/>
-                <w:szCs w:val="20"/>
-              </w:rPr>
-              <w:t>42px</w:t>
-            </w:r>
-          </w:p>
-        </w:tc>
-      </w:tr>
-      <w:tr>
-        <w:tc>
-          <w:tcPr>
-            <w:tcW w:w="4000" w:type="dxa"/>
-            <w:tcBorders>
-              <w:top w:val="single" w:sz="1" w:space="0" w:color="D9D9D9"/>
-              <w:left w:val="single" w:sz="1" w:space="0" w:color="D9D9D9"/>
-              <w:bottom w:val="single" w:sz="1" w:space="0" w:color="D9D9D9"/>
-              <w:right w:val="single" w:sz="1" w:space="0" w:color="D9D9D9"/>
-            </w:tcBorders>
-            <w:tcMar>
-              <w:top w:w="60" w:type="dxa"/>
-              <w:left w:w="100" w:type="dxa"/>
-              <w:bottom w:w="60" w:type="dxa"/>
-              <w:right w:w="100" w:type="dxa"/>
-            </w:tcMar>
-          </w:tcPr>
-          <w:p>
-            <w:r>
-              <w:rPr>
-                <w:color w:val="222222"/>
-                <w:sz w:val="20"/>
-                <w:szCs w:val="20"/>
-              </w:rPr>
-              <w:t>--font-size-h2</w:t>
-            </w:r>
-          </w:p>
-        </w:tc>
-        <w:tc>
-          <w:tcPr>
-            <w:tcW w:w="5026" w:type="dxa"/>
-            <w:tcBorders>
-              <w:top w:val="single" w:sz="1" w:space="0" w:color="D9D9D9"/>
-              <w:left w:val="single" w:sz="1" w:space="0" w:color="D9D9D9"/>
-              <w:bottom w:val="single" w:sz="1" w:space="0" w:color="D9D9D9"/>
-              <w:right w:val="single" w:sz="1" w:space="0" w:color="D9D9D9"/>
-            </w:tcBorders>
-            <w:tcMar>
-              <w:top w:w="60" w:type="dxa"/>
-              <w:left w:w="100" w:type="dxa"/>
-              <w:bottom w:w="60" w:type="dxa"/>
-              <w:right w:w="100" w:type="dxa"/>
-            </w:tcMar>
-          </w:tcPr>
-          <w:p>
-            <w:del w:id="7" w:author="Claude" w:date="2026-03-04T00:00:00Z">
-              <w:r>
-                <w:rPr>
-                  <w:color w:val="222222"/>
-                  <w:sz w:val="20"/>
-                  <w:szCs w:val="20"/>
-                </w:rPr>
-                <w:delText>32px</w:delText>
-              </w:r>
-            </w:del>
-            <w:r>
-              <w:rPr>
-                <w:color w:val="222222"/>
-                <w:sz w:val="20"/>
-                <w:szCs w:val="20"/>
-              </w:rPr>
-              <w:t>36px (erhöht für bessere Unterscheidung zu H3)</w:t>
-            </w:r>
-          </w:p>
-        </w:tc>
-      </w:tr>
-      <w:tr>
-        <w:tc>
-          <w:tcPr>
-            <w:tcW w:w="4000" w:type="dxa"/>
-            <w:tcBorders>
-              <w:top w:val="single" w:sz="1" w:space="0" w:color="D9D9D9"/>
-              <w:left w:val="single" w:sz="1" w:space="0" w:color="D9D9D9"/>
-              <w:bottom w:val="single" w:sz="1" w:space="0" w:color="D9D9D9"/>
-              <w:right w:val="single" w:sz="1" w:space="0" w:color="D9D9D9"/>
-            </w:tcBorders>
-            <w:shd w:val="clear" w:color="auto" w:fill="F7F5EF"/>
-            <w:tcMar>
-              <w:top w:w="60" w:type="dxa"/>
-              <w:left w:w="100" w:type="dxa"/>
-              <w:bottom w:w="60" w:type="dxa"/>
-              <w:right w:w="100" w:type="dxa"/>
-            </w:tcMar>
-          </w:tcPr>
-          <w:p>
-            <w:r>
-              <w:rPr>
-                <w:color w:val="222222"/>
-                <w:sz w:val="20"/>
-                <w:szCs w:val="20"/>
-              </w:rPr>
-              <w:t>--font-size-h3</w:t>
-            </w:r>
-          </w:p>
-        </w:tc>
-        <w:tc>
-          <w:tcPr>
-            <w:tcW w:w="5026" w:type="dxa"/>
-            <w:tcBorders>
-              <w:top w:val="single" w:sz="1" w:space="0" w:color="D9D9D9"/>
-              <w:left w:val="single" w:sz="1" w:space="0" w:color="D9D9D9"/>
-              <w:bottom w:val="single" w:sz="1" w:space="0" w:color="D9D9D9"/>
-              <w:right w:val="single" w:sz="1" w:space="0" w:color="D9D9D9"/>
-            </w:tcBorders>
-            <w:shd w:val="clear" w:color="auto" w:fill="F7F5EF"/>
-            <w:tcMar>
-              <w:top w:w="60" w:type="dxa"/>
-              <w:left w:w="100" w:type="dxa"/>
-              <w:bottom w:w="60" w:type="dxa"/>
-              <w:right w:w="100" w:type="dxa"/>
-            </w:tcMar>
-          </w:tcPr>
-          <w:p>
-            <w:r>
-              <w:rPr>
-                <w:color w:val="222222"/>
-                <w:sz w:val="20"/>
-                <w:szCs w:val="20"/>
-              </w:rPr>
-              <w:t>24px</w:t>
-            </w:r>
-          </w:p>
-        </w:tc>
-      </w:tr>
-      <w:tr>
-        <w:tc>
-          <w:tcPr>
-            <w:tcW w:w="4000" w:type="dxa"/>
-            <w:tcBorders>
-              <w:top w:val="single" w:sz="1" w:space="0" w:color="D9D9D9"/>
-              <w:left w:val="single" w:sz="1" w:space="0" w:color="D9D9D9"/>
-              <w:bottom w:val="single" w:sz="1" w:space="0" w:color="D9D9D9"/>
-              <w:right w:val="single" w:sz="1" w:space="0" w:color="D9D9D9"/>
-            </w:tcBorders>
-            <w:tcMar>
-              <w:top w:w="60" w:type="dxa"/>
-              <w:left w:w="100" w:type="dxa"/>
-              <w:bottom w:w="60" w:type="dxa"/>
-              <w:right w:w="100" w:type="dxa"/>
-            </w:tcMar>
-          </w:tcPr>
-          <w:p>
-            <w:r>
-              <w:rPr>
-                <w:color w:val="222222"/>
-                <w:sz w:val="20"/>
-                <w:szCs w:val="20"/>
-              </w:rPr>
-              <w:t>--line-height-body</w:t>
-            </w:r>
-          </w:p>
-        </w:tc>
-        <w:tc>
-          <w:tcPr>
-            <w:tcW w:w="5026" w:type="dxa"/>
-            <w:tcBorders>
-              <w:top w:val="single" w:sz="1" w:space="0" w:color="D9D9D9"/>
-              <w:left w:val="single" w:sz="1" w:space="0" w:color="D9D9D9"/>
-              <w:bottom w:val="single" w:sz="1" w:space="0" w:color="D9D9D9"/>
-              <w:right w:val="single" w:sz="1" w:space="0" w:color="D9D9D9"/>
-            </w:tcBorders>
-            <w:tcMar>
-              <w:top w:w="60" w:type="dxa"/>
-              <w:left w:w="100" w:type="dxa"/>
-              <w:bottom w:w="60" w:type="dxa"/>
-              <w:right w:w="100" w:type="dxa"/>
-            </w:tcMar>
-          </w:tcPr>
-          <w:p>
-            <w:r>
-              <w:rPr>
-                <w:color w:val="222222"/>
-                <w:sz w:val="20"/>
-                <w:szCs w:val="20"/>
-              </w:rPr>
-              <w:t>1.65</w:t>
-            </w:r>
-          </w:p>
-        </w:tc>
-      </w:tr>
-    </w:tbl>
+      <w:del w:id="204" w:author="Claude" w:date="2026-04-01T00:00:00Z">
+        <w:r>
+          <w:rPr>
+            <w:color w:val="222222"/>
+          </w:rPr>
+          <w:delText>Farben-, Typografie-, Abstände- und Layout-Tabellen waren hier definiert.</w:delText>
+        </w:r>
+      </w:del>
+      <w:ins w:id="205" w:author="Claude" w:date="2026-04-01T00:00:00Z">
+        <w:r>
+          <w:rPr>
+            <w:color w:val="222222"/>
+          </w:rPr>
+          <w:t>Alle Design Tokens (Farben, Typografie, Abstände, Radii, Shadows, Layout-Grid) sind verbindlich in folgenden Dokumenten definiert:</w:t>
+        </w:r>
+      </w:ins>
+    </w:p>
+    <w:p>
+      <w:pPr>
+        <w:pStyle w:val="Listenabsatz"/>
+        <w:numPr>
+          <w:ilvl w:val="0"/>
+          <w:numId w:val="3"/>
+        </w:numPr>
+        <w:spacing w:after="80"/>
+      </w:pPr>
+      <w:ins w:id="206" w:author="Claude" w:date="2026-04-01T00:00:00Z">
+        <w:r>
+          <w:rPr>
+            <w:b/>
+            <w:color w:val="222222"/>
+          </w:rPr>
+          <w:t xml:space="preserve">brand-identity-mavka.html </w:t>
+        </w:r>
+        <w:r>
+          <w:rPr>
+            <w:color w:val="222222"/>
+          </w:rPr>
+          <w:t>(autoritativ) – Farbpalette, Typografie, Logo-System, Markensprache</w:t>
+        </w:r>
+      </w:ins>
+    </w:p>
+    <w:p>
+      <w:pPr>
+        <w:pStyle w:val="Listenabsatz"/>
+        <w:numPr>
+          <w:ilvl w:val="0"/>
+          <w:numId w:val="3"/>
+        </w:numPr>
+        <w:spacing w:after="80"/>
+      </w:pPr>
+      <w:ins w:id="207" w:author="Claude" w:date="2026-04-01T00:00:00Z">
+        <w:r>
+          <w:rPr>
+            <w:b/>
+            <w:color w:val="222222"/>
+          </w:rPr>
+          <w:t xml:space="preserve">design-system.html </w:t>
+        </w:r>
+        <w:r>
+          <w:rPr>
+            <w:color w:val="222222"/>
+          </w:rPr>
+          <w:t>– CSS Custom Properties, Spacing-Skala, Radii, Shadows, Grid-System, Transitions</w:t>
+        </w:r>
+      </w:ins>
+    </w:p>
     <w:p>
       <w:pPr>
         <w:spacing w:after="160"/>
       </w:pPr>
-    </w:p>
-    <w:p>
-      <w:pPr>
-        <w:pStyle w:val="berschrift3"/>
-      </w:pPr>
-      <w:r>
-        <w:t>Abstände</w:t>
-      </w:r>
-    </w:p>
-    <w:tbl>
-      <w:tblPr>
-        <w:tblW w:w="9026" w:type="dxa"/>
-        <w:tblBorders>
-          <w:top w:val="single" w:sz="4" w:space="0" w:color="auto"/>
-          <w:left w:val="single" w:sz="4" w:space="0" w:color="auto"/>
-          <w:bottom w:val="single" w:sz="4" w:space="0" w:color="auto"/>
-          <w:right w:val="single" w:sz="4" w:space="0" w:color="auto"/>
-          <w:insideH w:val="single" w:sz="4" w:space="0" w:color="auto"/>
-          <w:insideV w:val="single" w:sz="4" w:space="0" w:color="auto"/>
-        </w:tblBorders>
-        <w:tblCellMar>
-          <w:left w:w="10" w:type="dxa"/>
-          <w:right w:w="10" w:type="dxa"/>
-        </w:tblCellMar>
-        <w:tblLook w:val="04A0" w:firstRow="1" w:lastRow="0" w:firstColumn="1" w:lastColumn="0" w:noHBand="0" w:noVBand="1"/>
-      </w:tblPr>
-      <w:tblGrid>
-        <w:gridCol w:w="4000"/>
-        <w:gridCol w:w="5026"/>
-      </w:tblGrid>
-      <w:tr>
-        <w:tc>
-          <w:tcPr>
-            <w:tcW w:w="4000" w:type="dxa"/>
-            <w:tcBorders>
-              <w:top w:val="single" w:sz="1" w:space="0" w:color="D9D9D9"/>
-              <w:left w:val="single" w:sz="1" w:space="0" w:color="D9D9D9"/>
-              <w:bottom w:val="single" w:sz="1" w:space="0" w:color="D9D9D9"/>
-              <w:right w:val="single" w:sz="1" w:space="0" w:color="D9D9D9"/>
-            </w:tcBorders>
-            <w:shd w:val="clear" w:color="auto" w:fill="1F4D3A"/>
-            <w:tcMar>
-              <w:top w:w="60" w:type="dxa"/>
-              <w:left w:w="100" w:type="dxa"/>
-              <w:bottom w:w="60" w:type="dxa"/>
-              <w:right w:w="100" w:type="dxa"/>
-            </w:tcMar>
-            <w:vAlign w:val="center"/>
-          </w:tcPr>
-          <w:p>
-            <w:r>
-              <w:rPr>
-                <w:b/>
-                <w:bCs/>
-                <w:color w:val="FFFFFF"/>
-                <w:sz w:val="20"/>
-                <w:szCs w:val="20"/>
-              </w:rPr>
-              <w:t>Token</w:t>
-            </w:r>
-          </w:p>
-        </w:tc>
-        <w:tc>
-          <w:tcPr>
-            <w:tcW w:w="5026" w:type="dxa"/>
-            <w:tcBorders>
-              <w:top w:val="single" w:sz="1" w:space="0" w:color="D9D9D9"/>
-              <w:left w:val="single" w:sz="1" w:space="0" w:color="D9D9D9"/>
-              <w:bottom w:val="single" w:sz="1" w:space="0" w:color="D9D9D9"/>
-              <w:right w:val="single" w:sz="1" w:space="0" w:color="D9D9D9"/>
-            </w:tcBorders>
-            <w:shd w:val="clear" w:color="auto" w:fill="1F4D3A"/>
-            <w:tcMar>
-              <w:top w:w="60" w:type="dxa"/>
-              <w:left w:w="100" w:type="dxa"/>
-              <w:bottom w:w="60" w:type="dxa"/>
-              <w:right w:w="100" w:type="dxa"/>
-            </w:tcMar>
-            <w:vAlign w:val="center"/>
-          </w:tcPr>
-          <w:p>
-            <w:r>
-              <w:rPr>
-                <w:b/>
-                <w:bCs/>
-                <w:color w:val="FFFFFF"/>
-                <w:sz w:val="20"/>
-                <w:szCs w:val="20"/>
-              </w:rPr>
-              <w:t>Wert</w:t>
-            </w:r>
-          </w:p>
-        </w:tc>
-      </w:tr>
-      <w:tr>
-        <w:tc>
-          <w:tcPr>
-            <w:tcW w:w="4000" w:type="dxa"/>
-            <w:tcBorders>
-              <w:top w:val="single" w:sz="1" w:space="0" w:color="D9D9D9"/>
-              <w:left w:val="single" w:sz="1" w:space="0" w:color="D9D9D9"/>
-              <w:bottom w:val="single" w:sz="1" w:space="0" w:color="D9D9D9"/>
-              <w:right w:val="single" w:sz="1" w:space="0" w:color="D9D9D9"/>
-            </w:tcBorders>
-            <w:tcMar>
-              <w:top w:w="60" w:type="dxa"/>
-              <w:left w:w="100" w:type="dxa"/>
-              <w:bottom w:w="60" w:type="dxa"/>
-              <w:right w:w="100" w:type="dxa"/>
-            </w:tcMar>
-          </w:tcPr>
-          <w:p>
-            <w:r>
-              <w:rPr>
-                <w:color w:val="222222"/>
-                <w:sz w:val="20"/>
-                <w:szCs w:val="20"/>
-              </w:rPr>
-              <w:t>--space-xs</w:t>
-            </w:r>
-          </w:p>
-        </w:tc>
-        <w:tc>
-          <w:tcPr>
-            <w:tcW w:w="5026" w:type="dxa"/>
-            <w:tcBorders>
-              <w:top w:val="single" w:sz="1" w:space="0" w:color="D9D9D9"/>
-              <w:left w:val="single" w:sz="1" w:space="0" w:color="D9D9D9"/>
-              <w:bottom w:val="single" w:sz="1" w:space="0" w:color="D9D9D9"/>
-              <w:right w:val="single" w:sz="1" w:space="0" w:color="D9D9D9"/>
-            </w:tcBorders>
-            <w:tcMar>
-              <w:top w:w="60" w:type="dxa"/>
-              <w:left w:w="100" w:type="dxa"/>
-              <w:bottom w:w="60" w:type="dxa"/>
-              <w:right w:w="100" w:type="dxa"/>
-            </w:tcMar>
-          </w:tcPr>
-          <w:p>
-            <w:r>
-              <w:rPr>
-                <w:color w:val="222222"/>
-                <w:sz w:val="20"/>
-                <w:szCs w:val="20"/>
-              </w:rPr>
-              <w:t>8px</w:t>
-            </w:r>
-          </w:p>
-        </w:tc>
-      </w:tr>
-      <w:tr>
-        <w:tc>
-          <w:tcPr>
-            <w:tcW w:w="4000" w:type="dxa"/>
-            <w:tcBorders>
-              <w:top w:val="single" w:sz="1" w:space="0" w:color="D9D9D9"/>
-              <w:left w:val="single" w:sz="1" w:space="0" w:color="D9D9D9"/>
-              <w:bottom w:val="single" w:sz="1" w:space="0" w:color="D9D9D9"/>
-              <w:right w:val="single" w:sz="1" w:space="0" w:color="D9D9D9"/>
-            </w:tcBorders>
-            <w:shd w:val="clear" w:color="auto" w:fill="F7F5EF"/>
-            <w:tcMar>
-              <w:top w:w="60" w:type="dxa"/>
-              <w:left w:w="100" w:type="dxa"/>
-              <w:bottom w:w="60" w:type="dxa"/>
-              <w:right w:w="100" w:type="dxa"/>
-            </w:tcMar>
-          </w:tcPr>
-          <w:p>
-            <w:r>
-              <w:rPr>
-                <w:color w:val="222222"/>
-                <w:sz w:val="20"/>
-                <w:szCs w:val="20"/>
-              </w:rPr>
-              <w:t>--space-sm</w:t>
-            </w:r>
-          </w:p>
-        </w:tc>
-        <w:tc>
-          <w:tcPr>
-            <w:tcW w:w="5026" w:type="dxa"/>
-            <w:tcBorders>
-              <w:top w:val="single" w:sz="1" w:space="0" w:color="D9D9D9"/>
-              <w:left w:val="single" w:sz="1" w:space="0" w:color="D9D9D9"/>
-              <w:bottom w:val="single" w:sz="1" w:space="0" w:color="D9D9D9"/>
-              <w:right w:val="single" w:sz="1" w:space="0" w:color="D9D9D9"/>
-            </w:tcBorders>
-            <w:shd w:val="clear" w:color="auto" w:fill="F7F5EF"/>
-            <w:tcMar>
-              <w:top w:w="60" w:type="dxa"/>
-              <w:left w:w="100" w:type="dxa"/>
-              <w:bottom w:w="60" w:type="dxa"/>
-              <w:right w:w="100" w:type="dxa"/>
-            </w:tcMar>
-          </w:tcPr>
-          <w:p>
-            <w:r>
-              <w:rPr>
-                <w:color w:val="222222"/>
-                <w:sz w:val="20"/>
-                <w:szCs w:val="20"/>
-              </w:rPr>
-              <w:t>16px</w:t>
-            </w:r>
-          </w:p>
-        </w:tc>
-      </w:tr>
-      <w:tr>
-        <w:tc>
-          <w:tcPr>
-            <w:tcW w:w="4000" w:type="dxa"/>
-            <w:tcBorders>
-              <w:top w:val="single" w:sz="1" w:space="0" w:color="D9D9D9"/>
-              <w:left w:val="single" w:sz="1" w:space="0" w:color="D9D9D9"/>
-              <w:bottom w:val="single" w:sz="1" w:space="0" w:color="D9D9D9"/>
-              <w:right w:val="single" w:sz="1" w:space="0" w:color="D9D9D9"/>
-            </w:tcBorders>
-            <w:tcMar>
-              <w:top w:w="60" w:type="dxa"/>
-              <w:left w:w="100" w:type="dxa"/>
-              <w:bottom w:w="60" w:type="dxa"/>
-              <w:right w:w="100" w:type="dxa"/>
-            </w:tcMar>
-          </w:tcPr>
-          <w:p>
-            <w:r>
-              <w:rPr>
-                <w:color w:val="222222"/>
-                <w:sz w:val="20"/>
-                <w:szCs w:val="20"/>
-              </w:rPr>
-              <w:t>--space-md</w:t>
-            </w:r>
-          </w:p>
-        </w:tc>
-        <w:tc>
-          <w:tcPr>
-            <w:tcW w:w="5026" w:type="dxa"/>
-            <w:tcBorders>
-              <w:top w:val="single" w:sz="1" w:space="0" w:color="D9D9D9"/>
-              <w:left w:val="single" w:sz="1" w:space="0" w:color="D9D9D9"/>
-              <w:bottom w:val="single" w:sz="1" w:space="0" w:color="D9D9D9"/>
-              <w:right w:val="single" w:sz="1" w:space="0" w:color="D9D9D9"/>
-            </w:tcBorders>
-            <w:tcMar>
-              <w:top w:w="60" w:type="dxa"/>
-              <w:left w:w="100" w:type="dxa"/>
-              <w:bottom w:w="60" w:type="dxa"/>
-              <w:right w:w="100" w:type="dxa"/>
-            </w:tcMar>
-          </w:tcPr>
-          <w:p>
-            <w:r>
-              <w:rPr>
-                <w:color w:val="222222"/>
-                <w:sz w:val="20"/>
-                <w:szCs w:val="20"/>
-              </w:rPr>
-              <w:t>24px</w:t>
-            </w:r>
-          </w:p>
-        </w:tc>
-      </w:tr>
-      <w:tr>
-        <w:tc>
-          <w:tcPr>
-            <w:tcW w:w="4000" w:type="dxa"/>
-            <w:tcBorders>
-              <w:top w:val="single" w:sz="1" w:space="0" w:color="D9D9D9"/>
-              <w:left w:val="single" w:sz="1" w:space="0" w:color="D9D9D9"/>
-              <w:bottom w:val="single" w:sz="1" w:space="0" w:color="D9D9D9"/>
-              <w:right w:val="single" w:sz="1" w:space="0" w:color="D9D9D9"/>
-            </w:tcBorders>
-            <w:shd w:val="clear" w:color="auto" w:fill="F7F5EF"/>
-            <w:tcMar>
-              <w:top w:w="60" w:type="dxa"/>
-              <w:left w:w="100" w:type="dxa"/>
-              <w:bottom w:w="60" w:type="dxa"/>
-              <w:right w:w="100" w:type="dxa"/>
-            </w:tcMar>
-          </w:tcPr>
-          <w:p>
-            <w:r>
-              <w:rPr>
-                <w:color w:val="222222"/>
-                <w:sz w:val="20"/>
-                <w:szCs w:val="20"/>
-              </w:rPr>
-              <w:t>--space-lg</w:t>
-            </w:r>
-          </w:p>
-        </w:tc>
-        <w:tc>
-          <w:tcPr>
-            <w:tcW w:w="5026" w:type="dxa"/>
-            <w:tcBorders>
-              <w:top w:val="single" w:sz="1" w:space="0" w:color="D9D9D9"/>
-              <w:left w:val="single" w:sz="1" w:space="0" w:color="D9D9D9"/>
-              <w:bottom w:val="single" w:sz="1" w:space="0" w:color="D9D9D9"/>
-              <w:right w:val="single" w:sz="1" w:space="0" w:color="D9D9D9"/>
-            </w:tcBorders>
-            <w:shd w:val="clear" w:color="auto" w:fill="F7F5EF"/>
-            <w:tcMar>
-              <w:top w:w="60" w:type="dxa"/>
-              <w:left w:w="100" w:type="dxa"/>
-              <w:bottom w:w="60" w:type="dxa"/>
-              <w:right w:w="100" w:type="dxa"/>
-            </w:tcMar>
-          </w:tcPr>
-          <w:p>
-            <w:r>
-              <w:rPr>
-                <w:color w:val="222222"/>
-                <w:sz w:val="20"/>
-                <w:szCs w:val="20"/>
-              </w:rPr>
-              <w:t>48px</w:t>
-            </w:r>
-          </w:p>
-        </w:tc>
-      </w:tr>
-      <w:tr>
-        <w:tc>
-          <w:tcPr>
-            <w:tcW w:w="4000" w:type="dxa"/>
-            <w:tcBorders>
-              <w:top w:val="single" w:sz="1" w:space="0" w:color="D9D9D9"/>
-              <w:left w:val="single" w:sz="1" w:space="0" w:color="D9D9D9"/>
-              <w:bottom w:val="single" w:sz="1" w:space="0" w:color="D9D9D9"/>
-              <w:right w:val="single" w:sz="1" w:space="0" w:color="D9D9D9"/>
-            </w:tcBorders>
-            <w:tcMar>
-              <w:top w:w="60" w:type="dxa"/>
-              <w:left w:w="100" w:type="dxa"/>
-              <w:bottom w:w="60" w:type="dxa"/>
-              <w:right w:w="100" w:type="dxa"/>
-            </w:tcMar>
-          </w:tcPr>
-          <w:p>
-            <w:r>
-              <w:rPr>
-                <w:color w:val="222222"/>
-                <w:sz w:val="20"/>
-                <w:szCs w:val="20"/>
-              </w:rPr>
-              <w:t>--space-xl</w:t>
-            </w:r>
-          </w:p>
-        </w:tc>
-        <w:tc>
-          <w:tcPr>
-            <w:tcW w:w="5026" w:type="dxa"/>
-            <w:tcBorders>
-              <w:top w:val="single" w:sz="1" w:space="0" w:color="D9D9D9"/>
-              <w:left w:val="single" w:sz="1" w:space="0" w:color="D9D9D9"/>
-              <w:bottom w:val="single" w:sz="1" w:space="0" w:color="D9D9D9"/>
-              <w:right w:val="single" w:sz="1" w:space="0" w:color="D9D9D9"/>
-            </w:tcBorders>
-            <w:tcMar>
-              <w:top w:w="60" w:type="dxa"/>
-              <w:left w:w="100" w:type="dxa"/>
-              <w:bottom w:w="60" w:type="dxa"/>
-              <w:right w:w="100" w:type="dxa"/>
-            </w:tcMar>
-          </w:tcPr>
-          <w:p>
-            <w:r>
-              <w:rPr>
-                <w:color w:val="222222"/>
-                <w:sz w:val="20"/>
-                <w:szCs w:val="20"/>
-              </w:rPr>
-              <w:t>80px</w:t>
-            </w:r>
-          </w:p>
-        </w:tc>
-      </w:tr>
-      <w:tr>
-        <w:tc>
-          <w:tcPr>
-            <w:tcW w:w="4000" w:type="dxa"/>
-            <w:tcBorders>
-              <w:top w:val="single" w:sz="1" w:space="0" w:color="D9D9D9"/>
-              <w:left w:val="single" w:sz="1" w:space="0" w:color="D9D9D9"/>
-              <w:bottom w:val="single" w:sz="1" w:space="0" w:color="D9D9D9"/>
-              <w:right w:val="single" w:sz="1" w:space="0" w:color="D9D9D9"/>
-            </w:tcBorders>
-            <w:shd w:val="clear" w:color="auto" w:fill="F7F5EF"/>
-            <w:tcMar>
-              <w:top w:w="60" w:type="dxa"/>
-              <w:left w:w="100" w:type="dxa"/>
-              <w:bottom w:w="60" w:type="dxa"/>
-              <w:right w:w="100" w:type="dxa"/>
-            </w:tcMar>
-          </w:tcPr>
-          <w:p>
-            <w:r>
-              <w:rPr>
-                <w:color w:val="222222"/>
-                <w:sz w:val="20"/>
-                <w:szCs w:val="20"/>
-              </w:rPr>
-              <w:lastRenderedPageBreak/>
-              <w:t>Zwischen Sektionen</w:t>
-            </w:r>
-          </w:p>
-        </w:tc>
-        <w:tc>
-          <w:tcPr>
-            <w:tcW w:w="5026" w:type="dxa"/>
-            <w:tcBorders>
-              <w:top w:val="single" w:sz="1" w:space="0" w:color="D9D9D9"/>
-              <w:left w:val="single" w:sz="1" w:space="0" w:color="D9D9D9"/>
-              <w:bottom w:val="single" w:sz="1" w:space="0" w:color="D9D9D9"/>
-              <w:right w:val="single" w:sz="1" w:space="0" w:color="D9D9D9"/>
-            </w:tcBorders>
-            <w:shd w:val="clear" w:color="auto" w:fill="F7F5EF"/>
-            <w:tcMar>
-              <w:top w:w="60" w:type="dxa"/>
-              <w:left w:w="100" w:type="dxa"/>
-              <w:bottom w:w="60" w:type="dxa"/>
-              <w:right w:w="100" w:type="dxa"/>
-            </w:tcMar>
-          </w:tcPr>
-          <w:p>
-            <w:del w:id="8" w:author="Claude" w:date="2026-03-04T00:00:00Z">
-              <w:r>
-                <w:rPr>
-                  <w:color w:val="222222"/>
-                  <w:sz w:val="20"/>
-                  <w:szCs w:val="20"/>
-                </w:rPr>
-                <w:delText>80–100px</w:delText>
-              </w:r>
-            </w:del>
-            <w:r>
-              <w:rPr>
-                <w:color w:val="222222"/>
-                <w:sz w:val="20"/>
-                <w:szCs w:val="20"/>
-              </w:rPr>
-              <w:t>80px (fester Wert statt Spanne)</w:t>
-            </w:r>
-          </w:p>
-        </w:tc>
-      </w:tr>
-    </w:tbl>
-    <w:p>
-      <w:pPr>
-        <w:spacing w:after="200"/>
-      </w:pPr>
-    </w:p>
-    <w:p>
-      <w:pPr>
-        <w:pStyle w:val="berschrift2"/>
-      </w:pPr>
-      <w:r>
-        <w:t>Layout</w:t>
-      </w:r>
-    </w:p>
-    <w:p>
-      <w:pPr>
-        <w:pStyle w:val="Listenabsatz"/>
-        <w:numPr>
-          <w:ilvl w:val="0"/>
-          <w:numId w:val="3"/>
-        </w:numPr>
-        <w:spacing w:after="80"/>
-      </w:pPr>
-      <w:r>
-        <w:rPr>
-          <w:color w:val="222222"/>
-        </w:rPr>
-        <w:t>12-Spalten-Grid (Desktop), Max-Content-Breite: 1100–1200px</w:t>
-      </w:r>
-    </w:p>
-    <w:p>
-      <w:pPr>
-        <w:pStyle w:val="Listenabsatz"/>
-        <w:numPr>
-          <w:ilvl w:val="0"/>
-          <w:numId w:val="3"/>
-        </w:numPr>
-        <w:spacing w:after="80"/>
-      </w:pPr>
-      <w:r>
-        <w:rPr>
-          <w:color w:val="222222"/>
-        </w:rPr>
-        <w:t>Innenabstand: mind. 24px seitlich</w:t>
-      </w:r>
-    </w:p>
-    <w:p>
-      <w:pPr>
-        <w:pStyle w:val="Listenabsatz"/>
-        <w:numPr>
-          <w:ilvl w:val="0"/>
-          <w:numId w:val="3"/>
-        </w:numPr>
-        <w:spacing w:after="80"/>
-      </w:pPr>
-      <w:r>
-        <w:rPr>
-          <w:color w:val="222222"/>
-        </w:rPr>
-        <w:t>Mobile: Einspaltig, große Abstände, Buttons volle Breite</w:t>
-      </w:r>
-    </w:p>
-    <w:p>
-      <w:pPr>
-        <w:pStyle w:val="Listenabsatz"/>
-        <w:numPr>
-          <w:ilvl w:val="0"/>
-          <w:numId w:val="3"/>
-        </w:numPr>
-        <w:spacing w:after="80"/>
-      </w:pPr>
-      <w:r>
-        <w:rPr>
-          <w:color w:val="222222"/>
-        </w:rPr>
-        <w:t>Radius: 6–8px, Shadow: dezent (0 2px 6px rgba(0,0,0,0.05))</w:t>
-      </w:r>
+      <w:ins w:id="208" w:author="Claude" w:date="2026-04-01T00:00:00Z">
+        <w:r>
+          <w:rPr>
+            <w:color w:val="222222"/>
+          </w:rPr>
+          <w:t>Dieses Konzept definiert keine eigenen Token-Werte, um Widersprüche zwischen Dokumenten zu vermeiden. Bei Änderungen an Tokens sind ausschließlich die oben genannten Quellen zu aktualisieren.</w:t>
+        </w:r>
+      </w:ins>
     </w:p>
     <w:p>
       <w:pPr>

</xml_diff>

<commit_message>
docs: Konzept bereinigen — Redundanzen entfernen, Verweise setzen, Lücken schließen
Aufräumen:
- §1: Alle offenen Fragen als beantwortet/offen markiert
- Phase 1 Titel korrigiert (Fotomaterial vorhanden)
- §7 Newsletter: CleverReach/Brevo durch Hostinger Reach ersetzt (sauber)

Auslagern (Verweise statt Duplikate):
- §2 Projekt-Zusammenfassung → Verweis auf Projektbeschreibung.docx
- §13 Kernkomponenten → Verweis auf UI-Spezifikation + design-system
- §13 Barrierearme Systemregeln → Verweis auf design-system
- §13 CMS-Inhaltstypen → Verweis auf Projektbeschreibung

Ergänzen:
- §5 URL-Struktur /de/, /en/
- §9 Schnelle Ladezeiten + Sprachumschalter-Details

Co-Authored-By: Claude Opus 4.6 (1M context) <noreply@anthropic.com>
</commit_message>
<xml_diff>
--- a/docs/Stategisches Website Konzept-Gemeinsam-Kochen-Aktualisiert.docx
+++ b/docs/Stategisches Website Konzept-Gemeinsam-Kochen-Aktualisiert.docx
@@ -181,6 +181,15 @@
         </w:rPr>
         <w:t>Gibt es bereits ein Corporate Design (Logo, Farben, Typografie)?</w:t>
       </w:r>
+      <w:ins w:id="300" w:author="Claude" w:date="2026-04-01T00:00:00Z">
+        <w:r>
+          <w:rPr>
+            <w:b/>
+            <w:color w:val="222222"/>
+          </w:rPr>
+          <w:t xml:space="preserve"> – Beantwortet: Ja (brand-identity-mavka.html).</w:t>
+        </w:r>
+      </w:ins>
     </w:p>
     <w:p>
       <w:pPr>
@@ -220,6 +229,15 @@
         </w:rPr>
         <w:t>Müssen Förderberichte öffentlich vollständig einsehbar sein oder in Auszügen/Zusammenfassungen?</w:t>
       </w:r>
+      <w:ins w:id="301" w:author="Claude" w:date="2026-04-01T00:00:00Z">
+        <w:r>
+          <w:rPr>
+            <w:b/>
+            <w:color w:val="222222"/>
+          </w:rPr>
+          <w:t xml:space="preserve"> – Noch zu klären.</w:t>
+        </w:r>
+      </w:ins>
     </w:p>
     <w:p>
       <w:pPr>
@@ -321,6 +339,15 @@
         </w:rPr>
         <w:t>Gibt es perspektivisch weitere Projekte ab 2027?</w:t>
       </w:r>
+      <w:ins w:id="302" w:author="Claude" w:date="2026-04-01T00:00:00Z">
+        <w:r>
+          <w:rPr>
+            <w:b/>
+            <w:color w:val="222222"/>
+          </w:rPr>
+          <w:t xml:space="preserve"> – Ja, siehe Phase 4 (§10).</w:t>
+        </w:r>
+      </w:ins>
     </w:p>
     <w:p>
       <w:pPr>
@@ -337,6 +364,15 @@
         </w:rPr>
         <w:t>Gibt es besondere Datenschutz- oder Sensibilitätsanforderungen (z. B. Schutz von Teilnehmenden)?</w:t>
       </w:r>
+      <w:ins w:id="303" w:author="Claude" w:date="2026-04-01T00:00:00Z">
+        <w:r>
+          <w:rPr>
+            <w:b/>
+            <w:color w:val="222222"/>
+          </w:rPr>
+          <w:t xml:space="preserve"> – Noch zu klären. Fotos nur mit Einwilligung (§9 Phase 2).</w:t>
+        </w:r>
+      </w:ins>
     </w:p>
     <w:p>
       <w:pPr>
@@ -358,11 +394,40 @@
       <w:pPr>
         <w:spacing w:after="160"/>
       </w:pPr>
-      <w:r>
-        <w:rPr>
-          <w:color w:val="222222"/>
-        </w:rPr>
-        <w:t>„Gemeinsam Kochen – Gemeinsam Wachsen“ ist ein FEIN-Pilotprojekt 2026 im Bezirk Berlin-Lichtenberg (Hohenschönhausen, Alt-Lichtenberg, Rummelsburg). Regelmäßige Koch- und Backworkshops bringen Senior*innen, Familien, Zugewanderte und Ehrenamtliche zusammen.</w:t>
+      <w:del w:id="308" w:author="Claude" w:date="2026-04-01T00:00:00Z">
+        <w:r>
+          <w:rPr>
+            <w:color w:val="222222"/>
+          </w:rPr>
+          <w:delText>Projektbeschreibung, Schwerpunkte und Laufzeit waren hier dargestellt.</w:delText>
+        </w:r>
+      </w:del>
+      <w:ins w:id="309" w:author="Claude" w:date="2026-04-01T00:00:00Z">
+        <w:r>
+          <w:rPr>
+            <w:color w:val="222222"/>
+          </w:rPr>
+          <w:t>Siehe Projektbeschreibung.docx §1.6–1.7 für Projektinhalt, Schwerpunkte, Ziele und Laufzeit.</w:t>
+        </w:r>
+      </w:ins>
+    </w:p>
+    <w:p>
+      <w:pPr>
+        <w:pStyle w:val="berschrift2"/>
+      </w:pPr>
+      <w:r>
+        <w:t>Rolle der Website im Gesamtprojekt</w:t>
+      </w:r>
+    </w:p>
+    <w:p>
+      <w:pPr>
+        <w:spacing w:after="160"/>
+      </w:pPr>
+      <w:r>
+        <w:rPr>
+          <w:color w:val="222222"/>
+        </w:rPr>
+        <w:t>Die Website wird 2026 klar als Projektplattform aufgebaut – aber strukturell so vorbereitet, dass sie 2027 sauber zur Trägerplattform wachsen kann.</w:t>
       </w:r>
     </w:p>
     <w:p>
@@ -370,93 +435,8 @@
         <w:pStyle w:val="berschrift3"/>
       </w:pPr>
       <w:r>
-        <w:t>Schwerpunkte</w:t>
-      </w:r>
-    </w:p>
-    <w:p>
-      <w:pPr>
-        <w:pStyle w:val="Listenabsatz"/>
-        <w:numPr>
-          <w:ilvl w:val="0"/>
-          <w:numId w:val="3"/>
-        </w:numPr>
-        <w:spacing w:after="80"/>
-      </w:pPr>
-      <w:r>
-        <w:rPr>
-          <w:color w:val="222222"/>
-        </w:rPr>
-        <w:t>Nachhaltigkeit &amp; Wertschätzung von Lebensmitteln</w:t>
-      </w:r>
-    </w:p>
-    <w:p>
-      <w:pPr>
-        <w:pStyle w:val="Listenabsatz"/>
-        <w:numPr>
-          <w:ilvl w:val="0"/>
-          <w:numId w:val="3"/>
-        </w:numPr>
-        <w:spacing w:after="80"/>
-      </w:pPr>
-      <w:r>
-        <w:rPr>
-          <w:color w:val="222222"/>
-        </w:rPr>
-        <w:t>Gesunde Ernährung</w:t>
-      </w:r>
-    </w:p>
-    <w:p>
-      <w:pPr>
-        <w:pStyle w:val="Listenabsatz"/>
-        <w:numPr>
-          <w:ilvl w:val="0"/>
-          <w:numId w:val="3"/>
-        </w:numPr>
-        <w:spacing w:after="80"/>
-      </w:pPr>
-      <w:r>
-        <w:rPr>
-          <w:color w:val="222222"/>
-        </w:rPr>
-        <w:t>Intergenerationeller Dialog</w:t>
-      </w:r>
-    </w:p>
-    <w:p>
-      <w:pPr>
-        <w:pStyle w:val="Listenabsatz"/>
-        <w:numPr>
-          <w:ilvl w:val="0"/>
-          <w:numId w:val="3"/>
-        </w:numPr>
-        <w:spacing w:after="80"/>
-      </w:pPr>
-      <w:r>
-        <w:rPr>
-          <w:color w:val="222222"/>
-        </w:rPr>
-        <w:t>Kulturelle Vielfalt</w:t>
-      </w:r>
-    </w:p>
-    <w:p>
-      <w:pPr>
-        <w:pStyle w:val="Listenabsatz"/>
-        <w:numPr>
-          <w:ilvl w:val="0"/>
-          <w:numId w:val="3"/>
-        </w:numPr>
-        <w:spacing w:after="80"/>
-      </w:pPr>
-      <w:r>
-        <w:rPr>
-          <w:color w:val="222222"/>
-        </w:rPr>
-        <w:t>Niedrigschwellige Teilhabe</w:t>
-      </w:r>
-    </w:p>
-    <w:p>
-      <w:pPr>
-        <w:spacing w:after="80"/>
-      </w:pPr>
+        <w:t>Strategische Lösung: Domain-Struktur</w:t>
+      </w:r>
     </w:p>
     <w:p>
       <w:pPr>
@@ -468,85 +448,20 @@
           <w:bCs/>
           <w:color w:val="222222"/>
         </w:rPr>
-        <w:t xml:space="preserve">Projektlaufzeit: </w:t>
-      </w:r>
-      <w:r>
-        <w:rPr>
-          <w:color w:val="222222"/>
-        </w:rPr>
-        <w:t>26. Januar 2026 – 31. Dezember 2026</w:t>
-      </w:r>
-    </w:p>
-    <w:p>
-      <w:pPr>
-        <w:spacing w:after="160"/>
-      </w:pPr>
+        <w:t>mavka.berlin</w:t>
+      </w:r>
+      <w:r>
+        <w:rPr>
+          <w:color w:val="222222"/>
+        </w:rPr>
+        <w:t xml:space="preserve"> / </w:t>
+      </w:r>
       <w:r>
         <w:rPr>
           <w:b/>
           <w:bCs/>
           <w:color w:val="222222"/>
         </w:rPr>
-        <w:t xml:space="preserve">Abschlussveranstaltung: </w:t>
-      </w:r>
-      <w:r>
-        <w:rPr>
-          <w:color w:val="222222"/>
-        </w:rPr>
-        <w:t>Dezember 2026</w:t>
-      </w:r>
-    </w:p>
-    <w:p>
-      <w:pPr>
-        <w:pStyle w:val="berschrift2"/>
-      </w:pPr>
-      <w:r>
-        <w:t>Rolle der Website im Gesamtprojekt</w:t>
-      </w:r>
-    </w:p>
-    <w:p>
-      <w:pPr>
-        <w:spacing w:after="160"/>
-      </w:pPr>
-      <w:r>
-        <w:rPr>
-          <w:color w:val="222222"/>
-        </w:rPr>
-        <w:t>Die Website wird 2026 klar als Projektplattform aufgebaut – aber strukturell so vorbereitet, dass sie 2027 sauber zur Trägerplattform wachsen kann.</w:t>
-      </w:r>
-    </w:p>
-    <w:p>
-      <w:pPr>
-        <w:pStyle w:val="berschrift3"/>
-      </w:pPr>
-      <w:r>
-        <w:t>Strategische Lösung: Domain-Struktur</w:t>
-      </w:r>
-    </w:p>
-    <w:p>
-      <w:pPr>
-        <w:spacing w:after="160"/>
-      </w:pPr>
-      <w:r>
-        <w:rPr>
-          <w:b/>
-          <w:bCs/>
-          <w:color w:val="222222"/>
-        </w:rPr>
-        <w:t>mavka.berlin</w:t>
-      </w:r>
-      <w:r>
-        <w:rPr>
-          <w:color w:val="222222"/>
-        </w:rPr>
-        <w:t xml:space="preserve"> / </w:t>
-      </w:r>
-      <w:r>
-        <w:rPr>
-          <w:b/>
-          <w:bCs/>
-          <w:color w:val="222222"/>
-        </w:rPr>
         <w:t>gemeinsam-kochen</w:t>
       </w:r>
     </w:p>
@@ -1408,6 +1323,14 @@
         </w:rPr>
         <w:t>Sprache (DE | EN)</w:t>
       </w:r>
+      <w:ins w:id="310" w:author="Claude" w:date="2026-04-01T00:00:00Z">
+        <w:r>
+          <w:rPr>
+            <w:color w:val="222222"/>
+          </w:rPr>
+          <w:t xml:space="preserve"> – URL-Struktur: /de/, /en/ (erweiterbar)</w:t>
+        </w:r>
+      </w:ins>
     </w:p>
     <w:p>
       <w:pPr>
@@ -2606,19 +2529,22 @@
         </w:numPr>
         <w:spacing w:after="80"/>
       </w:pPr>
-      <w:r>
-        <w:rPr>
-          <w:color w:val="222222"/>
-        </w:rPr>
-        <w:t>Newsletterfunktion – externer DSGVO-konformer Anbieter (z. B. CleverReach oder Brevo), Double-Opt-In, einfache Segmentierung, Start: 4–6 Newsletter pro Jahr</w:t>
-      </w:r>
-      <w:r>
-        <w:rPr>
-          <w:b/>
-          <w:color w:val="222222"/>
-        </w:rPr>
-        <w:t xml:space="preserve"> – Aktualisierung: Hostinger Reach statt CleverReach/Brevo.</w:t>
-      </w:r>
+      <w:del w:id="306" w:author="Claude" w:date="2026-04-01T00:00:00Z">
+        <w:r>
+          <w:rPr>
+            <w:color w:val="222222"/>
+          </w:rPr>
+          <w:delText>Newsletterfunktion – externer DSGVO-konformer Anbieter (z. B. CleverReach oder Brevo), Double-Opt-In, einfache Segmentierung, Start: 4–6 Newsletter pro Jahr – Aktualisierung: Hostinger Reach statt CleverReach/Brevo.</w:delText>
+        </w:r>
+      </w:del>
+      <w:ins w:id="307" w:author="Claude" w:date="2026-04-01T00:00:00Z">
+        <w:r>
+          <w:rPr>
+            <w:color w:val="222222"/>
+          </w:rPr>
+          <w:t>Newsletterfunktion – Hostinger Reach, Double-Opt-In, einfache Segmentierung, Start: 4–6 Newsletter pro Jahr</w:t>
+        </w:r>
+      </w:ins>
     </w:p>
     <w:p>
       <w:pPr>
@@ -3142,7 +3068,7 @@
         <w:rPr>
           <w:color w:val="222222"/>
         </w:rPr>
-        <w:t>Keine bewegten Animationen</w:t>
+        <w:t>bewegte Animationen abschaltbar</w:t>
       </w:r>
     </w:p>
     <w:p>
@@ -3192,6 +3118,42 @@
         </w:rPr>
         <w:t>Klare Wegbeschreibung zu Veranstaltungsorten</w:t>
       </w:r>
+    </w:p>
+    <w:p>
+      <w:pPr>
+        <w:pStyle w:val="Listenabsatz"/>
+        <w:numPr>
+          <w:ilvl w:val="0"/>
+          <w:numId w:val="3"/>
+        </w:numPr>
+        <w:spacing w:after="80"/>
+      </w:pPr>
+      <w:ins w:id="311" w:author="Claude" w:date="2026-04-01T00:00:00Z">
+        <w:r>
+          <w:rPr>
+            <w:color w:val="222222"/>
+          </w:rPr>
+          <w:t xml:space="preserve">Schnelle Ladezeiten – viele Besucher kommen über mobile Netze</w:t>
+        </w:r>
+      </w:ins>
+    </w:p>
+    <w:p>
+      <w:pPr>
+        <w:pStyle w:val="Listenabsatz"/>
+        <w:numPr>
+          <w:ilvl w:val="0"/>
+          <w:numId w:val="3"/>
+        </w:numPr>
+        <w:spacing w:after="80"/>
+      </w:pPr>
+      <w:ins w:id="312" w:author="Claude" w:date="2026-04-01T00:00:00Z">
+        <w:r>
+          <w:rPr>
+            <w:color w:val="222222"/>
+          </w:rPr>
+          <w:t xml:space="preserve">Sprachumschalter: sichtbar im Header, Text + Flagge, DE | EN</w:t>
+        </w:r>
+      </w:ins>
     </w:p>
     <w:p>
       <w:pPr>
@@ -3222,7 +3184,26 @@
           <w:bCs/>
           <w:color w:val="222222"/>
         </w:rPr>
-        <w:t xml:space="preserve">Phase 1 (kein Fotomaterial vorhanden): </w:t>
+        <w:del w:id="304" w:author="Claude" w:date="2026-04-01T00:00:00Z">
+          <w:r>
+            <w:rPr>
+              <w:b/>
+              <w:bCs/>
+              <w:color w:val="222222"/>
+            </w:rPr>
+            <w:delText xml:space="preserve">Phase 1 (kein Fotomaterial vorhanden): </w:delText>
+          </w:r>
+        </w:del>
+        <w:ins w:id="305" w:author="Claude" w:date="2026-04-01T00:00:00Z">
+          <w:r>
+            <w:rPr>
+              <w:b/>
+              <w:bCs/>
+              <w:color w:val="222222"/>
+            </w:rPr>
+            <w:t xml:space="preserve">Phase 1 (Fotomaterial vorhanden): </w:t>
+          </w:r>
+        </w:ins>
       </w:r>
       <w:del w:id="2" w:author="Claude" w:date="2026-04-01T00:00:00Z">
         <w:r>
@@ -3297,7 +3278,7 @@
       <w:pPr>
         <w:spacing w:after="160"/>
       </w:pPr>
-      <w:del w:id="200" w:author="Claude" w:date="2026-04-01T00:00:00Z">
+      <w:del w:id="3" w:author="Claude" w:date="2026-04-01T00:00:00Z">
         <w:r>
           <w:rPr>
             <w:color w:val="222222"/>
@@ -3305,42 +3286,37 @@
           <w:delText>Farbtabelle, Typografie und Design Tokens waren hier definiert.</w:delText>
         </w:r>
       </w:del>
-      <w:ins w:id="201" w:author="Claude" w:date="2026-04-01T00:00:00Z">
-        <w:r>
-          <w:rPr>
-            <w:color w:val="222222"/>
-          </w:rPr>
-          <w:t>Farben, Typografie und alle konkreten Farbwerte: siehe brand-identity-mavka.html (autoritativ) und design-system.html. Das Konzept definiert keine eigenen Token-Werte, um Doppelpflege und Widersprüche zu vermeiden.</w:t>
-        </w:r>
-      </w:ins>
+      <w:r>
+        <w:rPr>
+          <w:color w:val="222222"/>
+        </w:rPr>
+        <w:t>Farben, Typografie und alle konkreten Farbwerte: siehe brand-identity-mavka.html (autoritativ) und design-system.html. Das Konzept definiert keine eigenen Token-Werte, um Doppelpflege und Widersprüche zu vermeiden.</w:t>
+      </w:r>
     </w:p>
     <w:p>
       <w:pPr>
         <w:spacing w:after="160"/>
       </w:pPr>
-      <w:ins w:id="202" w:author="Claude" w:date="2026-04-01T00:00:00Z">
-        <w:r>
-          <w:rPr>
-            <w:color w:val="222222"/>
-          </w:rPr>
-          <w:t>Wirkung: Ruhig, vertrauensvoll, erdend, senior*innenfreundlich, gemeinwohlorientiert und nicht kommerziell.</w:t>
-        </w:r>
-      </w:ins>
+      <w:r>
+        <w:rPr>
+          <w:color w:val="222222"/>
+        </w:rPr>
+        <w:lastRenderedPageBreak/>
+        <w:t>Wirkung: Ruhig, vertrauensvoll, erdend, senior*innenfreundlich, gemeinwohlorientiert und nicht kommerziell.</w:t>
+      </w:r>
     </w:p>
     <w:p>
       <w:pPr>
         <w:spacing w:after="160"/>
       </w:pPr>
-      <w:ins w:id="203" w:author="Claude" w:date="2026-04-01T00:00:00Z">
-        <w:r>
-          <w:rPr>
-            <w:b/>
-            <w:bCs/>
-            <w:color w:val="222222"/>
-          </w:rPr>
-          <w:t>WICHTIG: Darauf achten, dass keine Monotonie in der Farbwelt aufkommt.</w:t>
-        </w:r>
-      </w:ins>
+      <w:r>
+        <w:rPr>
+          <w:b/>
+          <w:bCs/>
+          <w:color w:val="222222"/>
+        </w:rPr>
+        <w:t>WICHTIG: Darauf achten, dass keine Monotonie in der Farbwelt aufkommt.</w:t>
+      </w:r>
     </w:p>
     <w:p>
       <w:r>
@@ -5184,7 +5160,7 @@
       <w:pPr>
         <w:spacing w:after="160"/>
       </w:pPr>
-      <w:del w:id="204" w:author="Claude" w:date="2026-04-01T00:00:00Z">
+      <w:del w:id="4" w:author="Claude" w:date="2026-04-01T00:00:00Z">
         <w:r>
           <w:rPr>
             <w:color w:val="222222"/>
@@ -5192,75 +5168,125 @@
           <w:delText>Farben-, Typografie-, Abstände- und Layout-Tabellen waren hier definiert.</w:delText>
         </w:r>
       </w:del>
-      <w:ins w:id="205" w:author="Claude" w:date="2026-04-01T00:00:00Z">
+      <w:r>
+        <w:rPr>
+          <w:color w:val="222222"/>
+        </w:rPr>
+        <w:t>Alle Design Tokens (Farben, Typografie, Abstände, Radii, Shadows, Layout-Grid) sind verbindlich in folgenden Dokumenten definiert:</w:t>
+      </w:r>
+    </w:p>
+    <w:p>
+      <w:pPr>
+        <w:pStyle w:val="Listenabsatz"/>
+        <w:numPr>
+          <w:ilvl w:val="0"/>
+          <w:numId w:val="3"/>
+        </w:numPr>
+        <w:spacing w:after="80"/>
+      </w:pPr>
+      <w:r>
+        <w:rPr>
+          <w:b/>
+          <w:color w:val="222222"/>
+        </w:rPr>
+        <w:t xml:space="preserve">brand-identity-mavka.html </w:t>
+      </w:r>
+      <w:r>
+        <w:rPr>
+          <w:color w:val="222222"/>
+        </w:rPr>
+        <w:t>(autoritativ) – Farbpalette, Typografie, Logo-System, Markensprache</w:t>
+      </w:r>
+    </w:p>
+    <w:p>
+      <w:pPr>
+        <w:pStyle w:val="Listenabsatz"/>
+        <w:numPr>
+          <w:ilvl w:val="0"/>
+          <w:numId w:val="3"/>
+        </w:numPr>
+        <w:spacing w:after="80"/>
+      </w:pPr>
+      <w:r>
+        <w:rPr>
+          <w:b/>
+          <w:color w:val="222222"/>
+        </w:rPr>
+        <w:t xml:space="preserve">design-system.html </w:t>
+      </w:r>
+      <w:r>
+        <w:rPr>
+          <w:color w:val="222222"/>
+        </w:rPr>
+        <w:t>– CSS Custom Properties, Spacing-Skala, Radii, Shadows, Grid-System, Transitions</w:t>
+      </w:r>
+    </w:p>
+    <w:p>
+      <w:pPr>
+        <w:spacing w:after="160"/>
+      </w:pPr>
+      <w:r>
+        <w:rPr>
+          <w:color w:val="222222"/>
+        </w:rPr>
+        <w:t>Dieses Konzept definiert keine eigenen Token-Werte, um Widersprüche zwischen Dokumenten zu vermeiden. Bei Änderungen an Tokens sind ausschließlich die oben genannten Quellen zu aktualisieren.</w:t>
+      </w:r>
+    </w:p>
+    <w:p>
+      <w:pPr>
+        <w:pStyle w:val="berschrift2"/>
+      </w:pPr>
+      <w:r>
+        <w:t>Kernkomponenten</w:t>
+      </w:r>
+    </w:p>
+    <w:p>
+      <w:pPr>
+        <w:spacing w:after="160"/>
+      </w:pPr>
+      <w:del w:id="313" w:author="Claude" w:date="2026-04-01T00:00:00Z">
         <w:r>
           <w:rPr>
             <w:color w:val="222222"/>
           </w:rPr>
-          <w:t>Alle Design Tokens (Farben, Typografie, Abstände, Radii, Shadows, Layout-Grid) sind verbindlich in folgenden Dokumenten definiert:</w:t>
+          <w:delText>Komponenten-Tabelle war hier definiert.</w:delText>
         </w:r>
-      </w:ins>
-    </w:p>
-    <w:p>
-      <w:pPr>
-        <w:pStyle w:val="Listenabsatz"/>
-        <w:numPr>
-          <w:ilvl w:val="0"/>
-          <w:numId w:val="3"/>
-        </w:numPr>
-        <w:spacing w:after="80"/>
-      </w:pPr>
-      <w:ins w:id="206" w:author="Claude" w:date="2026-04-01T00:00:00Z">
-        <w:r>
-          <w:rPr>
-            <w:b/>
-            <w:color w:val="222222"/>
-          </w:rPr>
-          <w:t xml:space="preserve">brand-identity-mavka.html </w:t>
-        </w:r>
+      </w:del>
+      <w:ins w:id="314" w:author="Claude" w:date="2026-04-01T00:00:00Z">
         <w:r>
           <w:rPr>
             <w:color w:val="222222"/>
           </w:rPr>
-          <w:t>(autoritativ) – Farbpalette, Typografie, Logo-System, Markensprache</w:t>
+          <w:t>Komponentenspezifikationen (Button, Card, Termin-Karte, Hero, Info-Box, Form Field, Download-Liste, Mobile-Nav) sind in UI-Spezifikation_Gemeinsam-Kochen.html und design-system.html definiert.</w:t>
         </w:r>
       </w:ins>
     </w:p>
     <w:p>
       <w:pPr>
-        <w:pStyle w:val="Listenabsatz"/>
-        <w:numPr>
-          <w:ilvl w:val="0"/>
-          <w:numId w:val="3"/>
-        </w:numPr>
-        <w:spacing w:after="80"/>
-      </w:pPr>
-      <w:ins w:id="207" w:author="Claude" w:date="2026-04-01T00:00:00Z">
-        <w:r>
-          <w:rPr>
-            <w:b/>
-            <w:color w:val="222222"/>
-          </w:rPr>
-          <w:t xml:space="preserve">design-system.html </w:t>
-        </w:r>
+        <w:pStyle w:val="berschrift2"/>
+      </w:pPr>
+      <w:r>
+        <w:t>Barrierearme Systemregeln</w:t>
+      </w:r>
+    </w:p>
+    <w:p>
+      <w:pPr>
+        <w:spacing w:after="160"/>
+      </w:pPr>
+      <w:del w:id="315" w:author="Claude" w:date="2026-04-01T00:00:00Z">
         <w:r>
           <w:rPr>
             <w:color w:val="222222"/>
           </w:rPr>
-          <w:t>– CSS Custom Properties, Spacing-Skala, Radii, Shadows, Grid-System, Transitions</w:t>
+          <w:delText>Detaillierte Barrierefreiheitsregeln waren hier aufgelistet.</w:delText>
         </w:r>
-      </w:ins>
-    </w:p>
-    <w:p>
-      <w:pPr>
-        <w:spacing w:after="160"/>
-      </w:pPr>
-      <w:ins w:id="208" w:author="Claude" w:date="2026-04-01T00:00:00Z">
+      </w:del>
+      <w:ins w:id="316" w:author="Claude" w:date="2026-04-01T00:00:00Z">
         <w:r>
           <w:rPr>
             <w:color w:val="222222"/>
           </w:rPr>
-          <w:t>Dieses Konzept definiert keine eigenen Token-Werte, um Widersprüche zwischen Dokumenten zu vermeiden. Bei Änderungen an Tokens sind ausschließlich die oben genannten Quellen zu aktualisieren.</w:t>
+          <w:t>WCAG 2.1 AA Mindeststandard. Detaillierte Regeln in design-system.html. Senior*innen-UX: siehe §9.</w:t>
         </w:r>
       </w:ins>
     </w:p>
@@ -5269,1157 +5295,29 @@
         <w:pStyle w:val="berschrift2"/>
       </w:pPr>
       <w:r>
-        <w:t>Kernkomponenten</w:t>
-      </w:r>
-    </w:p>
-    <w:tbl>
-      <w:tblPr>
-        <w:tblW w:w="9026" w:type="dxa"/>
-        <w:tblBorders>
-          <w:top w:val="single" w:sz="4" w:space="0" w:color="auto"/>
-          <w:left w:val="single" w:sz="4" w:space="0" w:color="auto"/>
-          <w:bottom w:val="single" w:sz="4" w:space="0" w:color="auto"/>
-          <w:right w:val="single" w:sz="4" w:space="0" w:color="auto"/>
-          <w:insideH w:val="single" w:sz="4" w:space="0" w:color="auto"/>
-          <w:insideV w:val="single" w:sz="4" w:space="0" w:color="auto"/>
-        </w:tblBorders>
-        <w:tblCellMar>
-          <w:left w:w="10" w:type="dxa"/>
-          <w:right w:w="10" w:type="dxa"/>
-        </w:tblCellMar>
-        <w:tblLook w:val="04A0" w:firstRow="1" w:lastRow="0" w:firstColumn="1" w:lastColumn="0" w:noHBand="0" w:noVBand="1"/>
-      </w:tblPr>
-      <w:tblGrid>
-        <w:gridCol w:w="2619"/>
-        <w:gridCol w:w="3154"/>
-        <w:gridCol w:w="3253"/>
-      </w:tblGrid>
-      <w:tr>
-        <w:tc>
-          <w:tcPr>
-            <w:tcW w:w="2200" w:type="dxa"/>
-            <w:tcBorders>
-              <w:top w:val="single" w:sz="1" w:space="0" w:color="D9D9D9"/>
-              <w:left w:val="single" w:sz="1" w:space="0" w:color="D9D9D9"/>
-              <w:bottom w:val="single" w:sz="1" w:space="0" w:color="D9D9D9"/>
-              <w:right w:val="single" w:sz="1" w:space="0" w:color="D9D9D9"/>
-            </w:tcBorders>
-            <w:shd w:val="clear" w:color="auto" w:fill="1F4D3A"/>
-            <w:tcMar>
-              <w:top w:w="60" w:type="dxa"/>
-              <w:left w:w="100" w:type="dxa"/>
-              <w:bottom w:w="60" w:type="dxa"/>
-              <w:right w:w="100" w:type="dxa"/>
-            </w:tcMar>
-            <w:vAlign w:val="center"/>
-          </w:tcPr>
-          <w:p>
-            <w:r>
-              <w:rPr>
-                <w:b/>
-                <w:bCs/>
-                <w:color w:val="FFFFFF"/>
-                <w:sz w:val="20"/>
-                <w:szCs w:val="20"/>
-              </w:rPr>
-              <w:t>Komponente</w:t>
-            </w:r>
-          </w:p>
-        </w:tc>
-        <w:tc>
-          <w:tcPr>
-            <w:tcW w:w="3400" w:type="dxa"/>
-            <w:tcBorders>
-              <w:top w:val="single" w:sz="1" w:space="0" w:color="D9D9D9"/>
-              <w:left w:val="single" w:sz="1" w:space="0" w:color="D9D9D9"/>
-              <w:bottom w:val="single" w:sz="1" w:space="0" w:color="D9D9D9"/>
-              <w:right w:val="single" w:sz="1" w:space="0" w:color="D9D9D9"/>
-            </w:tcBorders>
-            <w:shd w:val="clear" w:color="auto" w:fill="1F4D3A"/>
-            <w:tcMar>
-              <w:top w:w="60" w:type="dxa"/>
-              <w:left w:w="100" w:type="dxa"/>
-              <w:bottom w:w="60" w:type="dxa"/>
-              <w:right w:w="100" w:type="dxa"/>
-            </w:tcMar>
-            <w:vAlign w:val="center"/>
-          </w:tcPr>
-          <w:p>
-            <w:r>
-              <w:rPr>
-                <w:b/>
-                <w:bCs/>
-                <w:color w:val="FFFFFF"/>
-                <w:sz w:val="20"/>
-                <w:szCs w:val="20"/>
-              </w:rPr>
-              <w:t>Varianten</w:t>
-            </w:r>
-          </w:p>
-        </w:tc>
-        <w:tc>
-          <w:tcPr>
-            <w:tcW w:w="3426" w:type="dxa"/>
-            <w:tcBorders>
-              <w:top w:val="single" w:sz="1" w:space="0" w:color="D9D9D9"/>
-              <w:left w:val="single" w:sz="1" w:space="0" w:color="D9D9D9"/>
-              <w:bottom w:val="single" w:sz="1" w:space="0" w:color="D9D9D9"/>
-              <w:right w:val="single" w:sz="1" w:space="0" w:color="D9D9D9"/>
-            </w:tcBorders>
-            <w:shd w:val="clear" w:color="auto" w:fill="1F4D3A"/>
-            <w:tcMar>
-              <w:top w:w="60" w:type="dxa"/>
-              <w:left w:w="100" w:type="dxa"/>
-              <w:bottom w:w="60" w:type="dxa"/>
-              <w:right w:w="100" w:type="dxa"/>
-            </w:tcMar>
-            <w:vAlign w:val="center"/>
-          </w:tcPr>
-          <w:p>
-            <w:r>
-              <w:rPr>
-                <w:b/>
-                <w:bCs/>
-                <w:color w:val="FFFFFF"/>
-                <w:sz w:val="20"/>
-                <w:szCs w:val="20"/>
-              </w:rPr>
-              <w:t>Hinweise</w:t>
-            </w:r>
-          </w:p>
-        </w:tc>
-      </w:tr>
-      <w:tr>
-        <w:tc>
-          <w:tcPr>
-            <w:tcW w:w="2200" w:type="dxa"/>
-            <w:tcBorders>
-              <w:top w:val="single" w:sz="1" w:space="0" w:color="D9D9D9"/>
-              <w:left w:val="single" w:sz="1" w:space="0" w:color="D9D9D9"/>
-              <w:bottom w:val="single" w:sz="1" w:space="0" w:color="D9D9D9"/>
-              <w:right w:val="single" w:sz="1" w:space="0" w:color="D9D9D9"/>
-            </w:tcBorders>
-            <w:tcMar>
-              <w:top w:w="60" w:type="dxa"/>
-              <w:left w:w="100" w:type="dxa"/>
-              <w:bottom w:w="60" w:type="dxa"/>
-              <w:right w:w="100" w:type="dxa"/>
-            </w:tcMar>
-          </w:tcPr>
-          <w:p>
-            <w:r>
-              <w:rPr>
-                <w:b/>
-                <w:bCs/>
-                <w:color w:val="222222"/>
-                <w:sz w:val="20"/>
-                <w:szCs w:val="20"/>
-              </w:rPr>
-              <w:t>Button</w:t>
-            </w:r>
-          </w:p>
-        </w:tc>
-        <w:tc>
-          <w:tcPr>
-            <w:tcW w:w="3400" w:type="dxa"/>
-            <w:tcBorders>
-              <w:top w:val="single" w:sz="1" w:space="0" w:color="D9D9D9"/>
-              <w:left w:val="single" w:sz="1" w:space="0" w:color="D9D9D9"/>
-              <w:bottom w:val="single" w:sz="1" w:space="0" w:color="D9D9D9"/>
-              <w:right w:val="single" w:sz="1" w:space="0" w:color="D9D9D9"/>
-            </w:tcBorders>
-            <w:tcMar>
-              <w:top w:w="60" w:type="dxa"/>
-              <w:left w:w="100" w:type="dxa"/>
-              <w:bottom w:w="60" w:type="dxa"/>
-              <w:right w:w="100" w:type="dxa"/>
-            </w:tcMar>
-          </w:tcPr>
-          <w:p>
-            <w:r>
-              <w:rPr>
-                <w:color w:val="222222"/>
-                <w:sz w:val="20"/>
-                <w:szCs w:val="20"/>
-              </w:rPr>
-              <w:t>Primary, Secondary, Text-Link</w:t>
-            </w:r>
-          </w:p>
-        </w:tc>
-        <w:tc>
-          <w:tcPr>
-            <w:tcW w:w="3426" w:type="dxa"/>
-            <w:tcBorders>
-              <w:top w:val="single" w:sz="1" w:space="0" w:color="D9D9D9"/>
-              <w:left w:val="single" w:sz="1" w:space="0" w:color="D9D9D9"/>
-              <w:bottom w:val="single" w:sz="1" w:space="0" w:color="D9D9D9"/>
-              <w:right w:val="single" w:sz="1" w:space="0" w:color="D9D9D9"/>
-            </w:tcBorders>
-            <w:tcMar>
-              <w:top w:w="60" w:type="dxa"/>
-              <w:left w:w="100" w:type="dxa"/>
-              <w:bottom w:w="60" w:type="dxa"/>
-              <w:right w:w="100" w:type="dxa"/>
-            </w:tcMar>
-          </w:tcPr>
-          <w:p>
-            <w:r>
-              <w:rPr>
-                <w:color w:val="222222"/>
-                <w:sz w:val="20"/>
-                <w:szCs w:val="20"/>
-              </w:rPr>
-              <w:t>States: default, hover, focus (sichtbar!), disabled. Immer klar benennen.</w:t>
-            </w:r>
-          </w:p>
-        </w:tc>
-      </w:tr>
-      <w:tr>
-        <w:tc>
-          <w:tcPr>
-            <w:tcW w:w="2200" w:type="dxa"/>
-            <w:tcBorders>
-              <w:top w:val="single" w:sz="1" w:space="0" w:color="D9D9D9"/>
-              <w:left w:val="single" w:sz="1" w:space="0" w:color="D9D9D9"/>
-              <w:bottom w:val="single" w:sz="1" w:space="0" w:color="D9D9D9"/>
-              <w:right w:val="single" w:sz="1" w:space="0" w:color="D9D9D9"/>
-            </w:tcBorders>
-            <w:shd w:val="clear" w:color="auto" w:fill="F7F5EF"/>
-            <w:tcMar>
-              <w:top w:w="60" w:type="dxa"/>
-              <w:left w:w="100" w:type="dxa"/>
-              <w:bottom w:w="60" w:type="dxa"/>
-              <w:right w:w="100" w:type="dxa"/>
-            </w:tcMar>
-          </w:tcPr>
-          <w:p>
-            <w:r>
-              <w:rPr>
-                <w:b/>
-                <w:bCs/>
-                <w:color w:val="222222"/>
-                <w:sz w:val="20"/>
-                <w:szCs w:val="20"/>
-              </w:rPr>
-              <w:t>Card</w:t>
-            </w:r>
-          </w:p>
-        </w:tc>
-        <w:tc>
-          <w:tcPr>
-            <w:tcW w:w="3400" w:type="dxa"/>
-            <w:tcBorders>
-              <w:top w:val="single" w:sz="1" w:space="0" w:color="D9D9D9"/>
-              <w:left w:val="single" w:sz="1" w:space="0" w:color="D9D9D9"/>
-              <w:bottom w:val="single" w:sz="1" w:space="0" w:color="D9D9D9"/>
-              <w:right w:val="single" w:sz="1" w:space="0" w:color="D9D9D9"/>
-            </w:tcBorders>
-            <w:shd w:val="clear" w:color="auto" w:fill="F7F5EF"/>
-            <w:tcMar>
-              <w:top w:w="60" w:type="dxa"/>
-              <w:left w:w="100" w:type="dxa"/>
-              <w:bottom w:w="60" w:type="dxa"/>
-              <w:right w:w="100" w:type="dxa"/>
-            </w:tcMar>
-          </w:tcPr>
-          <w:p>
-            <w:r>
-              <w:rPr>
-                <w:color w:val="222222"/>
-                <w:sz w:val="20"/>
-                <w:szCs w:val="20"/>
-              </w:rPr>
-              <w:t>default, compact, highlight</w:t>
-            </w:r>
-          </w:p>
-        </w:tc>
-        <w:tc>
-          <w:tcPr>
-            <w:tcW w:w="3426" w:type="dxa"/>
-            <w:tcBorders>
-              <w:top w:val="single" w:sz="1" w:space="0" w:color="D9D9D9"/>
-              <w:left w:val="single" w:sz="1" w:space="0" w:color="D9D9D9"/>
-              <w:bottom w:val="single" w:sz="1" w:space="0" w:color="D9D9D9"/>
-              <w:right w:val="single" w:sz="1" w:space="0" w:color="D9D9D9"/>
-            </w:tcBorders>
-            <w:shd w:val="clear" w:color="auto" w:fill="F7F5EF"/>
-            <w:tcMar>
-              <w:top w:w="60" w:type="dxa"/>
-              <w:left w:w="100" w:type="dxa"/>
-              <w:bottom w:w="60" w:type="dxa"/>
-              <w:right w:w="100" w:type="dxa"/>
-            </w:tcMar>
-          </w:tcPr>
-          <w:p>
-            <w:r>
-              <w:rPr>
-                <w:color w:val="222222"/>
-                <w:sz w:val="20"/>
-                <w:szCs w:val="20"/>
-              </w:rPr>
-              <w:t>Für Workshops, News, Dokumente. Weißer Hintergrund, 8px Radius.</w:t>
-            </w:r>
-          </w:p>
-        </w:tc>
-      </w:tr>
-      <w:tr>
-        <w:tc>
-          <w:tcPr>
-            <w:tcW w:w="2200" w:type="dxa"/>
-            <w:tcBorders>
-              <w:top w:val="single" w:sz="1" w:space="0" w:color="D9D9D9"/>
-              <w:left w:val="single" w:sz="1" w:space="0" w:color="D9D9D9"/>
-              <w:bottom w:val="single" w:sz="1" w:space="0" w:color="D9D9D9"/>
-              <w:right w:val="single" w:sz="1" w:space="0" w:color="D9D9D9"/>
-            </w:tcBorders>
-            <w:tcMar>
-              <w:top w:w="60" w:type="dxa"/>
-              <w:left w:w="100" w:type="dxa"/>
-              <w:bottom w:w="60" w:type="dxa"/>
-              <w:right w:w="100" w:type="dxa"/>
-            </w:tcMar>
-          </w:tcPr>
-          <w:p>
-            <w:r>
-              <w:rPr>
-                <w:b/>
-                <w:bCs/>
-                <w:color w:val="222222"/>
-                <w:sz w:val="20"/>
-                <w:szCs w:val="20"/>
-              </w:rPr>
-              <w:t>Termin-Karte</w:t>
-            </w:r>
-          </w:p>
-        </w:tc>
-        <w:tc>
-          <w:tcPr>
-            <w:tcW w:w="3400" w:type="dxa"/>
-            <w:tcBorders>
-              <w:top w:val="single" w:sz="1" w:space="0" w:color="D9D9D9"/>
-              <w:left w:val="single" w:sz="1" w:space="0" w:color="D9D9D9"/>
-              <w:bottom w:val="single" w:sz="1" w:space="0" w:color="D9D9D9"/>
-              <w:right w:val="single" w:sz="1" w:space="0" w:color="D9D9D9"/>
-            </w:tcBorders>
-            <w:tcMar>
-              <w:top w:w="60" w:type="dxa"/>
-              <w:left w:w="100" w:type="dxa"/>
-              <w:bottom w:w="60" w:type="dxa"/>
-              <w:right w:w="100" w:type="dxa"/>
-            </w:tcMar>
-          </w:tcPr>
-          <w:p>
-            <w:r>
-              <w:rPr>
-                <w:color w:val="222222"/>
-                <w:sz w:val="20"/>
-                <w:szCs w:val="20"/>
-              </w:rPr>
-              <w:t>kommend, abgeschlossen</w:t>
-            </w:r>
-          </w:p>
-        </w:tc>
-        <w:tc>
-          <w:tcPr>
-            <w:tcW w:w="3426" w:type="dxa"/>
-            <w:tcBorders>
-              <w:top w:val="single" w:sz="1" w:space="0" w:color="D9D9D9"/>
-              <w:left w:val="single" w:sz="1" w:space="0" w:color="D9D9D9"/>
-              <w:bottom w:val="single" w:sz="1" w:space="0" w:color="D9D9D9"/>
-              <w:right w:val="single" w:sz="1" w:space="0" w:color="D9D9D9"/>
-            </w:tcBorders>
-            <w:tcMar>
-              <w:top w:w="60" w:type="dxa"/>
-              <w:left w:w="100" w:type="dxa"/>
-              <w:bottom w:w="60" w:type="dxa"/>
-              <w:right w:w="100" w:type="dxa"/>
-            </w:tcMar>
-          </w:tcPr>
-          <w:p>
-            <w:r>
-              <w:rPr>
-                <w:color w:val="222222"/>
-                <w:sz w:val="20"/>
-                <w:szCs w:val="20"/>
-              </w:rPr>
-              <w:t>Props: date, time, location, availability, status.</w:t>
-            </w:r>
-          </w:p>
-        </w:tc>
-      </w:tr>
-      <w:tr>
-        <w:tc>
-          <w:tcPr>
-            <w:tcW w:w="2200" w:type="dxa"/>
-            <w:tcBorders>
-              <w:top w:val="single" w:sz="1" w:space="0" w:color="D9D9D9"/>
-              <w:left w:val="single" w:sz="1" w:space="0" w:color="D9D9D9"/>
-              <w:bottom w:val="single" w:sz="1" w:space="0" w:color="D9D9D9"/>
-              <w:right w:val="single" w:sz="1" w:space="0" w:color="D9D9D9"/>
-            </w:tcBorders>
-            <w:shd w:val="clear" w:color="auto" w:fill="F7F5EF"/>
-            <w:tcMar>
-              <w:top w:w="60" w:type="dxa"/>
-              <w:left w:w="100" w:type="dxa"/>
-              <w:bottom w:w="60" w:type="dxa"/>
-              <w:right w:w="100" w:type="dxa"/>
-            </w:tcMar>
-          </w:tcPr>
-          <w:p>
-            <w:r>
-              <w:rPr>
-                <w:b/>
-                <w:bCs/>
-                <w:color w:val="222222"/>
-                <w:sz w:val="20"/>
-                <w:szCs w:val="20"/>
-              </w:rPr>
-              <w:t>Hero Block</w:t>
-            </w:r>
-          </w:p>
-        </w:tc>
-        <w:tc>
-          <w:tcPr>
-            <w:tcW w:w="3400" w:type="dxa"/>
-            <w:tcBorders>
-              <w:top w:val="single" w:sz="1" w:space="0" w:color="D9D9D9"/>
-              <w:left w:val="single" w:sz="1" w:space="0" w:color="D9D9D9"/>
-              <w:bottom w:val="single" w:sz="1" w:space="0" w:color="D9D9D9"/>
-              <w:right w:val="single" w:sz="1" w:space="0" w:color="D9D9D9"/>
-            </w:tcBorders>
-            <w:shd w:val="clear" w:color="auto" w:fill="F7F5EF"/>
-            <w:tcMar>
-              <w:top w:w="60" w:type="dxa"/>
-              <w:left w:w="100" w:type="dxa"/>
-              <w:bottom w:w="60" w:type="dxa"/>
-              <w:right w:w="100" w:type="dxa"/>
-            </w:tcMar>
-          </w:tcPr>
-          <w:p>
-            <w:r>
-              <w:rPr>
-                <w:color w:val="222222"/>
-                <w:sz w:val="20"/>
-                <w:szCs w:val="20"/>
-              </w:rPr>
-              <w:t>default, compact (Unterseiten)</w:t>
-            </w:r>
-          </w:p>
-        </w:tc>
-        <w:tc>
-          <w:tcPr>
-            <w:tcW w:w="3426" w:type="dxa"/>
-            <w:tcBorders>
-              <w:top w:val="single" w:sz="1" w:space="0" w:color="D9D9D9"/>
-              <w:left w:val="single" w:sz="1" w:space="0" w:color="D9D9D9"/>
-              <w:bottom w:val="single" w:sz="1" w:space="0" w:color="D9D9D9"/>
-              <w:right w:val="single" w:sz="1" w:space="0" w:color="D9D9D9"/>
-            </w:tcBorders>
-            <w:shd w:val="clear" w:color="auto" w:fill="F7F5EF"/>
-            <w:tcMar>
-              <w:top w:w="60" w:type="dxa"/>
-              <w:left w:w="100" w:type="dxa"/>
-              <w:bottom w:w="60" w:type="dxa"/>
-              <w:right w:w="100" w:type="dxa"/>
-            </w:tcMar>
-          </w:tcPr>
-          <w:p>
-            <w:r>
-              <w:rPr>
-                <w:color w:val="222222"/>
-                <w:sz w:val="20"/>
-                <w:szCs w:val="20"/>
-              </w:rPr>
-              <w:t>title, subtitle, description, primaryButton, secondaryButton, optionalImage.</w:t>
-            </w:r>
-          </w:p>
-        </w:tc>
-      </w:tr>
-      <w:tr>
-        <w:tc>
-          <w:tcPr>
-            <w:tcW w:w="2200" w:type="dxa"/>
-            <w:tcBorders>
-              <w:top w:val="single" w:sz="1" w:space="0" w:color="D9D9D9"/>
-              <w:left w:val="single" w:sz="1" w:space="0" w:color="D9D9D9"/>
-              <w:bottom w:val="single" w:sz="1" w:space="0" w:color="D9D9D9"/>
-              <w:right w:val="single" w:sz="1" w:space="0" w:color="D9D9D9"/>
-            </w:tcBorders>
-            <w:tcMar>
-              <w:top w:w="60" w:type="dxa"/>
-              <w:left w:w="100" w:type="dxa"/>
-              <w:bottom w:w="60" w:type="dxa"/>
-              <w:right w:w="100" w:type="dxa"/>
-            </w:tcMar>
-          </w:tcPr>
-          <w:p>
-            <w:r>
-              <w:rPr>
-                <w:b/>
-                <w:bCs/>
-                <w:color w:val="222222"/>
-                <w:sz w:val="20"/>
-                <w:szCs w:val="20"/>
-              </w:rPr>
-              <w:t>Info-Box (3er)</w:t>
-            </w:r>
-          </w:p>
-        </w:tc>
-        <w:tc>
-          <w:tcPr>
-            <w:tcW w:w="3400" w:type="dxa"/>
-            <w:tcBorders>
-              <w:top w:val="single" w:sz="1" w:space="0" w:color="D9D9D9"/>
-              <w:left w:val="single" w:sz="1" w:space="0" w:color="D9D9D9"/>
-              <w:bottom w:val="single" w:sz="1" w:space="0" w:color="D9D9D9"/>
-              <w:right w:val="single" w:sz="1" w:space="0" w:color="D9D9D9"/>
-            </w:tcBorders>
-            <w:tcMar>
-              <w:top w:w="60" w:type="dxa"/>
-              <w:left w:w="100" w:type="dxa"/>
-              <w:bottom w:w="60" w:type="dxa"/>
-              <w:right w:w="100" w:type="dxa"/>
-            </w:tcMar>
-          </w:tcPr>
-          <w:p>
-            <w:r>
-              <w:rPr>
-                <w:color w:val="222222"/>
-                <w:sz w:val="20"/>
-                <w:szCs w:val="20"/>
-              </w:rPr>
-              <w:t>Icon + Titel + Text</w:t>
-            </w:r>
-          </w:p>
-        </w:tc>
-        <w:tc>
-          <w:tcPr>
-            <w:tcW w:w="3426" w:type="dxa"/>
-            <w:tcBorders>
-              <w:top w:val="single" w:sz="1" w:space="0" w:color="D9D9D9"/>
-              <w:left w:val="single" w:sz="1" w:space="0" w:color="D9D9D9"/>
-              <w:bottom w:val="single" w:sz="1" w:space="0" w:color="D9D9D9"/>
-              <w:right w:val="single" w:sz="1" w:space="0" w:color="D9D9D9"/>
-            </w:tcBorders>
-            <w:tcMar>
-              <w:top w:w="60" w:type="dxa"/>
-              <w:left w:w="100" w:type="dxa"/>
-              <w:bottom w:w="60" w:type="dxa"/>
-              <w:right w:w="100" w:type="dxa"/>
-            </w:tcMar>
-          </w:tcPr>
-          <w:p>
-            <w:r>
-              <w:rPr>
-                <w:color w:val="222222"/>
-                <w:sz w:val="20"/>
-                <w:szCs w:val="20"/>
-              </w:rPr>
-              <w:t>Für Werte/Schwerpunkte. 3-Spalten Desktop, 1-Spalte Mobile.</w:t>
-            </w:r>
-          </w:p>
-        </w:tc>
-      </w:tr>
-      <w:tr>
-        <w:tc>
-          <w:tcPr>
-            <w:tcW w:w="2200" w:type="dxa"/>
-            <w:tcBorders>
-              <w:top w:val="single" w:sz="1" w:space="0" w:color="D9D9D9"/>
-              <w:left w:val="single" w:sz="1" w:space="0" w:color="D9D9D9"/>
-              <w:bottom w:val="single" w:sz="1" w:space="0" w:color="D9D9D9"/>
-              <w:right w:val="single" w:sz="1" w:space="0" w:color="D9D9D9"/>
-            </w:tcBorders>
-            <w:shd w:val="clear" w:color="auto" w:fill="F7F5EF"/>
-            <w:tcMar>
-              <w:top w:w="60" w:type="dxa"/>
-              <w:left w:w="100" w:type="dxa"/>
-              <w:bottom w:w="60" w:type="dxa"/>
-              <w:right w:w="100" w:type="dxa"/>
-            </w:tcMar>
-          </w:tcPr>
-          <w:p>
-            <w:r>
-              <w:rPr>
-                <w:b/>
-                <w:bCs/>
-                <w:color w:val="222222"/>
-                <w:sz w:val="20"/>
-                <w:szCs w:val="20"/>
-              </w:rPr>
-              <w:t>Form Field</w:t>
-            </w:r>
-          </w:p>
-        </w:tc>
-        <w:tc>
-          <w:tcPr>
-            <w:tcW w:w="3400" w:type="dxa"/>
-            <w:tcBorders>
-              <w:top w:val="single" w:sz="1" w:space="0" w:color="D9D9D9"/>
-              <w:left w:val="single" w:sz="1" w:space="0" w:color="D9D9D9"/>
-              <w:bottom w:val="single" w:sz="1" w:space="0" w:color="D9D9D9"/>
-              <w:right w:val="single" w:sz="1" w:space="0" w:color="D9D9D9"/>
-            </w:tcBorders>
-            <w:shd w:val="clear" w:color="auto" w:fill="F7F5EF"/>
-            <w:tcMar>
-              <w:top w:w="60" w:type="dxa"/>
-              <w:left w:w="100" w:type="dxa"/>
-              <w:bottom w:w="60" w:type="dxa"/>
-              <w:right w:w="100" w:type="dxa"/>
-            </w:tcMar>
-          </w:tcPr>
-          <w:p>
-            <w:r>
-              <w:rPr>
-                <w:color w:val="222222"/>
-                <w:sz w:val="20"/>
-                <w:szCs w:val="20"/>
-              </w:rPr>
-              <w:t>default, focus, error, success</w:t>
-            </w:r>
-          </w:p>
-        </w:tc>
-        <w:tc>
-          <w:tcPr>
-            <w:tcW w:w="3426" w:type="dxa"/>
-            <w:tcBorders>
-              <w:top w:val="single" w:sz="1" w:space="0" w:color="D9D9D9"/>
-              <w:left w:val="single" w:sz="1" w:space="0" w:color="D9D9D9"/>
-              <w:bottom w:val="single" w:sz="1" w:space="0" w:color="D9D9D9"/>
-              <w:right w:val="single" w:sz="1" w:space="0" w:color="D9D9D9"/>
-            </w:tcBorders>
-            <w:shd w:val="clear" w:color="auto" w:fill="F7F5EF"/>
-            <w:tcMar>
-              <w:top w:w="60" w:type="dxa"/>
-              <w:left w:w="100" w:type="dxa"/>
-              <w:bottom w:w="60" w:type="dxa"/>
-              <w:right w:w="100" w:type="dxa"/>
-            </w:tcMar>
-          </w:tcPr>
-          <w:p>
-            <w:r>
-              <w:rPr>
-                <w:color w:val="222222"/>
-                <w:sz w:val="20"/>
-                <w:szCs w:val="20"/>
-              </w:rPr>
-              <w:t>Label immer oberhalb. Kein Placeholder als Ersatz. Fehlermeldung unterhalb.</w:t>
-            </w:r>
-          </w:p>
-        </w:tc>
-      </w:tr>
-      <w:tr>
-        <w:tc>
-          <w:tcPr>
-            <w:tcW w:w="2200" w:type="dxa"/>
-            <w:tcBorders>
-              <w:top w:val="single" w:sz="1" w:space="0" w:color="D9D9D9"/>
-              <w:left w:val="single" w:sz="1" w:space="0" w:color="D9D9D9"/>
-              <w:bottom w:val="single" w:sz="1" w:space="0" w:color="D9D9D9"/>
-              <w:right w:val="single" w:sz="1" w:space="0" w:color="D9D9D9"/>
-            </w:tcBorders>
-            <w:tcMar>
-              <w:top w:w="60" w:type="dxa"/>
-              <w:left w:w="100" w:type="dxa"/>
-              <w:bottom w:w="60" w:type="dxa"/>
-              <w:right w:w="100" w:type="dxa"/>
-            </w:tcMar>
-          </w:tcPr>
-          <w:p>
-            <w:r>
-              <w:rPr>
-                <w:b/>
-                <w:bCs/>
-                <w:color w:val="222222"/>
-                <w:sz w:val="20"/>
-                <w:szCs w:val="20"/>
-              </w:rPr>
-              <w:t>Kennzahlen-Block</w:t>
-            </w:r>
-          </w:p>
-        </w:tc>
-        <w:tc>
-          <w:tcPr>
-            <w:tcW w:w="3400" w:type="dxa"/>
-            <w:tcBorders>
-              <w:top w:val="single" w:sz="1" w:space="0" w:color="D9D9D9"/>
-              <w:left w:val="single" w:sz="1" w:space="0" w:color="D9D9D9"/>
-              <w:bottom w:val="single" w:sz="1" w:space="0" w:color="D9D9D9"/>
-              <w:right w:val="single" w:sz="1" w:space="0" w:color="D9D9D9"/>
-            </w:tcBorders>
-            <w:tcMar>
-              <w:top w:w="60" w:type="dxa"/>
-              <w:left w:w="100" w:type="dxa"/>
-              <w:bottom w:w="60" w:type="dxa"/>
-              <w:right w:w="100" w:type="dxa"/>
-            </w:tcMar>
-          </w:tcPr>
-          <w:p>
-            <w:r>
-              <w:rPr>
-                <w:color w:val="222222"/>
-                <w:sz w:val="20"/>
-                <w:szCs w:val="20"/>
-              </w:rPr>
-              <w:t>3–4 Zahlen nebeneinander</w:t>
-            </w:r>
-          </w:p>
-        </w:tc>
-        <w:tc>
-          <w:tcPr>
-            <w:tcW w:w="3426" w:type="dxa"/>
-            <w:tcBorders>
-              <w:top w:val="single" w:sz="1" w:space="0" w:color="D9D9D9"/>
-              <w:left w:val="single" w:sz="1" w:space="0" w:color="D9D9D9"/>
-              <w:bottom w:val="single" w:sz="1" w:space="0" w:color="D9D9D9"/>
-              <w:right w:val="single" w:sz="1" w:space="0" w:color="D9D9D9"/>
-            </w:tcBorders>
-            <w:tcMar>
-              <w:top w:w="60" w:type="dxa"/>
-              <w:left w:w="100" w:type="dxa"/>
-              <w:bottom w:w="60" w:type="dxa"/>
-              <w:right w:w="100" w:type="dxa"/>
-            </w:tcMar>
-          </w:tcPr>
-          <w:p>
-            <w:r>
-              <w:rPr>
-                <w:color w:val="222222"/>
-                <w:sz w:val="20"/>
-                <w:szCs w:val="20"/>
-              </w:rPr>
-              <w:t>Große Zahl + kleine Erklärung darunter.</w:t>
-            </w:r>
-          </w:p>
-        </w:tc>
-      </w:tr>
-      <w:tr>
-        <w:tc>
-          <w:tcPr>
-            <w:tcW w:w="2200" w:type="dxa"/>
-            <w:tcBorders>
-              <w:top w:val="single" w:sz="1" w:space="0" w:color="D9D9D9"/>
-              <w:left w:val="single" w:sz="1" w:space="0" w:color="D9D9D9"/>
-              <w:bottom w:val="single" w:sz="1" w:space="0" w:color="D9D9D9"/>
-              <w:right w:val="single" w:sz="1" w:space="0" w:color="D9D9D9"/>
-            </w:tcBorders>
-            <w:shd w:val="clear" w:color="auto" w:fill="F7F5EF"/>
-            <w:tcMar>
-              <w:top w:w="60" w:type="dxa"/>
-              <w:left w:w="100" w:type="dxa"/>
-              <w:bottom w:w="60" w:type="dxa"/>
-              <w:right w:w="100" w:type="dxa"/>
-            </w:tcMar>
-          </w:tcPr>
-          <w:p>
-            <w:r>
-              <w:rPr>
-                <w:b/>
-                <w:bCs/>
-                <w:color w:val="222222"/>
-                <w:sz w:val="20"/>
-                <w:szCs w:val="20"/>
-              </w:rPr>
-              <w:t>Download-Liste</w:t>
-            </w:r>
-          </w:p>
-        </w:tc>
-        <w:tc>
-          <w:tcPr>
-            <w:tcW w:w="3400" w:type="dxa"/>
-            <w:tcBorders>
-              <w:top w:val="single" w:sz="1" w:space="0" w:color="D9D9D9"/>
-              <w:left w:val="single" w:sz="1" w:space="0" w:color="D9D9D9"/>
-              <w:bottom w:val="single" w:sz="1" w:space="0" w:color="D9D9D9"/>
-              <w:right w:val="single" w:sz="1" w:space="0" w:color="D9D9D9"/>
-            </w:tcBorders>
-            <w:shd w:val="clear" w:color="auto" w:fill="F7F5EF"/>
-            <w:tcMar>
-              <w:top w:w="60" w:type="dxa"/>
-              <w:left w:w="100" w:type="dxa"/>
-              <w:bottom w:w="60" w:type="dxa"/>
-              <w:right w:w="100" w:type="dxa"/>
-            </w:tcMar>
-          </w:tcPr>
-          <w:p>
-            <w:r>
-              <w:rPr>
-                <w:color w:val="222222"/>
-                <w:sz w:val="20"/>
-                <w:szCs w:val="20"/>
-              </w:rPr>
-              <w:t>–</w:t>
-            </w:r>
-          </w:p>
-        </w:tc>
-        <w:tc>
-          <w:tcPr>
-            <w:tcW w:w="3426" w:type="dxa"/>
-            <w:tcBorders>
-              <w:top w:val="single" w:sz="1" w:space="0" w:color="D9D9D9"/>
-              <w:left w:val="single" w:sz="1" w:space="0" w:color="D9D9D9"/>
-              <w:bottom w:val="single" w:sz="1" w:space="0" w:color="D9D9D9"/>
-              <w:right w:val="single" w:sz="1" w:space="0" w:color="D9D9D9"/>
-            </w:tcBorders>
-            <w:shd w:val="clear" w:color="auto" w:fill="F7F5EF"/>
-            <w:tcMar>
-              <w:top w:w="60" w:type="dxa"/>
-              <w:left w:w="100" w:type="dxa"/>
-              <w:bottom w:w="60" w:type="dxa"/>
-              <w:right w:w="100" w:type="dxa"/>
-            </w:tcMar>
-          </w:tcPr>
-          <w:p>
-            <w:r>
-              <w:rPr>
-                <w:color w:val="222222"/>
-                <w:sz w:val="20"/>
-                <w:szCs w:val="20"/>
-              </w:rPr>
-              <w:t>Titel, Beschreibung, Dateityp, Größe, Download-Button.</w:t>
-            </w:r>
-          </w:p>
-        </w:tc>
-      </w:tr>
-      <w:tr>
-        <w:tc>
-          <w:tcPr>
-            <w:tcW w:w="2800" w:type="dxa"/>
-            <w:tcBorders>
-              <w:top w:val="single" w:sz="1" w:space="0" w:color="D9D9D9"/>
-              <w:left w:val="single" w:sz="1" w:space="0" w:color="D9D9D9"/>
-              <w:bottom w:val="single" w:sz="1" w:space="0" w:color="D9D9D9"/>
-              <w:right w:val="single" w:sz="1" w:space="0" w:color="D9D9D9"/>
-            </w:tcBorders>
-            <w:shd w:val="clear" w:color="auto" w:fill="F7F5EF"/>
-            <w:tcMar>
-              <w:top w:w="60" w:type="dxa"/>
-              <w:left w:w="100" w:type="dxa"/>
-              <w:bottom w:w="60" w:type="dxa"/>
-              <w:right w:w="100" w:type="dxa"/>
-            </w:tcMar>
-          </w:tcPr>
-          <w:p>
-            <w:r>
-              <w:rPr>
-                <w:b/>
-                <w:bCs/>
-                <w:color w:val="222222"/>
-                <w:sz w:val="20"/>
-                <w:szCs w:val="20"/>
-              </w:rPr>
-              <w:t>Mobile-Navigation</w:t>
-            </w:r>
-          </w:p>
-        </w:tc>
-        <w:tc>
-          <w:tcPr>
-            <w:tcW w:w="3400" w:type="dxa"/>
-            <w:tcBorders>
-              <w:top w:val="single" w:sz="1" w:space="0" w:color="D9D9D9"/>
-              <w:left w:val="single" w:sz="1" w:space="0" w:color="D9D9D9"/>
-              <w:bottom w:val="single" w:sz="1" w:space="0" w:color="D9D9D9"/>
-              <w:right w:val="single" w:sz="1" w:space="0" w:color="D9D9D9"/>
-            </w:tcBorders>
-            <w:shd w:val="clear" w:color="auto" w:fill="F7F5EF"/>
-            <w:tcMar>
-              <w:top w:w="60" w:type="dxa"/>
-              <w:left w:w="100" w:type="dxa"/>
-              <w:bottom w:w="60" w:type="dxa"/>
-              <w:right w:w="100" w:type="dxa"/>
-            </w:tcMar>
-          </w:tcPr>
-          <w:p>
-            <w:r>
-              <w:rPr>
-                <w:color w:val="222222"/>
-                <w:sz w:val="20"/>
-                <w:szCs w:val="20"/>
-              </w:rPr>
-              <w:t>Vollbild-Overlay</w:t>
-            </w:r>
-          </w:p>
-        </w:tc>
-        <w:tc>
-          <w:tcPr>
-            <w:tcW w:w="3426" w:type="dxa"/>
-            <w:tcBorders>
-              <w:top w:val="single" w:sz="1" w:space="0" w:color="D9D9D9"/>
-              <w:left w:val="single" w:sz="1" w:space="0" w:color="D9D9D9"/>
-              <w:bottom w:val="single" w:sz="1" w:space="0" w:color="D9D9D9"/>
-              <w:right w:val="single" w:sz="1" w:space="0" w:color="D9D9D9"/>
-            </w:tcBorders>
-            <w:shd w:val="clear" w:color="auto" w:fill="F7F5EF"/>
-            <w:tcMar>
-              <w:top w:w="60" w:type="dxa"/>
-              <w:left w:w="100" w:type="dxa"/>
-              <w:bottom w:w="60" w:type="dxa"/>
-              <w:right w:w="100" w:type="dxa"/>
-            </w:tcMar>
-          </w:tcPr>
-          <w:p>
-            <w:r>
-              <w:rPr>
-                <w:color w:val="222222"/>
-                <w:sz w:val="20"/>
-                <w:szCs w:val="20"/>
-              </w:rPr>
-              <w:t>6 Navigationspunkte als vollbreite, vertikal gestapelte Buttons (mind. 56px Höhe). Heller Hintergrund, hoher Kontrast. Schließen: ×-Symbol (min. 48×48px). Kein Slide-in-Drawer.</w:t>
-            </w:r>
-          </w:p>
-        </w:tc>
-      </w:tr>
-    </w:tbl>
-    <w:p>
-      <w:pPr>
-        <w:spacing w:after="200"/>
-      </w:pPr>
-    </w:p>
-    <w:p>
-      <w:pPr>
-        <w:pStyle w:val="berschrift2"/>
-      </w:pPr>
-      <w:r>
-        <w:t>Barrierearme Systemregeln</w:t>
-      </w:r>
-    </w:p>
-    <w:p>
-      <w:pPr>
-        <w:pStyle w:val="Listenabsatz"/>
-        <w:numPr>
-          <w:ilvl w:val="0"/>
-          <w:numId w:val="3"/>
-        </w:numPr>
-        <w:spacing w:after="80"/>
-      </w:pPr>
-      <w:r>
-        <w:rPr>
-          <w:color w:val="222222"/>
-        </w:rPr>
-        <w:t>Kontrast mindestens WCAG AA</w:t>
-      </w:r>
-    </w:p>
-    <w:p>
-      <w:pPr>
-        <w:pStyle w:val="Listenabsatz"/>
-        <w:numPr>
-          <w:ilvl w:val="0"/>
-          <w:numId w:val="3"/>
-        </w:numPr>
-        <w:spacing w:after="80"/>
-      </w:pPr>
-      <w:r>
-        <w:rPr>
-          <w:color w:val="222222"/>
-        </w:rPr>
-        <w:t>Fokus-Zustände für alle interaktiven Elemente</w:t>
-      </w:r>
-    </w:p>
-    <w:p>
-      <w:pPr>
-        <w:pStyle w:val="Listenabsatz"/>
-        <w:numPr>
-          <w:ilvl w:val="0"/>
-          <w:numId w:val="3"/>
-        </w:numPr>
-        <w:spacing w:after="80"/>
-      </w:pPr>
-      <w:r>
-        <w:rPr>
-          <w:color w:val="222222"/>
-        </w:rPr>
-        <w:t>aria-labels für Formulare</w:t>
-      </w:r>
-    </w:p>
-    <w:p>
-      <w:pPr>
-        <w:pStyle w:val="Listenabsatz"/>
-        <w:numPr>
-          <w:ilvl w:val="0"/>
-          <w:numId w:val="3"/>
-        </w:numPr>
-        <w:spacing w:after="80"/>
-      </w:pPr>
-      <w:r>
-        <w:rPr>
-          <w:color w:val="222222"/>
-        </w:rPr>
-        <w:t>Tastaturnavigation vollständig</w:t>
-      </w:r>
-    </w:p>
-    <w:p>
-      <w:pPr>
-        <w:pStyle w:val="Listenabsatz"/>
-        <w:numPr>
-          <w:ilvl w:val="0"/>
-          <w:numId w:val="3"/>
-        </w:numPr>
-        <w:spacing w:after="80"/>
-      </w:pPr>
-      <w:r>
-        <w:rPr>
-          <w:color w:val="222222"/>
-        </w:rPr>
-        <w:t>Kein automatisches Karussell</w:t>
-      </w:r>
-    </w:p>
-    <w:p>
-      <w:pPr>
-        <w:pStyle w:val="Listenabsatz"/>
-        <w:numPr>
-          <w:ilvl w:val="0"/>
-          <w:numId w:val="3"/>
-        </w:numPr>
-        <w:spacing w:after="80"/>
-      </w:pPr>
-      <w:r>
-        <w:rPr>
-          <w:color w:val="222222"/>
-        </w:rPr>
-        <w:t>Keine rein farbbasierten Zustände</w:t>
-      </w:r>
-    </w:p>
-    <w:p>
-      <w:pPr>
-        <w:pStyle w:val="Listenabsatz"/>
-        <w:numPr>
-          <w:ilvl w:val="0"/>
-          <w:numId w:val="3"/>
-        </w:numPr>
-        <w:spacing w:after="80"/>
-      </w:pPr>
-      <w:r>
-        <w:rPr>
-          <w:color w:val="222222"/>
-        </w:rPr>
-        <w:lastRenderedPageBreak/>
-        <w:t>Optional: Skip-to-Content-Link, Schriftgrößen-Umschalter</w:t>
-      </w:r>
-    </w:p>
-    <w:p>
-      <w:pPr>
-        <w:pStyle w:val="berschrift2"/>
-      </w:pPr>
-      <w:r>
         <w:t>CMS-Inhaltstypen</w:t>
       </w:r>
     </w:p>
     <w:p>
       <w:pPr>
-        <w:pStyle w:val="Listenabsatz"/>
-        <w:numPr>
-          <w:ilvl w:val="0"/>
-          <w:numId w:val="3"/>
-        </w:numPr>
-        <w:spacing w:after="80"/>
-      </w:pPr>
-      <w:r>
-        <w:rPr>
-          <w:color w:val="222222"/>
-        </w:rPr>
-        <w:t>Seite (Standard)</w:t>
-      </w:r>
-    </w:p>
-    <w:p>
-      <w:pPr>
-        <w:pStyle w:val="Listenabsatz"/>
-        <w:numPr>
-          <w:ilvl w:val="0"/>
-          <w:numId w:val="3"/>
-        </w:numPr>
-        <w:spacing w:after="80"/>
-      </w:pPr>
-      <w:r>
-        <w:rPr>
-          <w:color w:val="222222"/>
-        </w:rPr>
-        <w:t>Workshop</w:t>
-      </w:r>
-    </w:p>
-    <w:p>
-      <w:pPr>
-        <w:pStyle w:val="Listenabsatz"/>
-        <w:numPr>
-          <w:ilvl w:val="0"/>
-          <w:numId w:val="3"/>
-        </w:numPr>
-        <w:spacing w:after="80"/>
-      </w:pPr>
-      <w:r>
-        <w:rPr>
-          <w:color w:val="222222"/>
-        </w:rPr>
-        <w:t>Aktivität / Bericht</w:t>
-      </w:r>
-    </w:p>
-    <w:p>
-      <w:pPr>
-        <w:pStyle w:val="Listenabsatz"/>
-        <w:numPr>
-          <w:ilvl w:val="0"/>
-          <w:numId w:val="3"/>
-        </w:numPr>
-        <w:spacing w:after="80"/>
-      </w:pPr>
-      <w:r>
-        <w:rPr>
-          <w:color w:val="222222"/>
-        </w:rPr>
-        <w:t>News</w:t>
-      </w:r>
-    </w:p>
-    <w:p>
-      <w:pPr>
-        <w:pStyle w:val="Listenabsatz"/>
-        <w:numPr>
-          <w:ilvl w:val="0"/>
-          <w:numId w:val="3"/>
-        </w:numPr>
-        <w:spacing w:after="80"/>
-      </w:pPr>
-      <w:r>
-        <w:rPr>
-          <w:color w:val="222222"/>
-        </w:rPr>
-        <w:t>Dokument</w:t>
-      </w:r>
-    </w:p>
-    <w:p>
-      <w:pPr>
-        <w:pStyle w:val="Listenabsatz"/>
-        <w:numPr>
-          <w:ilvl w:val="0"/>
-          <w:numId w:val="3"/>
-        </w:numPr>
-        <w:spacing w:after="80"/>
-      </w:pPr>
-      <w:r>
-        <w:rPr>
-          <w:color w:val="222222"/>
-        </w:rPr>
-        <w:t>Partner</w:t>
-      </w:r>
-    </w:p>
-    <w:p>
-      <w:pPr>
-        <w:pStyle w:val="Listenabsatz"/>
-        <w:numPr>
-          <w:ilvl w:val="0"/>
-          <w:numId w:val="3"/>
-        </w:numPr>
-        <w:spacing w:after="80"/>
-      </w:pPr>
-      <w:r>
-        <w:rPr>
-          <w:color w:val="222222"/>
-        </w:rPr>
-        <w:t>Veranstaltung (extern)</w:t>
-      </w:r>
-    </w:p>
-    <w:p>
-      <w:r>
-        <w:br w:type="page"/>
-      </w:r>
+        <w:spacing w:after="160"/>
+      </w:pPr>
+      <w:del w:id="317" w:author="Claude" w:date="2026-04-01T00:00:00Z">
+        <w:r>
+          <w:rPr>
+            <w:color w:val="222222"/>
+          </w:rPr>
+          <w:delText>CMS-Inhaltstypen-Liste war hier definiert.</w:delText>
+        </w:r>
+      </w:del>
+      <w:ins w:id="318" w:author="Claude" w:date="2026-04-01T00:00:00Z">
+        <w:r>
+          <w:rPr>
+            <w:color w:val="222222"/>
+          </w:rPr>
+          <w:t>CMS-Inhaltstypen (Seite, Workshop, Aktivität/Bericht, News, Dokument, Partner, Veranstaltung) sind in Projektbeschreibung.docx §2.5 definiert.</w:t>
+        </w:r>
+      </w:ins>
     </w:p>
     <w:p>
       <w:pPr>

</xml_diff>

<commit_message>
docs: Offene Rückfragen klären, Datenschutzseite DSGVO-korrigieren
Strategisches Konzept: Alle drei offenen Rückfragen beantwortet —
Foto-Datenschutz (Einwilligung bei Anmeldung), Förderberichte
(Phase 1 Auszüge, ab Phase 4 vollständig für Förderer), Querverweis
auf UI-Spezifikation in Kap. 12 ergänzt.

Datenschutzseite: Google Fonts durch Self-Hosting-Hinweis ersetzt,
OpenStreetMap als genutzten externen Dienst ergänzt.

Co-Authored-By: Claude Opus 4.6 <noreply@anthropic.com>
</commit_message>
<xml_diff>
--- a/docs/Stategisches Website Konzept-Gemeinsam-Kochen-Aktualisiert.docx
+++ b/docs/Stategisches Website Konzept-Gemeinsam-Kochen-Aktualisiert.docx
@@ -181,15 +181,13 @@
         </w:rPr>
         <w:t>Gibt es bereits ein Corporate Design (Logo, Farben, Typografie)?</w:t>
       </w:r>
-      <w:ins w:id="300" w:author="Claude" w:date="2026-04-01T00:00:00Z">
-        <w:r>
-          <w:rPr>
-            <w:b/>
-            <w:color w:val="222222"/>
-          </w:rPr>
-          <w:t xml:space="preserve"> – Beantwortet: Ja (brand-identity-mavka.html).</w:t>
-        </w:r>
-      </w:ins>
+      <w:r>
+        <w:rPr>
+          <w:b/>
+          <w:color w:val="222222"/>
+        </w:rPr>
+        <w:t xml:space="preserve"> – Beantwortet: Ja (brand-identity-mavka.html).</w:t>
+      </w:r>
     </w:p>
     <w:p>
       <w:pPr>
@@ -229,15 +227,13 @@
         </w:rPr>
         <w:t>Müssen Förderberichte öffentlich vollständig einsehbar sein oder in Auszügen/Zusammenfassungen?</w:t>
       </w:r>
-      <w:ins w:id="301" w:author="Claude" w:date="2026-04-01T00:00:00Z">
-        <w:r>
-          <w:rPr>
-            <w:b/>
-            <w:color w:val="222222"/>
-          </w:rPr>
-          <w:t xml:space="preserve"> – Noch zu klären.</w:t>
-        </w:r>
-      </w:ins>
+      <w:r>
+        <w:rPr>
+          <w:b/>
+          <w:color w:val="222222"/>
+        </w:rPr>
+        <w:t xml:space="preserve"> – Entschieden: Phase 1 (Projektstart 2026) nur Auszüge/Zusammenfassungen. Ab Phase 4 (Trägerplattform 2027+) vollständige Berichte, mindestens für Förderer einsehbar.</w:t>
+      </w:r>
     </w:p>
     <w:p>
       <w:pPr>
@@ -339,15 +335,13 @@
         </w:rPr>
         <w:t>Gibt es perspektivisch weitere Projekte ab 2027?</w:t>
       </w:r>
-      <w:ins w:id="302" w:author="Claude" w:date="2026-04-01T00:00:00Z">
-        <w:r>
-          <w:rPr>
-            <w:b/>
-            <w:color w:val="222222"/>
-          </w:rPr>
-          <w:t xml:space="preserve"> – Ja, siehe Phase 4 (§10).</w:t>
-        </w:r>
-      </w:ins>
+      <w:r>
+        <w:rPr>
+          <w:b/>
+          <w:color w:val="222222"/>
+        </w:rPr>
+        <w:t xml:space="preserve"> – Ja, siehe Phase 4 (§10).</w:t>
+      </w:r>
     </w:p>
     <w:p>
       <w:pPr>
@@ -364,15 +358,13 @@
         </w:rPr>
         <w:t>Gibt es besondere Datenschutz- oder Sensibilitätsanforderungen (z. B. Schutz von Teilnehmenden)?</w:t>
       </w:r>
-      <w:ins w:id="303" w:author="Claude" w:date="2026-04-01T00:00:00Z">
-        <w:r>
-          <w:rPr>
-            <w:b/>
-            <w:color w:val="222222"/>
-          </w:rPr>
-          <w:t xml:space="preserve"> – Noch zu klären. Fotos nur mit Einwilligung (§9 Phase 2).</w:t>
-        </w:r>
-      </w:ins>
+      <w:r>
+        <w:rPr>
+          <w:b/>
+          <w:color w:val="222222"/>
+        </w:rPr>
+        <w:t xml:space="preserve"> – Noch zu klären. Fotos nur mit Einwilligung (§9 Phase 2).</w:t>
+      </w:r>
     </w:p>
     <w:p>
       <w:pPr>
@@ -394,22 +386,12 @@
       <w:pPr>
         <w:spacing w:after="160"/>
       </w:pPr>
-      <w:del w:id="308" w:author="Claude" w:date="2026-04-01T00:00:00Z">
-        <w:r>
-          <w:rPr>
-            <w:color w:val="222222"/>
-          </w:rPr>
-          <w:delText>Projektbeschreibung, Schwerpunkte und Laufzeit waren hier dargestellt.</w:delText>
-        </w:r>
-      </w:del>
-      <w:ins w:id="309" w:author="Claude" w:date="2026-04-01T00:00:00Z">
-        <w:r>
-          <w:rPr>
-            <w:color w:val="222222"/>
-          </w:rPr>
-          <w:t>Siehe Projektbeschreibung.docx §1.6–1.7 für Projektinhalt, Schwerpunkte, Ziele und Laufzeit.</w:t>
-        </w:r>
-      </w:ins>
+      <w:r>
+        <w:rPr>
+          <w:color w:val="222222"/>
+        </w:rPr>
+        <w:t>Siehe Projektbeschreibung.docx §1.6–1.7 für Projektinhalt, Schwerpunkte, Ziele und Laufzeit.</w:t>
+      </w:r>
     </w:p>
     <w:p>
       <w:pPr>
@@ -478,6 +460,7 @@
         <w:rPr>
           <w:color w:val="222222"/>
         </w:rPr>
+        <w:lastRenderedPageBreak/>
         <w:t>Die Website ist kein Marketinginstrument, sondern:</w:t>
       </w:r>
     </w:p>
@@ -610,16 +593,10 @@
       </w:r>
     </w:p>
     <w:p>
-      <w:r>
-        <w:br w:type="page"/>
-      </w:r>
-    </w:p>
-    <w:p>
       <w:pPr>
         <w:pStyle w:val="berschrift1"/>
       </w:pPr>
       <w:r>
-        <w:lastRenderedPageBreak/>
         <w:t>3. Zielgruppen &amp; Personas</w:t>
       </w:r>
     </w:p>
@@ -898,6 +875,7 @@
         <w:pStyle w:val="berschrift3"/>
       </w:pPr>
       <w:r>
+        <w:lastRenderedPageBreak/>
         <w:t>Zentrale Botschaften</w:t>
       </w:r>
     </w:p>
@@ -1050,7 +1028,6 @@
         <w:rPr>
           <w:color w:val="222222"/>
         </w:rPr>
-        <w:lastRenderedPageBreak/>
         <w:t>Wer steht dahinter?</w:t>
       </w:r>
     </w:p>
@@ -1087,16 +1064,10 @@
       </w:r>
     </w:p>
     <w:p>
-      <w:r>
-        <w:br w:type="page"/>
-      </w:r>
-    </w:p>
-    <w:p>
       <w:pPr>
         <w:pStyle w:val="berschrift1"/>
       </w:pPr>
       <w:r>
-        <w:lastRenderedPageBreak/>
         <w:t>5. Informationsarchitektur / Sitemap</w:t>
       </w:r>
     </w:p>
@@ -1321,16 +1292,8 @@
         <w:rPr>
           <w:color w:val="222222"/>
         </w:rPr>
-        <w:t>Sprache (DE | EN)</w:t>
-      </w:r>
-      <w:ins w:id="310" w:author="Claude" w:date="2026-04-01T00:00:00Z">
-        <w:r>
-          <w:rPr>
-            <w:color w:val="222222"/>
-          </w:rPr>
-          <w:t xml:space="preserve"> – URL-Struktur: /de/, /en/ (erweiterbar)</w:t>
-        </w:r>
-      </w:ins>
+        <w:t>Sprache (DE | EN) – URL-Struktur: /de/, /en/ (erweiterbar)</w:t>
+      </w:r>
     </w:p>
     <w:p>
       <w:pPr>
@@ -1358,8 +1321,8 @@
         <w:tblLook w:val="04A0" w:firstRow="1" w:lastRow="0" w:firstColumn="1" w:lastColumn="0" w:noHBand="0" w:noVBand="1"/>
       </w:tblPr>
       <w:tblGrid>
-        <w:gridCol w:w="2400"/>
-        <w:gridCol w:w="6626"/>
+        <w:gridCol w:w="2746"/>
+        <w:gridCol w:w="6280"/>
       </w:tblGrid>
       <w:tr>
         <w:tc>
@@ -1510,6 +1473,7 @@
                 <w:sz w:val="20"/>
                 <w:szCs w:val="20"/>
               </w:rPr>
+              <w:lastRenderedPageBreak/>
               <w:t>Unser Projekt</w:t>
             </w:r>
           </w:p>
@@ -1679,7 +1643,8 @@
             </w:tcMar>
           </w:tcPr>
           <w:p>
-            <w:del w:id="0" w:author="Claude" w:date="2026-03-04T00:00:00Z">
+            <w:commentRangeStart w:id="0"/>
+            <w:del w:id="1" w:author="Claude" w:date="2026-03-04T00:00:00Z">
               <w:r>
                 <w:rPr>
                   <w:b/>
@@ -1691,6 +1656,18 @@
                 <w:delText>Mitmachen &amp; Netzwerk</w:delText>
               </w:r>
             </w:del>
+            <w:commentRangeEnd w:id="0"/>
+            <w:r>
+              <w:rPr>
+                <w:rStyle w:val="Kommentarzeichen"/>
+                <w:b/>
+                <w:bCs/>
+                <w:color w:val="222222"/>
+                <w:sz w:val="20"/>
+                <w:szCs w:val="20"/>
+              </w:rPr>
+              <w:commentReference w:id="0"/>
+            </w:r>
             <w:r>
               <w:rPr>
                 <w:b/>
@@ -1720,7 +1697,8 @@
             </w:tcMar>
           </w:tcPr>
           <w:p>
-            <w:del w:id="1" w:author="Claude" w:date="2026-03-04T00:00:00Z">
+            <w:commentRangeStart w:id="2"/>
+            <w:del w:id="3" w:author="Claude" w:date="2026-03-04T00:00:00Z">
               <w:r>
                 <w:rPr>
                   <w:color w:val="222222"/>
@@ -1730,6 +1708,16 @@
                 <w:delText>Teilnahmeinformationen, Ehrenamt, Kooperationspartner, Netzwerk &amp; Programme</w:delText>
               </w:r>
             </w:del>
+            <w:commentRangeEnd w:id="2"/>
+            <w:r>
+              <w:rPr>
+                <w:rStyle w:val="Kommentarzeichen"/>
+                <w:color w:val="222222"/>
+                <w:sz w:val="20"/>
+                <w:szCs w:val="20"/>
+              </w:rPr>
+              <w:commentReference w:id="2"/>
+            </w:r>
             <w:r>
               <w:rPr>
                 <w:color w:val="222222"/>
@@ -1809,9 +1797,24 @@
     </w:p>
     <w:p>
       <w:pPr>
+        <w:rPr>
+          <w:b/>
+          <w:bCs/>
+          <w:color w:val="1F4D3A"/>
+          <w:sz w:val="36"/>
+          <w:szCs w:val="36"/>
+        </w:rPr>
+      </w:pPr>
+      <w:r>
+        <w:br w:type="page"/>
+      </w:r>
+    </w:p>
+    <w:p>
+      <w:pPr>
         <w:pStyle w:val="berschrift1"/>
       </w:pPr>
       <w:r>
+        <w:lastRenderedPageBreak/>
         <w:t>6. Wichtige Seitentypen</w:t>
       </w:r>
     </w:p>
@@ -2044,7 +2047,6 @@
                 <w:sz w:val="20"/>
                 <w:szCs w:val="20"/>
               </w:rPr>
-              <w:lastRenderedPageBreak/>
               <w:t>Projektseite</w:t>
             </w:r>
           </w:p>
@@ -2370,17 +2372,12 @@
         <w:spacing w:after="200"/>
       </w:pPr>
     </w:p>
-    <w:p>
-      <w:r>
-        <w:br w:type="page"/>
-      </w:r>
-    </w:p>
+    <w:p/>
     <w:p>
       <w:pPr>
         <w:pStyle w:val="berschrift1"/>
       </w:pPr>
       <w:r>
-        <w:lastRenderedPageBreak/>
         <w:t>7. Funktionen &amp; Services</w:t>
       </w:r>
     </w:p>
@@ -2529,22 +2526,39 @@
         </w:numPr>
         <w:spacing w:after="80"/>
       </w:pPr>
-      <w:del w:id="306" w:author="Claude" w:date="2026-04-01T00:00:00Z">
+      <w:commentRangeStart w:id="4"/>
+      <w:del w:id="5" w:author="adocom | Aktualisierung" w:date="2026-04-01T18:47:00Z" w16du:dateUtc="2026-04-01T16:47:00Z">
         <w:r>
           <w:rPr>
             <w:color w:val="222222"/>
           </w:rPr>
-          <w:delText>Newsletterfunktion – externer DSGVO-konformer Anbieter (z. B. CleverReach oder Brevo), Double-Opt-In, einfache Segmentierung, Start: 4–6 Newsletter pro Jahr – Aktualisierung: Hostinger Reach statt CleverReach/Brevo.</w:delText>
+          <w:delText>Newsletterfunktion</w:delText>
         </w:r>
       </w:del>
-      <w:ins w:id="307" w:author="Claude" w:date="2026-04-01T00:00:00Z">
+      <w:commentRangeEnd w:id="4"/>
+      <w:r>
+        <w:rPr>
+          <w:rStyle w:val="Kommentarzeichen"/>
+          <w:color w:val="222222"/>
+          <w:sz w:val="22"/>
+          <w:szCs w:val="22"/>
+        </w:rPr>
+        <w:commentReference w:id="4"/>
+      </w:r>
+      <w:ins w:id="6" w:author="adocom | Aktualisierung" w:date="2026-04-01T18:47:00Z" w16du:dateUtc="2026-04-01T16:47:00Z">
         <w:r>
           <w:rPr>
             <w:color w:val="222222"/>
           </w:rPr>
-          <w:t>Newsletterfunktion – Hostinger Reach, Double-Opt-In, einfache Segmentierung, Start: 4–6 Newsletter pro Jahr</w:t>
+          <w:t>Newsletter Funktion</w:t>
         </w:r>
       </w:ins>
+      <w:r>
+        <w:rPr>
+          <w:color w:val="222222"/>
+        </w:rPr>
+        <w:t xml:space="preserve"> – Hostinger Reach, Double-Opt-In, einfache Segmentierung, Start: 4–6 Newsletter pro Jahr</w:t>
+      </w:r>
     </w:p>
     <w:p>
       <w:pPr>
@@ -2679,7 +2693,7 @@
         <w:pStyle w:val="berschrift2"/>
       </w:pPr>
       <w:r>
-        <w:t>Förderberichte – offene Frage</w:t>
+        <w:t>Förderberichte – entschieden</w:t>
       </w:r>
     </w:p>
     <w:p>
@@ -2690,22 +2704,23 @@
         <w:rPr>
           <w:color w:val="222222"/>
         </w:rPr>
-        <w:t>Da noch ungeklärt, wird eine flexible Struktur vorbereitet:</w:t>
-      </w:r>
-    </w:p>
-    <w:p>
-      <w:pPr>
-        <w:pStyle w:val="Listenabsatz"/>
-        <w:numPr>
-          <w:ilvl w:val="0"/>
-          <w:numId w:val="3"/>
-        </w:numPr>
-        <w:spacing w:after="80"/>
-      </w:pPr>
-      <w:r>
-        <w:rPr>
-          <w:color w:val="222222"/>
-        </w:rPr>
+        <w:t>Entschieden: Phase 1 zeigt Auszüge/Zusammenfassungen, ab Phase 4 (Trägerplattform) vollständige Berichte mindestens für Förderer. Flexible Struktur:</w:t>
+      </w:r>
+    </w:p>
+    <w:p>
+      <w:pPr>
+        <w:pStyle w:val="Listenabsatz"/>
+        <w:numPr>
+          <w:ilvl w:val="0"/>
+          <w:numId w:val="3"/>
+        </w:numPr>
+        <w:spacing w:after="80"/>
+      </w:pPr>
+      <w:r>
+        <w:rPr>
+          <w:color w:val="222222"/>
+        </w:rPr>
+        <w:lastRenderedPageBreak/>
         <w:t>Bereich „Transparenz &amp; Dokumentation“ mit Projektstatus, Kennzahlen, Downloadbereich (optional aktivierbar)</w:t>
       </w:r>
     </w:p>
@@ -2722,7 +2737,7 @@
         <w:rPr>
           <w:color w:val="222222"/>
         </w:rPr>
-        <w:t>Später können Vollberichte oder nur Zusammenfassungen eingestellt werden</w:t>
+        <w:t>Ab Phase 4 werden Vollberichte für Förderer freigeschaltet</w:t>
       </w:r>
     </w:p>
     <w:p>
@@ -2869,297 +2884,288 @@
         <w:t>Klare Handlungsaufforderungen</w:t>
       </w:r>
     </w:p>
-    <w:p>
+    <w:p/>
+    <w:p>
+      <w:pPr>
+        <w:pStyle w:val="berschrift1"/>
+      </w:pPr>
+      <w:r>
+        <w:t>9. UX- und Designprinzipien</w:t>
+      </w:r>
+    </w:p>
+    <w:p>
+      <w:pPr>
+        <w:pStyle w:val="berschrift3"/>
+      </w:pPr>
+      <w:r>
+        <w:t>Navigation</w:t>
+      </w:r>
+    </w:p>
+    <w:p>
+      <w:pPr>
+        <w:pStyle w:val="Listenabsatz"/>
+        <w:numPr>
+          <w:ilvl w:val="0"/>
+          <w:numId w:val="3"/>
+        </w:numPr>
+        <w:spacing w:after="80"/>
+      </w:pPr>
+      <w:r>
+        <w:rPr>
+          <w:color w:val="222222"/>
+        </w:rPr>
+        <w:t>Max. 2 Ebenen</w:t>
+      </w:r>
+    </w:p>
+    <w:p>
+      <w:pPr>
+        <w:pStyle w:val="Listenabsatz"/>
+        <w:numPr>
+          <w:ilvl w:val="0"/>
+          <w:numId w:val="3"/>
+        </w:numPr>
+        <w:spacing w:after="80"/>
+      </w:pPr>
+      <w:r>
+        <w:rPr>
+          <w:color w:val="222222"/>
+        </w:rPr>
+        <w:t>Klare Begriffe (kein NGO-Jargon)</w:t>
+      </w:r>
+    </w:p>
+    <w:p>
+      <w:pPr>
+        <w:pStyle w:val="Listenabsatz"/>
+        <w:numPr>
+          <w:ilvl w:val="0"/>
+          <w:numId w:val="3"/>
+        </w:numPr>
+        <w:spacing w:after="80"/>
+      </w:pPr>
+      <w:r>
+        <w:rPr>
+          <w:color w:val="222222"/>
+        </w:rPr>
+        <w:t>Breadcrumbs</w:t>
+      </w:r>
+    </w:p>
+    <w:p>
+      <w:pPr>
+        <w:pStyle w:val="Listenabsatz"/>
+        <w:numPr>
+          <w:ilvl w:val="0"/>
+          <w:numId w:val="3"/>
+        </w:numPr>
+        <w:spacing w:after="80"/>
+      </w:pPr>
+      <w:r>
+        <w:rPr>
+          <w:color w:val="222222"/>
+        </w:rPr>
+        <w:t>Große Klickflächen (Minimum: 48×48px gemäß WCAG 2.5.8; Primäre CTA-Buttons: Mindesthöhe 56px, volle Breite auf Mobile)</w:t>
+      </w:r>
+    </w:p>
+    <w:p>
+      <w:pPr>
+        <w:pStyle w:val="berschrift3"/>
+      </w:pPr>
+      <w:r>
+        <w:t>Senior*innen-Fokus – konkrete UX-Regeln</w:t>
+      </w:r>
+    </w:p>
+    <w:p>
+      <w:pPr>
+        <w:spacing w:after="160"/>
+      </w:pPr>
+      <w:r>
+        <w:rPr>
+          <w:color w:val="222222"/>
+        </w:rPr>
+        <w:t>Sehr wichtig, da die Startseite primär für Senior*innen gestaltet wird:</w:t>
+      </w:r>
+    </w:p>
+    <w:p>
+      <w:pPr>
+        <w:pStyle w:val="Listenabsatz"/>
+        <w:numPr>
+          <w:ilvl w:val="0"/>
+          <w:numId w:val="3"/>
+        </w:numPr>
+        <w:spacing w:after="80"/>
+      </w:pPr>
+      <w:r>
+        <w:rPr>
+          <w:color w:val="222222"/>
+        </w:rPr>
+        <w:t>Große Buttons mit klarer Beschriftung („Zum nächsten Termin“)</w:t>
+      </w:r>
+    </w:p>
+    <w:p>
+      <w:pPr>
+        <w:pStyle w:val="Listenabsatz"/>
+        <w:numPr>
+          <w:ilvl w:val="0"/>
+          <w:numId w:val="3"/>
+        </w:numPr>
+        <w:spacing w:after="80"/>
+      </w:pPr>
+      <w:r>
+        <w:rPr>
+          <w:color w:val="222222"/>
+        </w:rPr>
+        <w:t>Mindestschriftgröße 18px</w:t>
+      </w:r>
+    </w:p>
+    <w:p>
+      <w:pPr>
+        <w:pStyle w:val="Listenabsatz"/>
+        <w:numPr>
+          <w:ilvl w:val="0"/>
+          <w:numId w:val="3"/>
+        </w:numPr>
+        <w:spacing w:after="80"/>
+      </w:pPr>
+      <w:r>
+        <w:rPr>
+          <w:color w:val="222222"/>
+        </w:rPr>
+        <w:t>Hoher Kontrast</w:t>
+      </w:r>
+    </w:p>
+    <w:p>
+      <w:pPr>
+        <w:pStyle w:val="Listenabsatz"/>
+        <w:numPr>
+          <w:ilvl w:val="0"/>
+          <w:numId w:val="3"/>
+        </w:numPr>
+        <w:spacing w:after="80"/>
+      </w:pPr>
+      <w:r>
+        <w:rPr>
+          <w:color w:val="222222"/>
+        </w:rPr>
+        <w:t>Keine komplexen Dropdown-Menüs – Mobile: Vollbild-Overlay-Navigation (siehe Kernkomponenten)</w:t>
+      </w:r>
+    </w:p>
+    <w:p>
+      <w:pPr>
+        <w:pStyle w:val="Listenabsatz"/>
+        <w:numPr>
+          <w:ilvl w:val="0"/>
+          <w:numId w:val="3"/>
+        </w:numPr>
+        <w:spacing w:after="80"/>
+      </w:pPr>
+      <w:r>
+        <w:rPr>
+          <w:color w:val="222222"/>
+        </w:rPr>
+        <w:t>Keine Slider</w:t>
+      </w:r>
+    </w:p>
+    <w:p>
+      <w:pPr>
+        <w:pStyle w:val="Listenabsatz"/>
+        <w:numPr>
+          <w:ilvl w:val="0"/>
+          <w:numId w:val="3"/>
+        </w:numPr>
+        <w:spacing w:after="80"/>
+      </w:pPr>
+      <w:r>
+        <w:rPr>
+          <w:color w:val="222222"/>
+        </w:rPr>
+        <w:t>bewegte Animationen abschaltbar</w:t>
+      </w:r>
+    </w:p>
+    <w:p>
+      <w:pPr>
+        <w:pStyle w:val="Listenabsatz"/>
+        <w:numPr>
+          <w:ilvl w:val="0"/>
+          <w:numId w:val="3"/>
+        </w:numPr>
+        <w:spacing w:after="80"/>
+      </w:pPr>
+      <w:r>
+        <w:rPr>
+          <w:color w:val="222222"/>
+        </w:rPr>
+        <w:t>Maximal 2 Scroll-Bildschirme auf der Startseite</w:t>
+      </w:r>
+    </w:p>
+    <w:p>
+      <w:pPr>
+        <w:pStyle w:val="Listenabsatz"/>
+        <w:numPr>
+          <w:ilvl w:val="0"/>
+          <w:numId w:val="3"/>
+        </w:numPr>
+        <w:spacing w:after="80"/>
+      </w:pPr>
+      <w:r>
+        <w:rPr>
+          <w:color w:val="222222"/>
+        </w:rPr>
+        <w:t>Telefonnummer immer sichtbar – Desktop: fest im Sticky-Header rechts neben Sprachumschalter. Mobile: Floating Action Button (56×56px, Dunkelgrün #1F4D3A, weißes Telefon-Icon, fixiert unten rechts), Tap öffnet direkt tel:-Link.</w:t>
+      </w:r>
+    </w:p>
+    <w:p>
+      <w:pPr>
+        <w:pStyle w:val="Listenabsatz"/>
+        <w:numPr>
+          <w:ilvl w:val="0"/>
+          <w:numId w:val="3"/>
+        </w:numPr>
+        <w:spacing w:after="80"/>
+      </w:pPr>
+      <w:r>
+        <w:rPr>
+          <w:color w:val="222222"/>
+        </w:rPr>
+        <w:t>Klare Wegbeschreibung zu Veranstaltungsorten</w:t>
+      </w:r>
+    </w:p>
+    <w:p>
+      <w:pPr>
+        <w:pStyle w:val="Listenabsatz"/>
+        <w:numPr>
+          <w:ilvl w:val="0"/>
+          <w:numId w:val="3"/>
+        </w:numPr>
+        <w:spacing w:after="80"/>
+      </w:pPr>
+      <w:r>
+        <w:rPr>
+          <w:color w:val="222222"/>
+        </w:rPr>
+        <w:t>Schnelle Ladezeiten – viele Besucher kommen über mobile Netze</w:t>
+      </w:r>
+    </w:p>
+    <w:p>
+      <w:pPr>
+        <w:pStyle w:val="Listenabsatz"/>
+        <w:numPr>
+          <w:ilvl w:val="0"/>
+          <w:numId w:val="3"/>
+        </w:numPr>
+        <w:spacing w:after="80"/>
+      </w:pPr>
+      <w:r>
+        <w:rPr>
+          <w:color w:val="222222"/>
+        </w:rPr>
+        <w:t>Sprachumschalter: sichtbar im Header, Text + Flagge, DE | EN</w:t>
+      </w:r>
+    </w:p>
+    <w:p>
+      <w:pPr>
+        <w:pStyle w:val="berschrift3"/>
+      </w:pPr>
       <w:r>
         <w:lastRenderedPageBreak/>
-        <w:br w:type="page"/>
-      </w:r>
-    </w:p>
-    <w:p>
-      <w:pPr>
-        <w:pStyle w:val="berschrift1"/>
-      </w:pPr>
-      <w:r>
-        <w:lastRenderedPageBreak/>
-        <w:t>9. UX- und Designprinzipien</w:t>
-      </w:r>
-    </w:p>
-    <w:p>
-      <w:pPr>
-        <w:pStyle w:val="berschrift3"/>
-      </w:pPr>
-      <w:r>
-        <w:t>Navigation</w:t>
-      </w:r>
-    </w:p>
-    <w:p>
-      <w:pPr>
-        <w:pStyle w:val="Listenabsatz"/>
-        <w:numPr>
-          <w:ilvl w:val="0"/>
-          <w:numId w:val="3"/>
-        </w:numPr>
-        <w:spacing w:after="80"/>
-      </w:pPr>
-      <w:r>
-        <w:rPr>
-          <w:color w:val="222222"/>
-        </w:rPr>
-        <w:t>Max. 2 Ebenen</w:t>
-      </w:r>
-    </w:p>
-    <w:p>
-      <w:pPr>
-        <w:pStyle w:val="Listenabsatz"/>
-        <w:numPr>
-          <w:ilvl w:val="0"/>
-          <w:numId w:val="3"/>
-        </w:numPr>
-        <w:spacing w:after="80"/>
-      </w:pPr>
-      <w:r>
-        <w:rPr>
-          <w:color w:val="222222"/>
-        </w:rPr>
-        <w:t>Klare Begriffe (kein NGO-Jargon)</w:t>
-      </w:r>
-    </w:p>
-    <w:p>
-      <w:pPr>
-        <w:pStyle w:val="Listenabsatz"/>
-        <w:numPr>
-          <w:ilvl w:val="0"/>
-          <w:numId w:val="3"/>
-        </w:numPr>
-        <w:spacing w:after="80"/>
-      </w:pPr>
-      <w:r>
-        <w:rPr>
-          <w:color w:val="222222"/>
-        </w:rPr>
-        <w:t>Breadcrumbs</w:t>
-      </w:r>
-    </w:p>
-    <w:p>
-      <w:pPr>
-        <w:pStyle w:val="Listenabsatz"/>
-        <w:numPr>
-          <w:ilvl w:val="0"/>
-          <w:numId w:val="3"/>
-        </w:numPr>
-        <w:spacing w:after="80"/>
-      </w:pPr>
-      <w:r>
-        <w:rPr>
-          <w:color w:val="222222"/>
-        </w:rPr>
-        <w:t>Große Klickflächen (Minimum: 48×48px gemäß WCAG 2.5.8; Primäre CTA-Buttons: Mindesthöhe 56px, volle Breite auf Mobile)</w:t>
-      </w:r>
-    </w:p>
-    <w:p>
-      <w:pPr>
-        <w:pStyle w:val="berschrift3"/>
-      </w:pPr>
-      <w:r>
-        <w:t>Senior*innen-Fokus – konkrete UX-Regeln</w:t>
-      </w:r>
-    </w:p>
-    <w:p>
-      <w:pPr>
-        <w:spacing w:after="160"/>
-      </w:pPr>
-      <w:r>
-        <w:rPr>
-          <w:color w:val="222222"/>
-        </w:rPr>
-        <w:t>Sehr wichtig, da die Startseite primär für Senior*innen gestaltet wird:</w:t>
-      </w:r>
-    </w:p>
-    <w:p>
-      <w:pPr>
-        <w:pStyle w:val="Listenabsatz"/>
-        <w:numPr>
-          <w:ilvl w:val="0"/>
-          <w:numId w:val="3"/>
-        </w:numPr>
-        <w:spacing w:after="80"/>
-      </w:pPr>
-      <w:r>
-        <w:rPr>
-          <w:color w:val="222222"/>
-        </w:rPr>
-        <w:t>Große Buttons mit klarer Beschriftung („Zum nächsten Termin“)</w:t>
-      </w:r>
-    </w:p>
-    <w:p>
-      <w:pPr>
-        <w:pStyle w:val="Listenabsatz"/>
-        <w:numPr>
-          <w:ilvl w:val="0"/>
-          <w:numId w:val="3"/>
-        </w:numPr>
-        <w:spacing w:after="80"/>
-      </w:pPr>
-      <w:r>
-        <w:rPr>
-          <w:color w:val="222222"/>
-        </w:rPr>
-        <w:t>Mindestschriftgröße 18px</w:t>
-      </w:r>
-    </w:p>
-    <w:p>
-      <w:pPr>
-        <w:pStyle w:val="Listenabsatz"/>
-        <w:numPr>
-          <w:ilvl w:val="0"/>
-          <w:numId w:val="3"/>
-        </w:numPr>
-        <w:spacing w:after="80"/>
-      </w:pPr>
-      <w:r>
-        <w:rPr>
-          <w:color w:val="222222"/>
-        </w:rPr>
-        <w:t>Hoher Kontrast</w:t>
-      </w:r>
-    </w:p>
-    <w:p>
-      <w:pPr>
-        <w:pStyle w:val="Listenabsatz"/>
-        <w:numPr>
-          <w:ilvl w:val="0"/>
-          <w:numId w:val="3"/>
-        </w:numPr>
-        <w:spacing w:after="80"/>
-      </w:pPr>
-      <w:r>
-        <w:rPr>
-          <w:color w:val="222222"/>
-        </w:rPr>
-        <w:t>Keine komplexen Dropdown-Menüs – Mobile: Vollbild-Overlay-Navigation (siehe Kernkomponenten)</w:t>
-      </w:r>
-    </w:p>
-    <w:p>
-      <w:pPr>
-        <w:pStyle w:val="Listenabsatz"/>
-        <w:numPr>
-          <w:ilvl w:val="0"/>
-          <w:numId w:val="3"/>
-        </w:numPr>
-        <w:spacing w:after="80"/>
-      </w:pPr>
-      <w:r>
-        <w:rPr>
-          <w:color w:val="222222"/>
-        </w:rPr>
-        <w:t>Keine Slider</w:t>
-      </w:r>
-    </w:p>
-    <w:p>
-      <w:pPr>
-        <w:pStyle w:val="Listenabsatz"/>
-        <w:numPr>
-          <w:ilvl w:val="0"/>
-          <w:numId w:val="3"/>
-        </w:numPr>
-        <w:spacing w:after="80"/>
-      </w:pPr>
-      <w:r>
-        <w:rPr>
-          <w:color w:val="222222"/>
-        </w:rPr>
-        <w:t>bewegte Animationen abschaltbar</w:t>
-      </w:r>
-    </w:p>
-    <w:p>
-      <w:pPr>
-        <w:pStyle w:val="Listenabsatz"/>
-        <w:numPr>
-          <w:ilvl w:val="0"/>
-          <w:numId w:val="3"/>
-        </w:numPr>
-        <w:spacing w:after="80"/>
-      </w:pPr>
-      <w:r>
-        <w:rPr>
-          <w:color w:val="222222"/>
-        </w:rPr>
-        <w:t>Maximal 2 Scroll-Bildschirme auf der Startseite</w:t>
-      </w:r>
-    </w:p>
-    <w:p>
-      <w:pPr>
-        <w:pStyle w:val="Listenabsatz"/>
-        <w:numPr>
-          <w:ilvl w:val="0"/>
-          <w:numId w:val="3"/>
-        </w:numPr>
-        <w:spacing w:after="80"/>
-      </w:pPr>
-      <w:r>
-        <w:rPr>
-          <w:color w:val="222222"/>
-        </w:rPr>
-        <w:t>Telefonnummer immer sichtbar – Desktop: fest im Sticky-Header rechts neben Sprachumschalter. Mobile: Floating Action Button (56×56px, Dunkelgrün #1F4D3A, weißes Telefon-Icon, fixiert unten rechts), Tap öffnet direkt tel:-Link.</w:t>
-      </w:r>
-    </w:p>
-    <w:p>
-      <w:pPr>
-        <w:pStyle w:val="Listenabsatz"/>
-        <w:numPr>
-          <w:ilvl w:val="0"/>
-          <w:numId w:val="3"/>
-        </w:numPr>
-        <w:spacing w:after="80"/>
-      </w:pPr>
-      <w:r>
-        <w:rPr>
-          <w:color w:val="222222"/>
-        </w:rPr>
-        <w:t>Klare Wegbeschreibung zu Veranstaltungsorten</w:t>
-      </w:r>
-    </w:p>
-    <w:p>
-      <w:pPr>
-        <w:pStyle w:val="Listenabsatz"/>
-        <w:numPr>
-          <w:ilvl w:val="0"/>
-          <w:numId w:val="3"/>
-        </w:numPr>
-        <w:spacing w:after="80"/>
-      </w:pPr>
-      <w:ins w:id="311" w:author="Claude" w:date="2026-04-01T00:00:00Z">
-        <w:r>
-          <w:rPr>
-            <w:color w:val="222222"/>
-          </w:rPr>
-          <w:t xml:space="preserve">Schnelle Ladezeiten – viele Besucher kommen über mobile Netze</w:t>
-        </w:r>
-      </w:ins>
-    </w:p>
-    <w:p>
-      <w:pPr>
-        <w:pStyle w:val="Listenabsatz"/>
-        <w:numPr>
-          <w:ilvl w:val="0"/>
-          <w:numId w:val="3"/>
-        </w:numPr>
-        <w:spacing w:after="80"/>
-      </w:pPr>
-      <w:ins w:id="312" w:author="Claude" w:date="2026-04-01T00:00:00Z">
-        <w:r>
-          <w:rPr>
-            <w:color w:val="222222"/>
-          </w:rPr>
-          <w:t xml:space="preserve">Sprachumschalter: sichtbar im Header, Text + Flagge, DE | EN</w:t>
-        </w:r>
-      </w:ins>
-    </w:p>
-    <w:p>
-      <w:pPr>
-        <w:pStyle w:val="berschrift3"/>
-      </w:pPr>
-      <w:r>
         <w:t>Bildwelt</w:t>
       </w:r>
     </w:p>
@@ -3184,28 +3190,10 @@
           <w:bCs/>
           <w:color w:val="222222"/>
         </w:rPr>
-        <w:del w:id="304" w:author="Claude" w:date="2026-04-01T00:00:00Z">
-          <w:r>
-            <w:rPr>
-              <w:b/>
-              <w:bCs/>
-              <w:color w:val="222222"/>
-            </w:rPr>
-            <w:delText xml:space="preserve">Phase 1 (kein Fotomaterial vorhanden): </w:delText>
-          </w:r>
-        </w:del>
-        <w:ins w:id="305" w:author="Claude" w:date="2026-04-01T00:00:00Z">
-          <w:r>
-            <w:rPr>
-              <w:b/>
-              <w:bCs/>
-              <w:color w:val="222222"/>
-            </w:rPr>
-            <w:t xml:space="preserve">Phase 1 (Fotomaterial vorhanden): </w:t>
-          </w:r>
-        </w:ins>
-      </w:r>
-      <w:del w:id="2" w:author="Claude" w:date="2026-04-01T00:00:00Z">
+        <w:t xml:space="preserve">Phase 1 (Fotomaterial vorhanden): </w:t>
+      </w:r>
+      <w:commentRangeStart w:id="7"/>
+      <w:del w:id="8" w:author="Claude" w:date="2026-04-01T00:00:00Z">
         <w:r>
           <w:rPr>
             <w:color w:val="222222"/>
@@ -3213,6 +3201,16 @@
           <w:delText>Authentische Illustrationen oder reduzierte Bildwelt. Fokus auf Menschenhände, Zutaten, Küche. Keine generischen Stock-Bilder von „lachenden Senior*innen beim Salat“.</w:delText>
         </w:r>
       </w:del>
+      <w:commentRangeEnd w:id="7"/>
+      <w:r>
+        <w:rPr>
+          <w:rStyle w:val="Kommentarzeichen"/>
+          <w:color w:val="222222"/>
+          <w:sz w:val="22"/>
+          <w:szCs w:val="22"/>
+        </w:rPr>
+        <w:commentReference w:id="7"/>
+      </w:r>
       <w:r>
         <w:rPr>
           <w:color w:val="222222"/>
@@ -3278,14 +3276,39 @@
       <w:pPr>
         <w:spacing w:after="160"/>
       </w:pPr>
-      <w:del w:id="3" w:author="Claude" w:date="2026-04-01T00:00:00Z">
+      <w:del w:id="9" w:author="Claude" w:date="2026-04-01T00:00:00Z">
         <w:r>
           <w:rPr>
             <w:color w:val="222222"/>
           </w:rPr>
-          <w:delText>Farbtabelle, Typografie und Design Tokens waren hier definiert.</w:delText>
+          <w:delText>Fa</w:delText>
+        </w:r>
+        <w:commentRangeStart w:id="10"/>
+        <w:r>
+          <w:rPr>
+            <w:color w:val="222222"/>
+          </w:rPr>
+          <w:delText>r</w:delText>
         </w:r>
       </w:del>
+      <w:commentRangeEnd w:id="10"/>
+      <w:r>
+        <w:rPr>
+          <w:rStyle w:val="Kommentarzeichen"/>
+          <w:color w:val="222222"/>
+          <w:sz w:val="22"/>
+          <w:szCs w:val="22"/>
+        </w:rPr>
+        <w:commentReference w:id="10"/>
+      </w:r>
+      <w:del w:id="11" w:author="Claude" w:date="2026-04-01T00:00:00Z">
+        <w:r>
+          <w:rPr>
+            <w:color w:val="222222"/>
+          </w:rPr>
+          <w:delText>btabelle, Typografie und Design Tokens waren hier definiert.</w:delText>
+        </w:r>
+      </w:del>
       <w:r>
         <w:rPr>
           <w:color w:val="222222"/>
@@ -3301,7 +3324,6 @@
         <w:rPr>
           <w:color w:val="222222"/>
         </w:rPr>
-        <w:lastRenderedPageBreak/>
         <w:t>Wirkung: Ruhig, vertrauensvoll, erdend, senior*innenfreundlich, gemeinwohlorientiert und nicht kommerziell.</w:t>
       </w:r>
     </w:p>
@@ -5160,7 +5182,8 @@
       <w:pPr>
         <w:spacing w:after="160"/>
       </w:pPr>
-      <w:del w:id="4" w:author="Claude" w:date="2026-04-01T00:00:00Z">
+      <w:commentRangeStart w:id="12"/>
+      <w:del w:id="13" w:author="Claude" w:date="2026-04-01T00:00:00Z">
         <w:r>
           <w:rPr>
             <w:color w:val="222222"/>
@@ -5168,6 +5191,16 @@
           <w:delText>Farben-, Typografie-, Abstände- und Layout-Tabellen waren hier definiert.</w:delText>
         </w:r>
       </w:del>
+      <w:commentRangeEnd w:id="12"/>
+      <w:r>
+        <w:rPr>
+          <w:rStyle w:val="Kommentarzeichen"/>
+          <w:color w:val="222222"/>
+          <w:sz w:val="22"/>
+          <w:szCs w:val="22"/>
+        </w:rPr>
+        <w:commentReference w:id="12"/>
+      </w:r>
       <w:r>
         <w:rPr>
           <w:color w:val="222222"/>
@@ -5244,22 +5277,12 @@
       <w:pPr>
         <w:spacing w:after="160"/>
       </w:pPr>
-      <w:del w:id="313" w:author="Claude" w:date="2026-04-01T00:00:00Z">
-        <w:r>
-          <w:rPr>
-            <w:color w:val="222222"/>
-          </w:rPr>
-          <w:delText>Komponenten-Tabelle war hier definiert.</w:delText>
-        </w:r>
-      </w:del>
-      <w:ins w:id="314" w:author="Claude" w:date="2026-04-01T00:00:00Z">
-        <w:r>
-          <w:rPr>
-            <w:color w:val="222222"/>
-          </w:rPr>
-          <w:t>Komponentenspezifikationen (Button, Card, Termin-Karte, Hero, Info-Box, Form Field, Download-Liste, Mobile-Nav) sind in UI-Spezifikation_Gemeinsam-Kochen.html und design-system.html definiert.</w:t>
-        </w:r>
-      </w:ins>
+      <w:r>
+        <w:rPr>
+          <w:color w:val="222222"/>
+        </w:rPr>
+        <w:t>Komponentenspezifikationen (Button, Card, Termin-Karte, Hero, Info-Box, Form Field, Download-Liste, Mobile-Nav) sind in UI-Spezifikation_Gemeinsam-Kochen.html und design-system.html definiert.</w:t>
+      </w:r>
     </w:p>
     <w:p>
       <w:pPr>
@@ -5273,22 +5296,12 @@
       <w:pPr>
         <w:spacing w:after="160"/>
       </w:pPr>
-      <w:del w:id="315" w:author="Claude" w:date="2026-04-01T00:00:00Z">
-        <w:r>
-          <w:rPr>
-            <w:color w:val="222222"/>
-          </w:rPr>
-          <w:delText>Detaillierte Barrierefreiheitsregeln waren hier aufgelistet.</w:delText>
-        </w:r>
-      </w:del>
-      <w:ins w:id="316" w:author="Claude" w:date="2026-04-01T00:00:00Z">
-        <w:r>
-          <w:rPr>
-            <w:color w:val="222222"/>
-          </w:rPr>
-          <w:t>WCAG 2.1 AA Mindeststandard. Detaillierte Regeln in design-system.html. Senior*innen-UX: siehe §9.</w:t>
-        </w:r>
-      </w:ins>
+      <w:r>
+        <w:rPr>
+          <w:color w:val="222222"/>
+        </w:rPr>
+        <w:t>WCAG 2.1 AA Mindeststandard. Detaillierte Regeln in design-system.html. Senior*innen-UX: siehe §9.</w:t>
+      </w:r>
     </w:p>
     <w:p>
       <w:pPr>
@@ -5302,181 +5315,171 @@
       <w:pPr>
         <w:spacing w:after="160"/>
       </w:pPr>
-      <w:del w:id="317" w:author="Claude" w:date="2026-04-01T00:00:00Z">
-        <w:r>
-          <w:rPr>
-            <w:color w:val="222222"/>
-          </w:rPr>
-          <w:delText>CMS-Inhaltstypen-Liste war hier definiert.</w:delText>
-        </w:r>
-      </w:del>
-      <w:ins w:id="318" w:author="Claude" w:date="2026-04-01T00:00:00Z">
-        <w:r>
-          <w:rPr>
-            <w:color w:val="222222"/>
-          </w:rPr>
-          <w:t>CMS-Inhaltstypen (Seite, Workshop, Aktivität/Bericht, News, Dokument, Partner, Veranstaltung) sind in Projektbeschreibung.docx §2.5 definiert.</w:t>
-        </w:r>
-      </w:ins>
+      <w:r>
+        <w:rPr>
+          <w:color w:val="222222"/>
+        </w:rPr>
+        <w:t>CMS-Inhaltstypen (Seite, Workshop, Aktivität/Bericht, News, Dokument, Partner, Veranstaltung) sind in Projektbeschreibung.docx §2.5 definiert.</w:t>
+      </w:r>
     </w:p>
     <w:p>
       <w:pPr>
         <w:pStyle w:val="berschrift1"/>
       </w:pPr>
       <w:r>
+        <w:t>14. Zentrale strategische Empfehlung</w:t>
+      </w:r>
+    </w:p>
+    <w:p>
+      <w:pPr>
+        <w:spacing w:after="160"/>
+      </w:pPr>
+      <w:r>
+        <w:rPr>
+          <w:color w:val="222222"/>
+        </w:rPr>
+        <w:t>Die Website sollte drei Dinge gleichzeitig können:</w:t>
+      </w:r>
+    </w:p>
+    <w:p>
+      <w:pPr>
+        <w:pStyle w:val="Listenabsatz"/>
+        <w:numPr>
+          <w:ilvl w:val="0"/>
+          <w:numId w:val="4"/>
+        </w:numPr>
+        <w:spacing w:after="100"/>
+      </w:pPr>
+      <w:r>
+        <w:rPr>
+          <w:color w:val="222222"/>
+        </w:rPr>
+        <w:t>Für Frau Schmidt (72) sofort verständlich sein.</w:t>
+      </w:r>
+    </w:p>
+    <w:p>
+      <w:pPr>
+        <w:pStyle w:val="Listenabsatz"/>
+        <w:numPr>
+          <w:ilvl w:val="0"/>
+          <w:numId w:val="4"/>
+        </w:numPr>
+        <w:spacing w:after="100"/>
+      </w:pPr>
+      <w:r>
+        <w:rPr>
+          <w:color w:val="222222"/>
+        </w:rPr>
+        <w:t>Für das Bezirksamt professionell wirken.</w:t>
+      </w:r>
+    </w:p>
+    <w:p>
+      <w:pPr>
+        <w:pStyle w:val="Listenabsatz"/>
+        <w:numPr>
+          <w:ilvl w:val="0"/>
+          <w:numId w:val="4"/>
+        </w:numPr>
+        <w:spacing w:after="100"/>
+      </w:pPr>
+      <w:r>
+        <w:rPr>
+          <w:color w:val="222222"/>
+        </w:rPr>
+        <w:t>Für 2027 technisch skalierbar sein.</w:t>
+      </w:r>
+    </w:p>
+    <w:p>
+      <w:pPr>
+        <w:spacing w:after="120"/>
+      </w:pPr>
+    </w:p>
+    <w:p>
+      <w:pPr>
+        <w:spacing w:after="160"/>
+      </w:pPr>
+      <w:r>
+        <w:rPr>
+          <w:color w:val="222222"/>
+        </w:rPr>
+        <w:t>Das gelingt nur, wenn wir:</w:t>
+      </w:r>
+    </w:p>
+    <w:p>
+      <w:pPr>
+        <w:pStyle w:val="Listenabsatz"/>
+        <w:numPr>
+          <w:ilvl w:val="0"/>
+          <w:numId w:val="3"/>
+        </w:numPr>
+        <w:spacing w:after="80"/>
+      </w:pPr>
+      <w:r>
+        <w:rPr>
+          <w:color w:val="222222"/>
+        </w:rPr>
+        <w:t>Einfach starten</w:t>
+      </w:r>
+    </w:p>
+    <w:p>
+      <w:pPr>
+        <w:pStyle w:val="Listenabsatz"/>
+        <w:numPr>
+          <w:ilvl w:val="0"/>
+          <w:numId w:val="3"/>
+        </w:numPr>
+        <w:spacing w:after="80"/>
+      </w:pPr>
+      <w:r>
+        <w:rPr>
+          <w:color w:val="222222"/>
+        </w:rPr>
+        <w:t>Struktur sauber anlegen</w:t>
+      </w:r>
+    </w:p>
+    <w:p>
+      <w:pPr>
+        <w:pStyle w:val="Listenabsatz"/>
+        <w:numPr>
+          <w:ilvl w:val="0"/>
+          <w:numId w:val="3"/>
+        </w:numPr>
+        <w:spacing w:after="80"/>
+      </w:pPr>
+      <w:r>
+        <w:rPr>
+          <w:color w:val="222222"/>
+        </w:rPr>
+        <w:t>Keine überkomplexe Lösung bauen</w:t>
+      </w:r>
+    </w:p>
+    <w:p>
+      <w:pPr>
+        <w:pStyle w:val="Listenabsatz"/>
+        <w:numPr>
+          <w:ilvl w:val="0"/>
+          <w:numId w:val="3"/>
+        </w:numPr>
+        <w:spacing w:after="80"/>
+      </w:pPr>
+      <w:r>
+        <w:rPr>
+          <w:color w:val="222222"/>
+        </w:rPr>
+        <w:t>Dokumentation von Anfang an mitdenken</w:t>
+      </w:r>
+    </w:p>
+    <w:p>
+      <w:pPr>
+        <w:spacing w:after="200"/>
+      </w:pPr>
+    </w:p>
+    <w:p>
+      <w:pPr>
+        <w:pStyle w:val="berschrift2"/>
+      </w:pPr>
+      <w:r>
         <w:lastRenderedPageBreak/>
-        <w:t>14. Zentrale strategische Empfehlung</w:t>
-      </w:r>
-    </w:p>
-    <w:p>
-      <w:pPr>
-        <w:spacing w:after="160"/>
-      </w:pPr>
-      <w:r>
-        <w:rPr>
-          <w:color w:val="222222"/>
-        </w:rPr>
-        <w:t>Die Website sollte drei Dinge gleichzeitig können:</w:t>
-      </w:r>
-    </w:p>
-    <w:p>
-      <w:pPr>
-        <w:pStyle w:val="Listenabsatz"/>
-        <w:numPr>
-          <w:ilvl w:val="0"/>
-          <w:numId w:val="4"/>
-        </w:numPr>
-        <w:spacing w:after="100"/>
-      </w:pPr>
-      <w:r>
-        <w:rPr>
-          <w:color w:val="222222"/>
-        </w:rPr>
-        <w:t>Für Frau Schmidt (72) sofort verständlich sein.</w:t>
-      </w:r>
-    </w:p>
-    <w:p>
-      <w:pPr>
-        <w:pStyle w:val="Listenabsatz"/>
-        <w:numPr>
-          <w:ilvl w:val="0"/>
-          <w:numId w:val="4"/>
-        </w:numPr>
-        <w:spacing w:after="100"/>
-      </w:pPr>
-      <w:r>
-        <w:rPr>
-          <w:color w:val="222222"/>
-        </w:rPr>
-        <w:t>Für das Bezirksamt professionell wirken.</w:t>
-      </w:r>
-    </w:p>
-    <w:p>
-      <w:pPr>
-        <w:pStyle w:val="Listenabsatz"/>
-        <w:numPr>
-          <w:ilvl w:val="0"/>
-          <w:numId w:val="4"/>
-        </w:numPr>
-        <w:spacing w:after="100"/>
-      </w:pPr>
-      <w:r>
-        <w:rPr>
-          <w:color w:val="222222"/>
-        </w:rPr>
-        <w:t>Für 2027 technisch skalierbar sein.</w:t>
-      </w:r>
-    </w:p>
-    <w:p>
-      <w:pPr>
-        <w:spacing w:after="120"/>
-      </w:pPr>
-    </w:p>
-    <w:p>
-      <w:pPr>
-        <w:spacing w:after="160"/>
-      </w:pPr>
-      <w:r>
-        <w:rPr>
-          <w:color w:val="222222"/>
-        </w:rPr>
-        <w:t>Das gelingt nur, wenn wir:</w:t>
-      </w:r>
-    </w:p>
-    <w:p>
-      <w:pPr>
-        <w:pStyle w:val="Listenabsatz"/>
-        <w:numPr>
-          <w:ilvl w:val="0"/>
-          <w:numId w:val="3"/>
-        </w:numPr>
-        <w:spacing w:after="80"/>
-      </w:pPr>
-      <w:r>
-        <w:rPr>
-          <w:color w:val="222222"/>
-        </w:rPr>
-        <w:t>Einfach starten</w:t>
-      </w:r>
-    </w:p>
-    <w:p>
-      <w:pPr>
-        <w:pStyle w:val="Listenabsatz"/>
-        <w:numPr>
-          <w:ilvl w:val="0"/>
-          <w:numId w:val="3"/>
-        </w:numPr>
-        <w:spacing w:after="80"/>
-      </w:pPr>
-      <w:r>
-        <w:rPr>
-          <w:color w:val="222222"/>
-        </w:rPr>
-        <w:t>Struktur sauber anlegen</w:t>
-      </w:r>
-    </w:p>
-    <w:p>
-      <w:pPr>
-        <w:pStyle w:val="Listenabsatz"/>
-        <w:numPr>
-          <w:ilvl w:val="0"/>
-          <w:numId w:val="3"/>
-        </w:numPr>
-        <w:spacing w:after="80"/>
-      </w:pPr>
-      <w:r>
-        <w:rPr>
-          <w:color w:val="222222"/>
-        </w:rPr>
-        <w:t>Keine überkomplexe Lösung bauen</w:t>
-      </w:r>
-    </w:p>
-    <w:p>
-      <w:pPr>
-        <w:pStyle w:val="Listenabsatz"/>
-        <w:numPr>
-          <w:ilvl w:val="0"/>
-          <w:numId w:val="3"/>
-        </w:numPr>
-        <w:spacing w:after="80"/>
-      </w:pPr>
-      <w:r>
-        <w:rPr>
-          <w:color w:val="222222"/>
-        </w:rPr>
-        <w:t>Dokumentation von Anfang an mitdenken</w:t>
-      </w:r>
-    </w:p>
-    <w:p>
-      <w:pPr>
-        <w:spacing w:after="200"/>
-      </w:pPr>
-    </w:p>
-    <w:p>
-      <w:pPr>
-        <w:pStyle w:val="berschrift2"/>
-      </w:pPr>
-      <w:r>
         <w:t>Gesamtwirkung</w:t>
       </w:r>
     </w:p>
@@ -5946,9 +5949,14 @@
         <w:t>Die Sitemap ist damit final freigegeben (Version 1.0) und kann als verbindliche Grundlage für Navigationsdefinition, URL-Struktur, CMS-Seitentypen und die weitere UX-/UI-Ausarbeitung verwendet werden.</w:t>
       </w:r>
     </w:p>
+    <w:p>
+      <w:pPr>
+        <w:spacing w:after="160"/>
+      </w:pPr>
+    </w:p>
     <w:sectPr>
-      <w:headerReference w:type="default" r:id="rId7"/>
-      <w:footerReference w:type="default" r:id="rId8"/>
+      <w:headerReference w:type="default" r:id="rId11"/>
+      <w:footerReference w:type="default" r:id="rId12"/>
       <w:pgSz w:w="11906" w:h="16838"/>
       <w:pgMar w:top="1440" w:right="1440" w:bottom="1440" w:left="1440" w:header="708" w:footer="708" w:gutter="0"/>
       <w:cols w:space="720"/>
@@ -5956,6 +5964,148 @@
     </w:sectPr>
   </w:body>
 </w:document>
+</file>
+
+<file path=word/comments.xml><?xml version="1.0" encoding="utf-8"?>
+<w:comments xmlns:wpc="http://schemas.microsoft.com/office/word/2010/wordprocessingCanvas" xmlns:cx="http://schemas.microsoft.com/office/drawing/2014/chartex" xmlns:cx1="http://schemas.microsoft.com/office/drawing/2015/9/8/chartex" xmlns:cx2="http://schemas.microsoft.com/office/drawing/2015/10/21/chartex" xmlns:cx3="http://schemas.microsoft.com/office/drawing/2016/5/9/chartex" xmlns:cx4="http://schemas.microsoft.com/office/drawing/2016/5/10/chartex" xmlns:cx5="http://schemas.microsoft.com/office/drawing/2016/5/11/chartex" xmlns:cx6="http://schemas.microsoft.com/office/drawing/2016/5/12/chartex" xmlns:cx7="http://schemas.microsoft.com/office/drawing/2016/5/13/chartex" xmlns:cx8="http://schemas.microsoft.com/office/drawing/2016/5/14/chartex" xmlns:mc="http://schemas.openxmlformats.org/markup-compatibility/2006" xmlns:aink="http://schemas.microsoft.com/office/drawing/2016/ink" xmlns:am3d="http://schemas.microsoft.com/office/drawing/2017/model3d" xmlns:o="urn:schemas-microsoft-com:office:office" xmlns:oel="http://schemas.microsoft.com/office/2019/extlst" xmlns:r="http://schemas.openxmlformats.org/officeDocument/2006/relationships" xmlns:m="http://schemas.openxmlformats.org/officeDocument/2006/math" xmlns:v="urn:schemas-microsoft-com:vml" xmlns:wp14="http://schemas.microsoft.com/office/word/2010/wordprocessingDrawing" xmlns:wp="http://schemas.openxmlformats.org/drawingml/2006/wordprocessingDrawing" xmlns:w10="urn:schemas-microsoft-com:office:word" xmlns:w="http://schemas.openxmlformats.org/wordprocessingml/2006/main" xmlns:w14="http://schemas.microsoft.com/office/word/2010/wordml" xmlns:w15="http://schemas.microsoft.com/office/word/2012/wordml" xmlns:w16cex="http://schemas.microsoft.com/office/word/2018/wordml/cex" xmlns:w16cid="http://schemas.microsoft.com/office/word/2016/wordml/cid" xmlns:w16="http://schemas.microsoft.com/office/word/2018/wordml" xmlns:w16du="http://schemas.microsoft.com/office/word/2023/wordml/word16du" xmlns:w16sdtdh="http://schemas.microsoft.com/office/word/2020/wordml/sdtdatahash" xmlns:w16sdtfl="http://schemas.microsoft.com/office/word/2024/wordml/sdtformatlock" xmlns:w16se="http://schemas.microsoft.com/office/word/2015/wordml/symex" xmlns:wpg="http://schemas.microsoft.com/office/word/2010/wordprocessingGroup" xmlns:wpi="http://schemas.microsoft.com/office/word/2010/wordprocessingInk" xmlns:wne="http://schemas.microsoft.com/office/word/2006/wordml" xmlns:wps="http://schemas.microsoft.com/office/word/2010/wordprocessingShape" mc:Ignorable="w14 w15 w16se w16cid w16 w16cex w16sdtdh w16sdtfl w16du wp14">
+  <w:comment w:id="0" w:author="adocom | Aktualisierung" w:date="2026-04-02T02:05:00Z" w:initials="a|A">
+    <w:p>
+      <w:r>
+        <w:rPr>
+          <w:rStyle w:val="Kommentarzeichen"/>
+        </w:rPr>
+        <w:annotationRef/>
+      </w:r>
+      <w:r>
+        <w:rPr>
+          <w:sz w:val="20"/>
+          <w:szCs w:val="20"/>
+        </w:rPr>
+        <w:t>ja</w:t>
+      </w:r>
+    </w:p>
+  </w:comment>
+  <w:comment w:id="2" w:author="adocom | Aktualisierung" w:date="2026-04-02T02:05:00Z" w:initials="a|A">
+    <w:p>
+      <w:r>
+        <w:rPr>
+          <w:rStyle w:val="Kommentarzeichen"/>
+        </w:rPr>
+        <w:annotationRef/>
+      </w:r>
+      <w:r>
+        <w:rPr>
+          <w:sz w:val="20"/>
+          <w:szCs w:val="20"/>
+        </w:rPr>
+        <w:t>ja</w:t>
+      </w:r>
+    </w:p>
+  </w:comment>
+  <w:comment w:id="4" w:author="adocom | Aktualisierung" w:date="2026-04-02T02:05:00Z" w:initials="a|A">
+    <w:p>
+      <w:r>
+        <w:rPr>
+          <w:rStyle w:val="Kommentarzeichen"/>
+        </w:rPr>
+        <w:annotationRef/>
+      </w:r>
+      <w:r>
+        <w:rPr>
+          <w:sz w:val="20"/>
+          <w:szCs w:val="20"/>
+        </w:rPr>
+        <w:t>ja</w:t>
+      </w:r>
+    </w:p>
+  </w:comment>
+  <w:comment w:id="7" w:author="adocom | Aktualisierung" w:date="2026-04-02T02:03:00Z" w:initials="a|A">
+    <w:p>
+      <w:r>
+        <w:rPr>
+          <w:rStyle w:val="Kommentarzeichen"/>
+        </w:rPr>
+        <w:annotationRef/>
+      </w:r>
+      <w:r>
+        <w:rPr>
+          <w:sz w:val="20"/>
+          <w:szCs w:val="20"/>
+        </w:rPr>
+        <w:t>ja</w:t>
+      </w:r>
+    </w:p>
+    <w:p/>
+  </w:comment>
+  <w:comment w:id="10" w:author="adocom | Aktualisierung" w:date="2026-04-02T02:03:00Z" w:initials="a|A">
+    <w:p>
+      <w:r>
+        <w:rPr>
+          <w:rStyle w:val="Kommentarzeichen"/>
+        </w:rPr>
+        <w:annotationRef/>
+      </w:r>
+      <w:r>
+        <w:rPr>
+          <w:sz w:val="20"/>
+          <w:szCs w:val="20"/>
+        </w:rPr>
+        <w:t>ja</w:t>
+      </w:r>
+    </w:p>
+  </w:comment>
+  <w:comment w:id="12" w:author="adocom | Aktualisierung" w:date="2026-04-02T02:03:00Z" w:initials="a|A">
+    <w:p>
+      <w:r>
+        <w:rPr>
+          <w:rStyle w:val="Kommentarzeichen"/>
+        </w:rPr>
+        <w:annotationRef/>
+      </w:r>
+      <w:r>
+        <w:rPr>
+          <w:sz w:val="20"/>
+          <w:szCs w:val="20"/>
+        </w:rPr>
+        <w:t>ja</w:t>
+      </w:r>
+    </w:p>
+    <w:p/>
+  </w:comment>
+</w:comments>
+</file>
+
+<file path=word/commentsExtended.xml><?xml version="1.0" encoding="utf-8"?>
+<w15:commentsEx xmlns:wpc="http://schemas.microsoft.com/office/word/2010/wordprocessingCanvas" xmlns:cx="http://schemas.microsoft.com/office/drawing/2014/chartex" xmlns:cx1="http://schemas.microsoft.com/office/drawing/2015/9/8/chartex" xmlns:cx2="http://schemas.microsoft.com/office/drawing/2015/10/21/chartex" xmlns:cx3="http://schemas.microsoft.com/office/drawing/2016/5/9/chartex" xmlns:cx4="http://schemas.microsoft.com/office/drawing/2016/5/10/chartex" xmlns:cx5="http://schemas.microsoft.com/office/drawing/2016/5/11/chartex" xmlns:cx6="http://schemas.microsoft.com/office/drawing/2016/5/12/chartex" xmlns:cx7="http://schemas.microsoft.com/office/drawing/2016/5/13/chartex" xmlns:cx8="http://schemas.microsoft.com/office/drawing/2016/5/14/chartex" xmlns:mc="http://schemas.openxmlformats.org/markup-compatibility/2006" xmlns:aink="http://schemas.microsoft.com/office/drawing/2016/ink" xmlns:am3d="http://schemas.microsoft.com/office/drawing/2017/model3d" xmlns:o="urn:schemas-microsoft-com:office:office" xmlns:oel="http://schemas.microsoft.com/office/2019/extlst" xmlns:r="http://schemas.openxmlformats.org/officeDocument/2006/relationships" xmlns:m="http://schemas.openxmlformats.org/officeDocument/2006/math" xmlns:v="urn:schemas-microsoft-com:vml" xmlns:wp14="http://schemas.microsoft.com/office/word/2010/wordprocessingDrawing" xmlns:wp="http://schemas.openxmlformats.org/drawingml/2006/wordprocessingDrawing" xmlns:w10="urn:schemas-microsoft-com:office:word" xmlns:w="http://schemas.openxmlformats.org/wordprocessingml/2006/main" xmlns:w14="http://schemas.microsoft.com/office/word/2010/wordml" xmlns:w15="http://schemas.microsoft.com/office/word/2012/wordml" xmlns:w16cex="http://schemas.microsoft.com/office/word/2018/wordml/cex" xmlns:w16cid="http://schemas.microsoft.com/office/word/2016/wordml/cid" xmlns:w16="http://schemas.microsoft.com/office/word/2018/wordml" xmlns:w16du="http://schemas.microsoft.com/office/word/2023/wordml/word16du" xmlns:w16sdtdh="http://schemas.microsoft.com/office/word/2020/wordml/sdtdatahash" xmlns:w16sdtfl="http://schemas.microsoft.com/office/word/2024/wordml/sdtformatlock" xmlns:w16se="http://schemas.microsoft.com/office/word/2015/wordml/symex" xmlns:wpg="http://schemas.microsoft.com/office/word/2010/wordprocessingGroup" xmlns:wpi="http://schemas.microsoft.com/office/word/2010/wordprocessingInk" xmlns:wne="http://schemas.microsoft.com/office/word/2006/wordml" xmlns:wps="http://schemas.microsoft.com/office/word/2010/wordprocessingShape" mc:Ignorable="w14 w15 w16se w16cid w16 w16cex w16sdtdh w16sdtfl w16du wp14">
+  <w15:commentEx w15:paraId="4A480216" w15:done="0"/>
+  <w15:commentEx w15:paraId="17F4E9E6" w15:done="0"/>
+  <w15:commentEx w15:paraId="2AF069CE" w15:done="0"/>
+  <w15:commentEx w15:paraId="2D80C240" w15:done="0"/>
+  <w15:commentEx w15:paraId="155D53A3" w15:done="0"/>
+  <w15:commentEx w15:paraId="15B59479" w15:done="0"/>
+</w15:commentsEx>
+</file>
+
+<file path=word/commentsExtensible.xml><?xml version="1.0" encoding="utf-8"?>
+<w16cex:commentsExtensible xmlns:wpc="http://schemas.microsoft.com/office/word/2010/wordprocessingCanvas" xmlns:cx="http://schemas.microsoft.com/office/drawing/2014/chartex" xmlns:cx1="http://schemas.microsoft.com/office/drawing/2015/9/8/chartex" xmlns:cx2="http://schemas.microsoft.com/office/drawing/2015/10/21/chartex" xmlns:cx3="http://schemas.microsoft.com/office/drawing/2016/5/9/chartex" xmlns:cx4="http://schemas.microsoft.com/office/drawing/2016/5/10/chartex" xmlns:cx5="http://schemas.microsoft.com/office/drawing/2016/5/11/chartex" xmlns:cx6="http://schemas.microsoft.com/office/drawing/2016/5/12/chartex" xmlns:cx7="http://schemas.microsoft.com/office/drawing/2016/5/13/chartex" xmlns:cx8="http://schemas.microsoft.com/office/drawing/2016/5/14/chartex" xmlns:cr="http://schemas.microsoft.com/office/comments/2020/reactions" xmlns:mc="http://schemas.openxmlformats.org/markup-compatibility/2006" xmlns:aink="http://schemas.microsoft.com/office/drawing/2016/ink" xmlns:am3d="http://schemas.microsoft.com/office/drawing/2017/model3d" xmlns:o="urn:schemas-microsoft-com:office:office" xmlns:oel="http://schemas.microsoft.com/office/2019/extlst" xmlns:r="http://schemas.openxmlformats.org/officeDocument/2006/relationships" xmlns:m="http://schemas.openxmlformats.org/officeDocument/2006/math" xmlns:v="urn:schemas-microsoft-com:vml" xmlns:wp14="http://schemas.microsoft.com/office/word/2010/wordprocessingDrawing" xmlns:wp="http://schemas.openxmlformats.org/drawingml/2006/wordprocessingDrawing" xmlns:w10="urn:schemas-microsoft-com:office:word" xmlns:w="http://schemas.openxmlformats.org/wordprocessingml/2006/main" xmlns:w14="http://schemas.microsoft.com/office/word/2010/wordml" xmlns:w15="http://schemas.microsoft.com/office/word/2012/wordml" xmlns:w16cex="http://schemas.microsoft.com/office/word/2018/wordml/cex" xmlns:w16cid="http://schemas.microsoft.com/office/word/2016/wordml/cid" xmlns:w16="http://schemas.microsoft.com/office/word/2018/wordml" xmlns:w16du="http://schemas.microsoft.com/office/word/2023/wordml/word16du" xmlns:w16sdtdh="http://schemas.microsoft.com/office/word/2020/wordml/sdtdatahash" xmlns:w16sdtfl="http://schemas.microsoft.com/office/word/2024/wordml/sdtformatlock" xmlns:w16se="http://schemas.microsoft.com/office/word/2015/wordml/symex" xmlns:wpg="http://schemas.microsoft.com/office/word/2010/wordprocessingGroup" xmlns:wpi="http://schemas.microsoft.com/office/word/2010/wordprocessingInk" xmlns:wne="http://schemas.microsoft.com/office/word/2006/wordml" xmlns:wps="http://schemas.microsoft.com/office/word/2010/wordprocessingShape" mc:Ignorable="w14 w15 w16se w16cid w16 w16cex w16sdtdh w16sdtfl cr w16du wp14">
+  <w16cex:commentExtensible w16cex:durableId="5E339CFE" w16cex:dateUtc="2026-04-02T00:05:00Z"/>
+  <w16cex:commentExtensible w16cex:durableId="62178333" w16cex:dateUtc="2026-04-02T00:05:00Z"/>
+  <w16cex:commentExtensible w16cex:durableId="1D4B243E" w16cex:dateUtc="2026-04-02T00:05:00Z"/>
+  <w16cex:commentExtensible w16cex:durableId="198081E2" w16cex:dateUtc="2026-04-02T00:03:00Z"/>
+  <w16cex:commentExtensible w16cex:durableId="7EDF1929" w16cex:dateUtc="2026-04-02T00:03:00Z"/>
+  <w16cex:commentExtensible w16cex:durableId="0C9CB40F" w16cex:dateUtc="2026-04-02T00:03:00Z"/>
+</w16cex:commentsExtensible>
+</file>
+
+<file path=word/commentsIds.xml><?xml version="1.0" encoding="utf-8"?>
+<w16cid:commentsIds xmlns:wpc="http://schemas.microsoft.com/office/word/2010/wordprocessingCanvas" xmlns:cx="http://schemas.microsoft.com/office/drawing/2014/chartex" xmlns:cx1="http://schemas.microsoft.com/office/drawing/2015/9/8/chartex" xmlns:cx2="http://schemas.microsoft.com/office/drawing/2015/10/21/chartex" xmlns:cx3="http://schemas.microsoft.com/office/drawing/2016/5/9/chartex" xmlns:cx4="http://schemas.microsoft.com/office/drawing/2016/5/10/chartex" xmlns:cx5="http://schemas.microsoft.com/office/drawing/2016/5/11/chartex" xmlns:cx6="http://schemas.microsoft.com/office/drawing/2016/5/12/chartex" xmlns:cx7="http://schemas.microsoft.com/office/drawing/2016/5/13/chartex" xmlns:cx8="http://schemas.microsoft.com/office/drawing/2016/5/14/chartex" xmlns:mc="http://schemas.openxmlformats.org/markup-compatibility/2006" xmlns:aink="http://schemas.microsoft.com/office/drawing/2016/ink" xmlns:am3d="http://schemas.microsoft.com/office/drawing/2017/model3d" xmlns:o="urn:schemas-microsoft-com:office:office" xmlns:oel="http://schemas.microsoft.com/office/2019/extlst" xmlns:r="http://schemas.openxmlformats.org/officeDocument/2006/relationships" xmlns:m="http://schemas.openxmlformats.org/officeDocument/2006/math" xmlns:v="urn:schemas-microsoft-com:vml" xmlns:wp14="http://schemas.microsoft.com/office/word/2010/wordprocessingDrawing" xmlns:wp="http://schemas.openxmlformats.org/drawingml/2006/wordprocessingDrawing" xmlns:w10="urn:schemas-microsoft-com:office:word" xmlns:w="http://schemas.openxmlformats.org/wordprocessingml/2006/main" xmlns:w14="http://schemas.microsoft.com/office/word/2010/wordml" xmlns:w15="http://schemas.microsoft.com/office/word/2012/wordml" xmlns:w16cex="http://schemas.microsoft.com/office/word/2018/wordml/cex" xmlns:w16cid="http://schemas.microsoft.com/office/word/2016/wordml/cid" xmlns:w16="http://schemas.microsoft.com/office/word/2018/wordml" xmlns:w16du="http://schemas.microsoft.com/office/word/2023/wordml/word16du" xmlns:w16sdtdh="http://schemas.microsoft.com/office/word/2020/wordml/sdtdatahash" xmlns:w16sdtfl="http://schemas.microsoft.com/office/word/2024/wordml/sdtformatlock" xmlns:w16se="http://schemas.microsoft.com/office/word/2015/wordml/symex" xmlns:wpg="http://schemas.microsoft.com/office/word/2010/wordprocessingGroup" xmlns:wpi="http://schemas.microsoft.com/office/word/2010/wordprocessingInk" xmlns:wne="http://schemas.microsoft.com/office/word/2006/wordml" xmlns:wps="http://schemas.microsoft.com/office/word/2010/wordprocessingShape" mc:Ignorable="w14 w15 w16se w16cid w16 w16cex w16sdtdh w16sdtfl w16du wp14">
+  <w16cid:commentId w16cid:paraId="4A480216" w16cid:durableId="5E339CFE"/>
+  <w16cid:commentId w16cid:paraId="17F4E9E6" w16cid:durableId="62178333"/>
+  <w16cid:commentId w16cid:paraId="2AF069CE" w16cid:durableId="1D4B243E"/>
+  <w16cid:commentId w16cid:paraId="2D80C240" w16cid:durableId="198081E2"/>
+  <w16cid:commentId w16cid:paraId="155D53A3" w16cid:durableId="7EDF1929"/>
+  <w16cid:commentId w16cid:paraId="15B59479" w16cid:durableId="0C9CB40F"/>
+</w16cid:commentsIds>
 </file>
 
 <file path=word/endnotes.xml><?xml version="1.0" encoding="utf-8"?>
@@ -6072,16 +6222,7 @@
         <w:sz w:val="16"/>
         <w:szCs w:val="16"/>
       </w:rPr>
-      <w:t>Strategisches Website-</w:t>
-    </w:r>
-    <w:proofErr w:type="gramStart"/>
-    <w:r>
-      <w:rPr>
-        <w:color w:val="555555"/>
-        <w:sz w:val="16"/>
-        <w:szCs w:val="16"/>
-      </w:rPr>
-      <w:t>Konzept</w:t>
+      <w:t>Strategisches Website-Konzept</w:t>
     </w:r>
     <w:r>
       <w:rPr>
@@ -6090,18 +6231,8 @@
         <w:szCs w:val="16"/>
       </w:rPr>
       <w:tab/>
-    </w:r>
-    <w:proofErr w:type="spellStart"/>
-    <w:r>
-      <w:rPr>
-        <w:color w:val="555555"/>
-        <w:sz w:val="16"/>
-        <w:szCs w:val="16"/>
-      </w:rPr>
       <w:t>Mavka.Berlin.Volunteers</w:t>
     </w:r>
-    <w:proofErr w:type="spellEnd"/>
-    <w:proofErr w:type="gramEnd"/>
   </w:p>
 </w:hdr>
 </file>
@@ -6435,6 +6566,14 @@
     </w:lvlOverride>
   </w:num>
 </w:numbering>
+</file>
+
+<file path=word/people.xml><?xml version="1.0" encoding="utf-8"?>
+<w15:people xmlns:wpc="http://schemas.microsoft.com/office/word/2010/wordprocessingCanvas" xmlns:cx="http://schemas.microsoft.com/office/drawing/2014/chartex" xmlns:cx1="http://schemas.microsoft.com/office/drawing/2015/9/8/chartex" xmlns:cx2="http://schemas.microsoft.com/office/drawing/2015/10/21/chartex" xmlns:cx3="http://schemas.microsoft.com/office/drawing/2016/5/9/chartex" xmlns:cx4="http://schemas.microsoft.com/office/drawing/2016/5/10/chartex" xmlns:cx5="http://schemas.microsoft.com/office/drawing/2016/5/11/chartex" xmlns:cx6="http://schemas.microsoft.com/office/drawing/2016/5/12/chartex" xmlns:cx7="http://schemas.microsoft.com/office/drawing/2016/5/13/chartex" xmlns:cx8="http://schemas.microsoft.com/office/drawing/2016/5/14/chartex" xmlns:mc="http://schemas.openxmlformats.org/markup-compatibility/2006" xmlns:aink="http://schemas.microsoft.com/office/drawing/2016/ink" xmlns:am3d="http://schemas.microsoft.com/office/drawing/2017/model3d" xmlns:o="urn:schemas-microsoft-com:office:office" xmlns:oel="http://schemas.microsoft.com/office/2019/extlst" xmlns:r="http://schemas.openxmlformats.org/officeDocument/2006/relationships" xmlns:m="http://schemas.openxmlformats.org/officeDocument/2006/math" xmlns:v="urn:schemas-microsoft-com:vml" xmlns:wp14="http://schemas.microsoft.com/office/word/2010/wordprocessingDrawing" xmlns:wp="http://schemas.openxmlformats.org/drawingml/2006/wordprocessingDrawing" xmlns:w10="urn:schemas-microsoft-com:office:word" xmlns:w="http://schemas.openxmlformats.org/wordprocessingml/2006/main" xmlns:w14="http://schemas.microsoft.com/office/word/2010/wordml" xmlns:w15="http://schemas.microsoft.com/office/word/2012/wordml" xmlns:w16cex="http://schemas.microsoft.com/office/word/2018/wordml/cex" xmlns:w16cid="http://schemas.microsoft.com/office/word/2016/wordml/cid" xmlns:w16="http://schemas.microsoft.com/office/word/2018/wordml" xmlns:w16du="http://schemas.microsoft.com/office/word/2023/wordml/word16du" xmlns:w16sdtdh="http://schemas.microsoft.com/office/word/2020/wordml/sdtdatahash" xmlns:w16sdtfl="http://schemas.microsoft.com/office/word/2024/wordml/sdtformatlock" xmlns:w16se="http://schemas.microsoft.com/office/word/2015/wordml/symex" xmlns:wpg="http://schemas.microsoft.com/office/word/2010/wordprocessingGroup" xmlns:wpi="http://schemas.microsoft.com/office/word/2010/wordprocessingInk" xmlns:wne="http://schemas.microsoft.com/office/word/2006/wordml" xmlns:wps="http://schemas.microsoft.com/office/word/2010/wordprocessingShape" mc:Ignorable="w14 w15 w16se w16cid w16 w16cex w16sdtdh w16sdtfl w16du wp14">
+  <w15:person w15:author="adocom | Aktualisierung">
+    <w15:presenceInfo w15:providerId="AD" w15:userId="S::aktualisierung@adocom.de::a6940d2a-7a62-4c35-b04d-338cde6f4596"/>
+  </w15:person>
+</w15:people>
 </file>
 
 <file path=word/styles.xml><?xml version="1.0" encoding="utf-8"?>
@@ -7042,6 +7181,78 @@
       <w:szCs w:val="20"/>
     </w:rPr>
   </w:style>
+  <w:style w:type="paragraph" w:styleId="berarbeitung">
+    <w:name w:val="Revision"/>
+    <w:hidden/>
+    <w:uiPriority w:val="99"/>
+    <w:semiHidden/>
+    <w:rsid w:val="00961ADF"/>
+  </w:style>
+  <w:style w:type="character" w:styleId="Kommentarzeichen">
+    <w:name w:val="annotation reference"/>
+    <w:basedOn w:val="Absatz-Standardschriftart"/>
+    <w:uiPriority w:val="99"/>
+    <w:semiHidden/>
+    <w:unhideWhenUsed/>
+    <w:rsid w:val="00003575"/>
+    <w:rPr>
+      <w:sz w:val="16"/>
+      <w:szCs w:val="16"/>
+    </w:rPr>
+  </w:style>
+  <w:style w:type="paragraph" w:styleId="Kommentartext">
+    <w:name w:val="annotation text"/>
+    <w:basedOn w:val="Standard"/>
+    <w:link w:val="KommentartextZchn"/>
+    <w:uiPriority w:val="99"/>
+    <w:semiHidden/>
+    <w:unhideWhenUsed/>
+    <w:rsid w:val="00003575"/>
+    <w:rPr>
+      <w:sz w:val="20"/>
+      <w:szCs w:val="20"/>
+    </w:rPr>
+  </w:style>
+  <w:style w:type="character" w:customStyle="1" w:styleId="KommentartextZchn">
+    <w:name w:val="Kommentartext Zchn"/>
+    <w:basedOn w:val="Absatz-Standardschriftart"/>
+    <w:link w:val="Kommentartext"/>
+    <w:uiPriority w:val="99"/>
+    <w:semiHidden/>
+    <w:rsid w:val="00003575"/>
+    <w:rPr>
+      <w:sz w:val="20"/>
+      <w:szCs w:val="20"/>
+    </w:rPr>
+  </w:style>
+  <w:style w:type="paragraph" w:styleId="Kommentarthema">
+    <w:name w:val="annotation subject"/>
+    <w:basedOn w:val="Kommentartext"/>
+    <w:next w:val="Kommentartext"/>
+    <w:link w:val="KommentarthemaZchn"/>
+    <w:uiPriority w:val="99"/>
+    <w:semiHidden/>
+    <w:unhideWhenUsed/>
+    <w:rsid w:val="00003575"/>
+    <w:rPr>
+      <w:b/>
+      <w:bCs/>
+    </w:rPr>
+  </w:style>
+  <w:style w:type="character" w:customStyle="1" w:styleId="KommentarthemaZchn">
+    <w:name w:val="Kommentarthema Zchn"/>
+    <w:basedOn w:val="KommentartextZchn"/>
+    <w:link w:val="Kommentarthema"/>
+    <w:uiPriority w:val="99"/>
+    <w:semiHidden/>
+    <w:rsid w:val="00003575"/>
+    <w:rPr>
+      <w:b/>
+      <w:bCs/>
+      <w:sz w:val="20"/>
+      <w:szCs w:val="20"/>
+    </w:rPr>
+  </w:style>
 </w:styles>
 </file>
 

</xml_diff>